<commit_message>
Calendario lunare + Zoom/Zoom out
</commit_message>
<xml_diff>
--- a/3_Documentazione/Documentazione_Nebula.docx
+++ b/3_Documentazione/Documentazione_Nebula.docx
@@ -2790,8 +2790,16 @@
         <w:rPr>
           <w:lang w:val="it-IT"/>
         </w:rPr>
-        <w:t>Linda Bytyqi</w:t>
-      </w:r>
+        <w:t xml:space="preserve">Linda </w:t>
+      </w:r>
+      <w:proofErr w:type="spellStart"/>
+      <w:r>
+        <w:rPr>
+          <w:lang w:val="it-IT"/>
+        </w:rPr>
+        <w:t>Bytyqi</w:t>
+      </w:r>
+      <w:proofErr w:type="spellEnd"/>
     </w:p>
     <w:p>
       <w:pPr>
@@ -3058,11 +3066,19 @@
           <w:lang w:val="en-US"/>
         </w:rPr>
       </w:pPr>
+      <w:proofErr w:type="spellStart"/>
       <w:r>
         <w:rPr>
           <w:lang w:val="en-US"/>
         </w:rPr>
-        <w:t xml:space="preserve">Esempio di abstract: </w:t>
+        <w:t>Esempio</w:t>
+      </w:r>
+      <w:proofErr w:type="spellEnd"/>
+      <w:r>
+        <w:rPr>
+          <w:lang w:val="en-US"/>
+        </w:rPr>
+        <w:t xml:space="preserve"> di abstract: </w:t>
       </w:r>
     </w:p>
     <w:p>
@@ -3690,7 +3706,35 @@
         <w:rPr>
           <w:lang w:val="it-IT"/>
         </w:rPr>
-        <w:t xml:space="preserve"> da chi ne è appassionato oppure in contesto scolastico. Al momento esistono app avanzate come Sky Map, ma c’è bisogno di un ulteriore conoscenza per comprenderle poiché sono abbastanza complesse</w:t>
+        <w:t xml:space="preserve"> da chi ne è appassionato oppure in contesto scolastico. Al momento esistono app avanzate come </w:t>
+      </w:r>
+      <w:proofErr w:type="spellStart"/>
+      <w:r>
+        <w:rPr>
+          <w:lang w:val="it-IT"/>
+        </w:rPr>
+        <w:t>Sky</w:t>
+      </w:r>
+      <w:proofErr w:type="spellEnd"/>
+      <w:r>
+        <w:rPr>
+          <w:lang w:val="it-IT"/>
+        </w:rPr>
+        <w:t xml:space="preserve"> </w:t>
+      </w:r>
+      <w:proofErr w:type="spellStart"/>
+      <w:r>
+        <w:rPr>
+          <w:lang w:val="it-IT"/>
+        </w:rPr>
+        <w:t>Map</w:t>
+      </w:r>
+      <w:proofErr w:type="spellEnd"/>
+      <w:r>
+        <w:rPr>
+          <w:lang w:val="it-IT"/>
+        </w:rPr>
+        <w:t>, ma c’è bisogno di un ulteriore conoscenza per comprenderle poiché sono abbastanza complesse</w:t>
       </w:r>
       <w:r>
         <w:rPr>
@@ -7348,27 +7392,55 @@
         <w:rPr>
           <w:lang w:val="it-IT"/>
         </w:rPr>
-        <w:t xml:space="preserve"> Per fare ciò ho utilizzato il programma Project per creare un diagramma di Gantt inserendo tutte le attività che andrò a fare in questo progetto e i loro rispettivi tempi. </w:t>
-      </w:r>
-    </w:p>
-    <w:p>
-      <w:pPr>
-        <w:rPr>
-          <w:lang w:val="it-IT"/>
-        </w:rPr>
-      </w:pPr>
-    </w:p>
-    <w:p>
-      <w:pPr>
-        <w:rPr>
-          <w:lang w:val="it-IT"/>
-        </w:rPr>
-      </w:pPr>
-      <w:r>
-        <w:rPr>
-          <w:lang w:val="it-IT"/>
-        </w:rPr>
-        <w:t>La seguente immagine mostra il diagramma di Gantt:</w:t>
+        <w:t xml:space="preserve"> Per fare ciò ho utilizzato il programma Project per creare un diagramma di </w:t>
+      </w:r>
+      <w:proofErr w:type="spellStart"/>
+      <w:r>
+        <w:rPr>
+          <w:lang w:val="it-IT"/>
+        </w:rPr>
+        <w:t>Gantt</w:t>
+      </w:r>
+      <w:proofErr w:type="spellEnd"/>
+      <w:r>
+        <w:rPr>
+          <w:lang w:val="it-IT"/>
+        </w:rPr>
+        <w:t xml:space="preserve"> inserendo tutte le attività che andrò a fare in questo progetto e i loro rispettivi tempi. </w:t>
+      </w:r>
+    </w:p>
+    <w:p>
+      <w:pPr>
+        <w:rPr>
+          <w:lang w:val="it-IT"/>
+        </w:rPr>
+      </w:pPr>
+    </w:p>
+    <w:p>
+      <w:pPr>
+        <w:rPr>
+          <w:lang w:val="it-IT"/>
+        </w:rPr>
+      </w:pPr>
+      <w:r>
+        <w:rPr>
+          <w:lang w:val="it-IT"/>
+        </w:rPr>
+        <w:t xml:space="preserve">La seguente immagine mostra il diagramma di </w:t>
+      </w:r>
+      <w:proofErr w:type="spellStart"/>
+      <w:r>
+        <w:rPr>
+          <w:lang w:val="it-IT"/>
+        </w:rPr>
+        <w:t>Gantt</w:t>
+      </w:r>
+      <w:proofErr w:type="spellEnd"/>
+      <w:r>
+        <w:rPr>
+          <w:lang w:val="it-IT"/>
+        </w:rPr>
+        <w:t>:</w:t>
       </w:r>
     </w:p>
     <w:p>
@@ -7489,7 +7561,15 @@
               <w:fldChar w:fldCharType="end"/>
             </w:r>
             <w:r>
-              <w:t xml:space="preserve"> - Gantt Pianificazione</w:t>
+              <w:t xml:space="preserve"> - </w:t>
+            </w:r>
+            <w:proofErr w:type="spellStart"/>
+            <w:r>
+              <w:t>Gantt</w:t>
+            </w:r>
+            <w:proofErr w:type="spellEnd"/>
+            <w:r>
+              <w:t xml:space="preserve"> Pianificazione</w:t>
             </w:r>
           </w:p>
         </w:tc>
@@ -7563,6 +7643,7 @@
         </w:rPr>
         <w:t xml:space="preserve"> </w:t>
       </w:r>
+      <w:proofErr w:type="spellStart"/>
       <w:r>
         <w:rPr>
           <w:rStyle w:val="Enfasigrassetto"/>
@@ -7574,13 +7655,32 @@
         </w:rPr>
         <w:t>SwiftUI</w:t>
       </w:r>
+      <w:proofErr w:type="spellEnd"/>
       <w:r>
         <w:rPr>
           <w:rFonts w:ascii="Arial" w:hAnsi="Arial" w:cs="Arial"/>
           <w:sz w:val="20"/>
           <w:szCs w:val="20"/>
         </w:rPr>
-        <w:t xml:space="preserve"> è il framework principale per la realizzazione di applicazioni per dispositivi Apple, tra cui iPhone, iPad, Mac, Apple Watch e Apple TV. Swift è un linguaggio di programmazione moderno, sicuro e veloce, creato da Apple per lo sviluppo di app su tutti i suoi dispositivi. SwiftUI è il framework </w:t>
+        <w:t xml:space="preserve"> è il framework principale per la realizzazione di applicazioni per dispositivi Apple, tra cui iPhone, iPad, Mac, Apple Watch e Apple TV. Swift è un linguaggio di programmazione moderno, sicuro e veloce, creato da Apple per lo sviluppo di app su tutti i suoi dispositivi. </w:t>
+      </w:r>
+      <w:proofErr w:type="spellStart"/>
+      <w:r>
+        <w:rPr>
+          <w:rFonts w:ascii="Arial" w:hAnsi="Arial" w:cs="Arial"/>
+          <w:sz w:val="20"/>
+          <w:szCs w:val="20"/>
+        </w:rPr>
+        <w:t>SwiftUI</w:t>
+      </w:r>
+      <w:proofErr w:type="spellEnd"/>
+      <w:r>
+        <w:rPr>
+          <w:rFonts w:ascii="Arial" w:hAnsi="Arial" w:cs="Arial"/>
+          <w:sz w:val="20"/>
+          <w:szCs w:val="20"/>
+        </w:rPr>
+        <w:t xml:space="preserve"> è il framework </w:t>
       </w:r>
       <w:r>
         <w:rPr>
@@ -7611,13 +7711,23 @@
           <w:szCs w:val="20"/>
         </w:rPr>
       </w:pPr>
+      <w:proofErr w:type="spellStart"/>
       <w:r>
         <w:rPr>
           <w:rFonts w:ascii="Arial" w:hAnsi="Arial" w:cs="Arial"/>
           <w:sz w:val="20"/>
           <w:szCs w:val="20"/>
         </w:rPr>
-        <w:t xml:space="preserve">SwiftUI permette di realizzare interfacce utilizzando una </w:t>
+        <w:t>SwiftUI</w:t>
+      </w:r>
+      <w:proofErr w:type="spellEnd"/>
+      <w:r>
+        <w:rPr>
+          <w:rFonts w:ascii="Arial" w:hAnsi="Arial" w:cs="Arial"/>
+          <w:sz w:val="20"/>
+          <w:szCs w:val="20"/>
+        </w:rPr>
+        <w:t xml:space="preserve"> permette di realizzare interfacce utilizzando una </w:t>
       </w:r>
       <w:r>
         <w:rPr>
@@ -7628,60 +7738,9 @@
           <w:sz w:val="20"/>
           <w:szCs w:val="20"/>
         </w:rPr>
-        <w:t>sola codebase</w:t>
-      </w:r>
-      <w:r>
-        <w:rPr>
-          <w:rFonts w:ascii="Arial" w:hAnsi="Arial" w:cs="Arial"/>
-          <w:sz w:val="20"/>
-          <w:szCs w:val="20"/>
-        </w:rPr>
-        <w:t xml:space="preserve"> e gestisce automaticamente l’aggiornamento della UI quando cambiano i dati, riducendo il codice necessario rispetto a framework tradizionali come UIKit. Inoltre, consente di personalizzare stili e comportamenti specifici per ciascun dispositivo Apple, mantenendo però una coerenza grafica tra piattaforme diverse.</w:t>
-      </w:r>
-    </w:p>
-    <w:p>
-      <w:pPr>
-        <w:pStyle w:val="NormaleWeb"/>
-        <w:rPr>
-          <w:rFonts w:ascii="Arial" w:hAnsi="Arial" w:cs="Arial"/>
-          <w:sz w:val="20"/>
-          <w:szCs w:val="20"/>
-        </w:rPr>
-      </w:pPr>
-      <w:r>
-        <w:rPr>
-          <w:rFonts w:ascii="Arial" w:hAnsi="Arial" w:cs="Arial"/>
-          <w:sz w:val="20"/>
-          <w:szCs w:val="20"/>
-        </w:rPr>
-        <w:t>Questo framework è particolarmente indicato per chi vuole sviluppare applicazioni native per l’ecosistema Apple utilizzando Swift, con un approccio moderno e intuitivo, e per chi desidera integrare animazioni, gesti e dati in modo semplice e reattivo.</w:t>
-      </w:r>
-    </w:p>
-    <w:p>
-      <w:pPr>
-        <w:pStyle w:val="NormaleWeb"/>
-        <w:rPr>
-          <w:rFonts w:ascii="Arial" w:hAnsi="Arial" w:cs="Arial"/>
-          <w:sz w:val="20"/>
-          <w:szCs w:val="20"/>
-        </w:rPr>
-      </w:pPr>
-      <w:r>
-        <w:rPr>
-          <w:rFonts w:ascii="Arial" w:hAnsi="Arial" w:cs="Arial"/>
-          <w:sz w:val="20"/>
-          <w:szCs w:val="20"/>
-        </w:rPr>
-        <w:t xml:space="preserve">Per il progetto, ho utilizzato </w:t>
-      </w:r>
-      <w:r>
-        <w:rPr>
-          <w:rFonts w:ascii="Arial" w:hAnsi="Arial" w:cs="Arial"/>
-          <w:sz w:val="20"/>
-          <w:szCs w:val="20"/>
-        </w:rPr>
-        <w:t xml:space="preserve">Swift Playground 4, con </w:t>
-      </w:r>
+        <w:t xml:space="preserve">sola </w:t>
+      </w:r>
+      <w:proofErr w:type="spellStart"/>
       <w:r>
         <w:rPr>
           <w:rStyle w:val="Enfasigrassetto"/>
@@ -7691,16 +7750,78 @@
           <w:sz w:val="20"/>
           <w:szCs w:val="20"/>
         </w:rPr>
-        <w:t>Swift</w:t>
-      </w:r>
-      <w:r>
-        <w:rPr>
-          <w:rStyle w:val="Enfasigrassetto"/>
+        <w:t>codebase</w:t>
+      </w:r>
+      <w:proofErr w:type="spellEnd"/>
+      <w:r>
+        <w:rPr>
           <w:rFonts w:ascii="Arial" w:hAnsi="Arial" w:cs="Arial"/>
           <w:sz w:val="20"/>
           <w:szCs w:val="20"/>
         </w:rPr>
-        <w:t xml:space="preserve"> </w:t>
+        <w:t xml:space="preserve"> e gestisce automaticamente l’aggiornamento della UI quando cambiano i dati, riducendo il codice necessario rispetto a framework tradizionali come </w:t>
+      </w:r>
+      <w:proofErr w:type="spellStart"/>
+      <w:r>
+        <w:rPr>
+          <w:rFonts w:ascii="Arial" w:hAnsi="Arial" w:cs="Arial"/>
+          <w:sz w:val="20"/>
+          <w:szCs w:val="20"/>
+        </w:rPr>
+        <w:t>UIKit</w:t>
+      </w:r>
+      <w:proofErr w:type="spellEnd"/>
+      <w:r>
+        <w:rPr>
+          <w:rFonts w:ascii="Arial" w:hAnsi="Arial" w:cs="Arial"/>
+          <w:sz w:val="20"/>
+          <w:szCs w:val="20"/>
+        </w:rPr>
+        <w:t>. Inoltre, consente di personalizzare stili e comportamenti specifici per ciascun dispositivo Apple, mantenendo però una coerenza grafica tra piattaforme diverse.</w:t>
+      </w:r>
+    </w:p>
+    <w:p>
+      <w:pPr>
+        <w:pStyle w:val="NormaleWeb"/>
+        <w:rPr>
+          <w:rFonts w:ascii="Arial" w:hAnsi="Arial" w:cs="Arial"/>
+          <w:sz w:val="20"/>
+          <w:szCs w:val="20"/>
+        </w:rPr>
+      </w:pPr>
+      <w:r>
+        <w:rPr>
+          <w:rFonts w:ascii="Arial" w:hAnsi="Arial" w:cs="Arial"/>
+          <w:sz w:val="20"/>
+          <w:szCs w:val="20"/>
+        </w:rPr>
+        <w:t>Questo framework è particolarmente indicato per chi vuole sviluppare applicazioni native per l’ecosistema Apple utilizzando Swift, con un approccio moderno e intuitivo, e per chi desidera integrare animazioni, gesti e dati in modo semplice e reattivo.</w:t>
+      </w:r>
+    </w:p>
+    <w:p>
+      <w:pPr>
+        <w:pStyle w:val="NormaleWeb"/>
+        <w:rPr>
+          <w:rFonts w:ascii="Arial" w:hAnsi="Arial" w:cs="Arial"/>
+          <w:sz w:val="20"/>
+          <w:szCs w:val="20"/>
+        </w:rPr>
+      </w:pPr>
+      <w:r>
+        <w:rPr>
+          <w:rFonts w:ascii="Arial" w:hAnsi="Arial" w:cs="Arial"/>
+          <w:sz w:val="20"/>
+          <w:szCs w:val="20"/>
+        </w:rPr>
+        <w:t xml:space="preserve">Per il progetto, ho utilizzato </w:t>
+      </w:r>
+      <w:r>
+        <w:rPr>
+          <w:rFonts w:ascii="Arial" w:hAnsi="Arial" w:cs="Arial"/>
+          <w:sz w:val="20"/>
+          <w:szCs w:val="20"/>
+        </w:rPr>
+        <w:t xml:space="preserve">Swift Playground 4, con </w:t>
       </w:r>
       <w:r>
         <w:rPr>
@@ -7711,15 +7832,53 @@
           <w:sz w:val="20"/>
           <w:szCs w:val="20"/>
         </w:rPr>
-        <w:t>5.9</w:t>
-      </w:r>
-      <w:r>
-        <w:rPr>
+        <w:t>Swift</w:t>
+      </w:r>
+      <w:r>
+        <w:rPr>
+          <w:rStyle w:val="Enfasigrassetto"/>
           <w:rFonts w:ascii="Arial" w:hAnsi="Arial" w:cs="Arial"/>
           <w:sz w:val="20"/>
           <w:szCs w:val="20"/>
         </w:rPr>
-        <w:t xml:space="preserve"> come ambiente di sviluppo, con SwiftUI come framework per la creazione dell’interfaccia grafica.</w:t>
+        <w:t xml:space="preserve"> </w:t>
+      </w:r>
+      <w:r>
+        <w:rPr>
+          <w:rStyle w:val="Enfasigrassetto"/>
+          <w:rFonts w:ascii="Arial" w:hAnsi="Arial" w:cs="Arial"/>
+          <w:b w:val="0"/>
+          <w:bCs w:val="0"/>
+          <w:sz w:val="20"/>
+          <w:szCs w:val="20"/>
+        </w:rPr>
+        <w:t>5.9</w:t>
+      </w:r>
+      <w:r>
+        <w:rPr>
+          <w:rFonts w:ascii="Arial" w:hAnsi="Arial" w:cs="Arial"/>
+          <w:sz w:val="20"/>
+          <w:szCs w:val="20"/>
+        </w:rPr>
+        <w:t xml:space="preserve"> come ambiente di sviluppo, con </w:t>
+      </w:r>
+      <w:proofErr w:type="spellStart"/>
+      <w:r>
+        <w:rPr>
+          <w:rFonts w:ascii="Arial" w:hAnsi="Arial" w:cs="Arial"/>
+          <w:sz w:val="20"/>
+          <w:szCs w:val="20"/>
+        </w:rPr>
+        <w:t>SwiftUI</w:t>
+      </w:r>
+      <w:proofErr w:type="spellEnd"/>
+      <w:r>
+        <w:rPr>
+          <w:rFonts w:ascii="Arial" w:hAnsi="Arial" w:cs="Arial"/>
+          <w:sz w:val="20"/>
+          <w:szCs w:val="20"/>
+        </w:rPr>
+        <w:t xml:space="preserve"> come framework per la creazione dell’interfaccia grafica.</w:t>
       </w:r>
     </w:p>
     <w:p>
@@ -7763,11 +7922,19 @@
           <w:lang w:val="it-IT"/>
         </w:rPr>
       </w:pPr>
-      <w:r>
-        <w:rPr>
-          <w:lang w:val="it-IT"/>
-        </w:rPr>
-        <w:t>Ipad 10th Generation</w:t>
+      <w:proofErr w:type="spellStart"/>
+      <w:r>
+        <w:rPr>
+          <w:lang w:val="it-IT"/>
+        </w:rPr>
+        <w:t>Ipad</w:t>
+      </w:r>
+      <w:proofErr w:type="spellEnd"/>
+      <w:r>
+        <w:rPr>
+          <w:lang w:val="it-IT"/>
+        </w:rPr>
+        <w:t xml:space="preserve"> 10th Generation</w:t>
       </w:r>
     </w:p>
     <w:p>
@@ -7840,6 +8007,7 @@
           <w:numId w:val="33"/>
         </w:numPr>
       </w:pPr>
+      <w:proofErr w:type="spellStart"/>
       <w:r>
         <w:rPr>
           <w:b/>
@@ -7847,6 +8015,7 @@
         </w:rPr>
         <w:t>ContenView</w:t>
       </w:r>
+      <w:proofErr w:type="spellEnd"/>
       <w:r>
         <w:br/>
         <w:t>Mostra:</w:t>
@@ -7895,6 +8064,7 @@
           <w:numId w:val="33"/>
         </w:numPr>
       </w:pPr>
+      <w:proofErr w:type="spellStart"/>
       <w:r>
         <w:rPr>
           <w:b/>
@@ -7902,6 +8072,7 @@
         </w:rPr>
         <w:t>HomeView</w:t>
       </w:r>
+      <w:proofErr w:type="spellEnd"/>
       <w:r>
         <w:br/>
         <w:t>Mostra:</w:t>
@@ -8009,6 +8180,7 @@
           <w:numId w:val="33"/>
         </w:numPr>
       </w:pPr>
+      <w:proofErr w:type="spellStart"/>
       <w:r>
         <w:rPr>
           <w:b/>
@@ -8023,6 +8195,7 @@
         </w:rPr>
         <w:t>View</w:t>
       </w:r>
+      <w:proofErr w:type="spellEnd"/>
       <w:r>
         <w:br/>
       </w:r>
@@ -8055,6 +8228,7 @@
           <w:bCs/>
         </w:rPr>
       </w:pPr>
+      <w:proofErr w:type="spellStart"/>
       <w:r>
         <w:rPr>
           <w:b/>
@@ -8062,6 +8236,7 @@
         </w:rPr>
         <w:t>MyApp</w:t>
       </w:r>
+      <w:proofErr w:type="spellEnd"/>
     </w:p>
     <w:p>
       <w:pPr>
@@ -8168,6 +8343,7 @@
           <w:numId w:val="33"/>
         </w:numPr>
       </w:pPr>
+      <w:proofErr w:type="spellStart"/>
       <w:r>
         <w:rPr>
           <w:b/>
@@ -8175,6 +8351,7 @@
         </w:rPr>
         <w:t>PlanetDetailView</w:t>
       </w:r>
+      <w:proofErr w:type="spellEnd"/>
       <w:r>
         <w:br/>
         <w:t>Pagina interna che contiene:</w:t>
@@ -8210,8 +8387,13 @@
         </w:numPr>
       </w:pPr>
       <w:r>
-        <w:t>video MP4 riproducibile con AVKit</w:t>
-      </w:r>
+        <w:t xml:space="preserve">video MP4 riproducibile con </w:t>
+      </w:r>
+      <w:proofErr w:type="spellStart"/>
+      <w:r>
+        <w:t>AVKit</w:t>
+      </w:r>
+      <w:proofErr w:type="spellEnd"/>
     </w:p>
     <w:p>
       <w:pPr>
@@ -8220,6 +8402,7 @@
           <w:numId w:val="33"/>
         </w:numPr>
       </w:pPr>
+      <w:proofErr w:type="spellStart"/>
       <w:r>
         <w:rPr>
           <w:b/>
@@ -8234,6 +8417,7 @@
         </w:rPr>
         <w:t>a</w:t>
       </w:r>
+      <w:proofErr w:type="spellEnd"/>
     </w:p>
     <w:p>
       <w:pPr>
@@ -8262,6 +8446,7 @@
           <w:numId w:val="33"/>
         </w:numPr>
       </w:pPr>
+      <w:proofErr w:type="spellStart"/>
       <w:r>
         <w:rPr>
           <w:b/>
@@ -8269,6 +8454,7 @@
         </w:rPr>
         <w:t>PlanetView</w:t>
       </w:r>
+      <w:proofErr w:type="spellEnd"/>
     </w:p>
     <w:p>
       <w:pPr>
@@ -8330,7 +8516,15 @@
         </w:numPr>
       </w:pPr>
       <w:r>
-        <w:t>Selezione dell’utente (tap sul pianeta)</w:t>
+        <w:t>Selezione dell’utente (</w:t>
+      </w:r>
+      <w:proofErr w:type="spellStart"/>
+      <w:r>
+        <w:t>tap</w:t>
+      </w:r>
+      <w:proofErr w:type="spellEnd"/>
+      <w:r>
+        <w:t xml:space="preserve"> sul pianeta)</w:t>
       </w:r>
     </w:p>
     <w:p>
@@ -8471,9 +8665,11 @@
       <w:pPr>
         <w:pStyle w:val="Titolo3"/>
       </w:pPr>
+      <w:proofErr w:type="spellStart"/>
       <w:r>
         <w:t>NebulaUML</w:t>
       </w:r>
+      <w:proofErr w:type="spellEnd"/>
     </w:p>
     <w:p>
       <w:r>
@@ -8510,6 +8706,7 @@
           <w:numId w:val="33"/>
         </w:numPr>
       </w:pPr>
+      <w:proofErr w:type="spellStart"/>
       <w:r>
         <w:rPr>
           <w:b/>
@@ -8517,6 +8714,7 @@
         </w:rPr>
         <w:t>SistemaSolare</w:t>
       </w:r>
+      <w:proofErr w:type="spellEnd"/>
       <w:r>
         <w:t xml:space="preserve">: questa classe </w:t>
       </w:r>
@@ -8604,6 +8802,7 @@
           <w:numId w:val="33"/>
         </w:numPr>
       </w:pPr>
+      <w:proofErr w:type="spellStart"/>
       <w:r>
         <w:rPr>
           <w:b/>
@@ -8611,6 +8810,7 @@
         </w:rPr>
         <w:t>CuriositàDelGiorno</w:t>
       </w:r>
+      <w:proofErr w:type="spellEnd"/>
       <w:r>
         <w:t>: essa mostra le informazioni prese dal API, che ogni giorno vengono aggiornate.</w:t>
       </w:r>
@@ -8761,6 +8961,9 @@
         </mc:AlternateContent>
       </w:r>
       <w:r>
+        <w:rPr>
+          <w:noProof/>
+        </w:rPr>
         <w:drawing>
           <wp:anchor distT="0" distB="0" distL="114300" distR="114300" simplePos="0" relativeHeight="251659264" behindDoc="0" locked="0" layoutInCell="1" allowOverlap="1" wp14:anchorId="6D57A0D5" wp14:editId="2CCF9886">
             <wp:simplePos x="0" y="0"/>
@@ -8856,7 +9059,21 @@
         <w:rPr>
           <w:lang w:val="it-IT"/>
         </w:rPr>
-        <w:t>Le interfacce sono state progettate sulla base dei requisiti raccolti nella fase di analisi (funzionali e non funzionali) e sono state rappresentate tramite mockup che guidano la fase di sviluppo.</w:t>
+        <w:t xml:space="preserve">Le interfacce sono state progettate sulla base dei requisiti raccolti nella fase di analisi (funzionali e non funzionali) e sono state rappresentate tramite </w:t>
+      </w:r>
+      <w:proofErr w:type="spellStart"/>
+      <w:r>
+        <w:rPr>
+          <w:lang w:val="it-IT"/>
+        </w:rPr>
+        <w:t>mockup</w:t>
+      </w:r>
+      <w:proofErr w:type="spellEnd"/>
+      <w:r>
+        <w:rPr>
+          <w:lang w:val="it-IT"/>
+        </w:rPr>
+        <w:t xml:space="preserve"> che guidano la fase di sviluppo.</w:t>
       </w:r>
     </w:p>
     <w:p>
@@ -8907,9 +9124,11 @@
       <w:r>
         <w:t xml:space="preserve">, in particolare su un </w:t>
       </w:r>
+      <w:proofErr w:type="spellStart"/>
       <w:r>
         <w:t>Iphone</w:t>
       </w:r>
+      <w:proofErr w:type="spellEnd"/>
       <w:r>
         <w:t>.</w:t>
       </w:r>
@@ -8997,8 +9216,13 @@
                               <w:fldChar w:fldCharType="end"/>
                             </w:r>
                             <w:r>
-                              <w:t xml:space="preserve"> - Pagina principale Mockup</w:t>
+                              <w:t xml:space="preserve"> - Pagina principale </w:t>
                             </w:r>
+                            <w:proofErr w:type="spellStart"/>
+                            <w:r>
+                              <w:t>Mockup</w:t>
+                            </w:r>
+                            <w:proofErr w:type="spellEnd"/>
                           </w:p>
                         </w:txbxContent>
                       </wps:txbx>
@@ -9056,8 +9280,13 @@
                         <w:fldChar w:fldCharType="end"/>
                       </w:r>
                       <w:r>
-                        <w:t xml:space="preserve"> - Pagina principale Mockup</w:t>
+                        <w:t xml:space="preserve"> - Pagina principale </w:t>
                       </w:r>
+                      <w:proofErr w:type="spellStart"/>
+                      <w:r>
+                        <w:t>Mockup</w:t>
+                      </w:r>
+                      <w:proofErr w:type="spellEnd"/>
                     </w:p>
                   </w:txbxContent>
                 </v:textbox>
@@ -9068,6 +9297,9 @@
         </mc:AlternateContent>
       </w:r>
       <w:r>
+        <w:rPr>
+          <w:noProof/>
+        </w:rPr>
         <w:drawing>
           <wp:anchor distT="0" distB="0" distL="114300" distR="114300" simplePos="0" relativeHeight="251658240" behindDoc="1" locked="0" layoutInCell="1" allowOverlap="1" wp14:anchorId="358B827E" wp14:editId="34090B82">
             <wp:simplePos x="0" y="0"/>
@@ -9145,7 +9377,21 @@
         <w:rPr>
           <w:lang w:val="it-IT"/>
         </w:rPr>
-        <w:t xml:space="preserve">Essa mostra una scritta che da il benvenuto all’utente e un bottone che una volta premuto porterà </w:t>
+        <w:t xml:space="preserve">Essa mostra una scritta che </w:t>
+      </w:r>
+      <w:proofErr w:type="spellStart"/>
+      <w:r>
+        <w:rPr>
+          <w:lang w:val="it-IT"/>
+        </w:rPr>
+        <w:t>da</w:t>
+      </w:r>
+      <w:proofErr w:type="spellEnd"/>
+      <w:r>
+        <w:rPr>
+          <w:lang w:val="it-IT"/>
+        </w:rPr>
+        <w:t xml:space="preserve"> il benvenuto all’utente e un bottone che una volta premuto porterà </w:t>
       </w:r>
       <w:r>
         <w:rPr>
@@ -9234,8 +9480,13 @@
                               <w:t xml:space="preserve"> - Sistema Solare</w:t>
                             </w:r>
                             <w:r>
-                              <w:t xml:space="preserve"> Mockup</w:t>
+                              <w:t xml:space="preserve"> </w:t>
                             </w:r>
+                            <w:proofErr w:type="spellStart"/>
+                            <w:r>
+                              <w:t>Mockup</w:t>
+                            </w:r>
+                            <w:proofErr w:type="spellEnd"/>
                           </w:p>
                         </w:txbxContent>
                       </wps:txbx>
@@ -9296,8 +9547,13 @@
                         <w:t xml:space="preserve"> - Sistema Solare</w:t>
                       </w:r>
                       <w:r>
-                        <w:t xml:space="preserve"> Mockup</w:t>
+                        <w:t xml:space="preserve"> </w:t>
                       </w:r>
+                      <w:proofErr w:type="spellStart"/>
+                      <w:r>
+                        <w:t>Mockup</w:t>
+                      </w:r>
+                      <w:proofErr w:type="spellEnd"/>
                     </w:p>
                   </w:txbxContent>
                 </v:textbox>
@@ -9308,6 +9564,9 @@
         </mc:AlternateContent>
       </w:r>
       <w:r>
+        <w:rPr>
+          <w:noProof/>
+        </w:rPr>
         <w:drawing>
           <wp:anchor distT="0" distB="0" distL="114300" distR="114300" simplePos="0" relativeHeight="251667456" behindDoc="0" locked="0" layoutInCell="1" allowOverlap="1" wp14:anchorId="124D87C8" wp14:editId="6392F3DC">
             <wp:simplePos x="0" y="0"/>
@@ -9485,8 +9744,13 @@
                               <w:fldChar w:fldCharType="end"/>
                             </w:r>
                             <w:r>
-                              <w:t xml:space="preserve"> - Informazioni sui pianeti Mockup</w:t>
+                              <w:t xml:space="preserve"> - Informazioni sui pianeti </w:t>
                             </w:r>
+                            <w:proofErr w:type="spellStart"/>
+                            <w:r>
+                              <w:t>Mockup</w:t>
+                            </w:r>
+                            <w:proofErr w:type="spellEnd"/>
                           </w:p>
                         </w:txbxContent>
                       </wps:txbx>
@@ -9544,8 +9808,13 @@
                         <w:fldChar w:fldCharType="end"/>
                       </w:r>
                       <w:r>
-                        <w:t xml:space="preserve"> - Informazioni sui pianeti Mockup</w:t>
+                        <w:t xml:space="preserve"> - Informazioni sui pianeti </w:t>
                       </w:r>
+                      <w:proofErr w:type="spellStart"/>
+                      <w:r>
+                        <w:t>Mockup</w:t>
+                      </w:r>
+                      <w:proofErr w:type="spellEnd"/>
                     </w:p>
                   </w:txbxContent>
                 </v:textbox>
@@ -9556,6 +9825,9 @@
         </mc:AlternateContent>
       </w:r>
       <w:r>
+        <w:rPr>
+          <w:noProof/>
+        </w:rPr>
         <w:drawing>
           <wp:anchor distT="0" distB="0" distL="114300" distR="114300" simplePos="0" relativeHeight="251670528" behindDoc="0" locked="0" layoutInCell="1" allowOverlap="1" wp14:anchorId="36537A6D" wp14:editId="77A29D5B">
             <wp:simplePos x="0" y="0"/>
@@ -9727,8 +9999,13 @@
                               <w:fldChar w:fldCharType="end"/>
                             </w:r>
                             <w:r>
-                              <w:t xml:space="preserve"> - Informazioni Luna Mockup</w:t>
+                              <w:t xml:space="preserve"> - Informazioni Luna </w:t>
                             </w:r>
+                            <w:proofErr w:type="spellStart"/>
+                            <w:r>
+                              <w:t>Mockup</w:t>
+                            </w:r>
+                            <w:proofErr w:type="spellEnd"/>
                           </w:p>
                         </w:txbxContent>
                       </wps:txbx>
@@ -9786,8 +10063,13 @@
                         <w:fldChar w:fldCharType="end"/>
                       </w:r>
                       <w:r>
-                        <w:t xml:space="preserve"> - Informazioni Luna Mockup</w:t>
+                        <w:t xml:space="preserve"> - Informazioni Luna </w:t>
                       </w:r>
+                      <w:proofErr w:type="spellStart"/>
+                      <w:r>
+                        <w:t>Mockup</w:t>
+                      </w:r>
+                      <w:proofErr w:type="spellEnd"/>
                     </w:p>
                   </w:txbxContent>
                 </v:textbox>
@@ -9798,6 +10080,9 @@
         </mc:AlternateContent>
       </w:r>
       <w:r>
+        <w:rPr>
+          <w:noProof/>
+        </w:rPr>
         <w:drawing>
           <wp:anchor distT="0" distB="0" distL="114300" distR="114300" simplePos="0" relativeHeight="251673600" behindDoc="0" locked="0" layoutInCell="1" allowOverlap="1" wp14:anchorId="6FE9D336" wp14:editId="767C6D54">
             <wp:simplePos x="0" y="0"/>
@@ -9939,8 +10224,13 @@
                               <w:fldChar w:fldCharType="end"/>
                             </w:r>
                             <w:r>
-                              <w:t xml:space="preserve"> - APOD Mockup</w:t>
+                              <w:t xml:space="preserve"> - APOD </w:t>
                             </w:r>
+                            <w:proofErr w:type="spellStart"/>
+                            <w:r>
+                              <w:t>Mockup</w:t>
+                            </w:r>
+                            <w:proofErr w:type="spellEnd"/>
                           </w:p>
                         </w:txbxContent>
                       </wps:txbx>
@@ -9998,8 +10288,13 @@
                         <w:fldChar w:fldCharType="end"/>
                       </w:r>
                       <w:r>
-                        <w:t xml:space="preserve"> - APOD Mockup</w:t>
+                        <w:t xml:space="preserve"> - APOD </w:t>
                       </w:r>
+                      <w:proofErr w:type="spellStart"/>
+                      <w:r>
+                        <w:t>Mockup</w:t>
+                      </w:r>
+                      <w:proofErr w:type="spellEnd"/>
                     </w:p>
                   </w:txbxContent>
                 </v:textbox>
@@ -10010,6 +10305,9 @@
         </mc:AlternateContent>
       </w:r>
       <w:r>
+        <w:rPr>
+          <w:noProof/>
+        </w:rPr>
         <w:drawing>
           <wp:anchor distT="0" distB="0" distL="114300" distR="114300" simplePos="0" relativeHeight="251676672" behindDoc="0" locked="0" layoutInCell="1" allowOverlap="1" wp14:anchorId="34272539" wp14:editId="54454B8F">
             <wp:simplePos x="0" y="0"/>
@@ -10176,8 +10474,13 @@
                               <w:fldChar w:fldCharType="end"/>
                             </w:r>
                             <w:r>
-                              <w:t xml:space="preserve"> - Galassia Mockup</w:t>
+                              <w:t xml:space="preserve"> - Galassia </w:t>
                             </w:r>
+                            <w:proofErr w:type="spellStart"/>
+                            <w:r>
+                              <w:t>Mockup</w:t>
+                            </w:r>
+                            <w:proofErr w:type="spellEnd"/>
                           </w:p>
                         </w:txbxContent>
                       </wps:txbx>
@@ -10235,8 +10538,13 @@
                         <w:fldChar w:fldCharType="end"/>
                       </w:r>
                       <w:r>
-                        <w:t xml:space="preserve"> - Galassia Mockup</w:t>
+                        <w:t xml:space="preserve"> - Galassia </w:t>
                       </w:r>
+                      <w:proofErr w:type="spellStart"/>
+                      <w:r>
+                        <w:t>Mockup</w:t>
+                      </w:r>
+                      <w:proofErr w:type="spellEnd"/>
                     </w:p>
                   </w:txbxContent>
                 </v:textbox>
@@ -10247,6 +10555,9 @@
         </mc:AlternateContent>
       </w:r>
       <w:r>
+        <w:rPr>
+          <w:noProof/>
+        </w:rPr>
         <w:drawing>
           <wp:anchor distT="0" distB="0" distL="114300" distR="114300" simplePos="0" relativeHeight="251679744" behindDoc="0" locked="0" layoutInCell="1" allowOverlap="1" wp14:anchorId="5E68B89D" wp14:editId="46C7A58A">
             <wp:simplePos x="0" y="0"/>
@@ -10333,58 +10644,27 @@
         <w:br w:type="page"/>
       </w:r>
     </w:p>
+    <w:bookmarkStart w:id="23" w:name="_Toc429059812"/>
+    <w:bookmarkStart w:id="24" w:name="_Toc94790458"/>
     <w:p>
       <w:pPr>
         <w:pStyle w:val="Titolo2"/>
       </w:pPr>
-      <w:bookmarkStart w:id="23" w:name="_Toc429059812"/>
-      <w:bookmarkStart w:id="24" w:name="_Toc94790458"/>
-      <w:r>
+      <w:r>
+        <w:rPr>
+          <w:noProof/>
+        </w:rPr>
         <w:lastRenderedPageBreak/>
-        <w:t>Design procedurale</w:t>
-      </w:r>
-      <w:bookmarkEnd w:id="23"/>
-      <w:bookmarkEnd w:id="24"/>
-    </w:p>
-    <w:p>
-      <w:r>
-        <w:t>Il diagramma di flusso definisce il comportamento dinamico dell’applicazione e descrive in modo sistematico le azioni che l’utente può compiere e le corrispondenti risposte del sistema.</w:t>
-      </w:r>
-    </w:p>
-    <w:p/>
-    <w:p>
-      <w:r>
-        <w:t>L’applicazione inizia con la fase di inizializzazione dell’interfaccia. Dopo l’accesso alla schermata principale, l’utente può interagire con il modello animato del Sistema Solare e accedere a contenuti informativi o multimediali selezionando i pianeti o la Luna.</w:t>
-      </w:r>
-    </w:p>
-    <w:p/>
-    <w:p>
-      <w:r>
-        <w:t>Una parte specifica del flusso gestisce la funzionalità “Foto del Giorno”, la quale utilizza un servizio API esterno della NASA. Tale blocco include anche un percorso alternativo in caso di errore di connessione o risposta non valida, garantendo stabilità e continuità dell’esperienza utente.</w:t>
-      </w:r>
-    </w:p>
-    <w:p/>
-    <w:p>
-      <w:r>
-        <w:t>Il sistema include inoltre una logica di zoom dinamico che modifica progressivamente la prospettiva visuale fino a mostrare la Via Lattea quando il livello di zoom raggiunge valori minimi.</w:t>
-      </w:r>
-    </w:p>
-    <w:p/>
-    <w:p>
-      <w:r>
-        <w:rPr>
-          <w:noProof/>
-        </w:rPr>
         <mc:AlternateContent>
           <mc:Choice Requires="wps">
             <w:drawing>
-              <wp:anchor distT="0" distB="0" distL="114300" distR="114300" simplePos="0" relativeHeight="251684864" behindDoc="0" locked="0" layoutInCell="1" allowOverlap="1" wp14:anchorId="07F3798B" wp14:editId="4F0060BA">
+              <wp:anchor distT="0" distB="0" distL="114300" distR="114300" simplePos="0" relativeHeight="251684864" behindDoc="0" locked="0" layoutInCell="1" allowOverlap="1" wp14:anchorId="07F3798B" wp14:editId="422FD8FB">
                 <wp:simplePos x="0" y="0"/>
                 <wp:positionH relativeFrom="margin">
                   <wp:align>center</wp:align>
                 </wp:positionH>
                 <wp:positionV relativeFrom="paragraph">
-                  <wp:posOffset>5915660</wp:posOffset>
+                  <wp:posOffset>8246275</wp:posOffset>
                 </wp:positionV>
                 <wp:extent cx="1533525" cy="635"/>
                 <wp:effectExtent l="0" t="0" r="9525" b="0"/>
@@ -10463,7 +10743,7 @@
           </mc:Choice>
           <mc:Fallback>
             <w:pict>
-              <v:shape w14:anchorId="07F3798B" id="Casella di testo 30" o:spid="_x0000_s1034" type="#_x0000_t202" style="position:absolute;margin-left:0;margin-top:465.8pt;width:120.75pt;height:.05pt;z-index:251684864;visibility:visible;mso-wrap-style:square;mso-width-percent:0;mso-wrap-distance-left:9pt;mso-wrap-distance-top:0;mso-wrap-distance-right:9pt;mso-wrap-distance-bottom:0;mso-position-horizontal:center;mso-position-horizontal-relative:margin;mso-position-vertical:absolute;mso-position-vertical-relative:text;mso-width-percent:0;mso-width-relative:margin;v-text-anchor:top" o:gfxdata="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" stroked="f">
+              <v:shape w14:anchorId="07F3798B" id="Casella di testo 30" o:spid="_x0000_s1034" type="#_x0000_t202" style="position:absolute;left:0;text-align:left;margin-left:0;margin-top:649.3pt;width:120.75pt;height:.05pt;z-index:251684864;visibility:visible;mso-wrap-style:square;mso-width-percent:0;mso-wrap-distance-left:9pt;mso-wrap-distance-top:0;mso-wrap-distance-right:9pt;mso-wrap-distance-bottom:0;mso-position-horizontal:center;mso-position-horizontal-relative:margin;mso-position-vertical:absolute;mso-position-vertical-relative:text;mso-width-percent:0;mso-width-relative:margin;v-text-anchor:top" o:gfxdata="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" stroked="f">
                 <v:textbox style="mso-fit-shape-to-text:t" inset="0,0,0,0">
                   <w:txbxContent>
                     <w:p>
@@ -10507,17 +10787,20 @@
         </mc:AlternateContent>
       </w:r>
       <w:r>
+        <w:rPr>
+          <w:noProof/>
+        </w:rPr>
         <w:drawing>
-          <wp:anchor distT="0" distB="0" distL="114300" distR="114300" simplePos="0" relativeHeight="251682816" behindDoc="0" locked="0" layoutInCell="1" allowOverlap="1" wp14:anchorId="3F3D203D" wp14:editId="64845AC8">
+          <wp:anchor distT="0" distB="0" distL="114300" distR="114300" simplePos="0" relativeHeight="251682816" behindDoc="0" locked="0" layoutInCell="1" allowOverlap="1" wp14:anchorId="3F3D203D" wp14:editId="09B18C0A">
             <wp:simplePos x="0" y="0"/>
             <wp:positionH relativeFrom="margin">
               <wp:align>center</wp:align>
             </wp:positionH>
             <wp:positionV relativeFrom="paragraph">
-              <wp:posOffset>415925</wp:posOffset>
+              <wp:posOffset>366699</wp:posOffset>
             </wp:positionV>
-            <wp:extent cx="3952875" cy="5601970"/>
-            <wp:effectExtent l="0" t="0" r="9525" b="0"/>
+            <wp:extent cx="5750560" cy="8149590"/>
+            <wp:effectExtent l="0" t="0" r="2540" b="3810"/>
             <wp:wrapTopAndBottom/>
             <wp:docPr id="29" name="Immagine 29"/>
             <wp:cNvGraphicFramePr>
@@ -10548,7 +10831,7 @@
                   <pic:spPr bwMode="auto">
                     <a:xfrm>
                       <a:off x="0" y="0"/>
-                      <a:ext cx="3952875" cy="5601970"/>
+                      <a:ext cx="5750560" cy="8149590"/>
                     </a:xfrm>
                     <a:prstGeom prst="rect">
                       <a:avLst/>
@@ -10571,6 +10854,38 @@
         </w:drawing>
       </w:r>
       <w:r>
+        <w:t>Design procedurale</w:t>
+      </w:r>
+      <w:bookmarkEnd w:id="23"/>
+      <w:bookmarkEnd w:id="24"/>
+    </w:p>
+    <w:p>
+      <w:r>
+        <w:lastRenderedPageBreak/>
+        <w:t>Il diagramma di flusso definisce il comportamento dinamico dell’applicazione e descrive in modo sistematico le azioni che l’utente può compiere e le corrispondenti risposte del sistema.</w:t>
+      </w:r>
+    </w:p>
+    <w:p/>
+    <w:p>
+      <w:r>
+        <w:t>L’applicazione inizia con la fase di inizializzazione dell’interfaccia. Dopo l’accesso alla schermata principale, l’utente può interagire con il modello animato del Sistema Solare e accedere a contenuti informativi o multimediali selezionando i pianeti o la Luna.</w:t>
+      </w:r>
+    </w:p>
+    <w:p/>
+    <w:p>
+      <w:r>
+        <w:t>Una parte specifica del flusso gestisce la funzionalità “Foto del Giorno”, la quale utilizza un servizio API esterno della NASA. Tale blocco include anche un percorso alternativo in caso di errore di connessione o risposta non valida, garantendo stabilità e continuità dell’esperienza utente.</w:t>
+      </w:r>
+    </w:p>
+    <w:p/>
+    <w:p>
+      <w:r>
+        <w:t>Il sistema include inoltre una logica di zoom dinamico che modifica progressivamente la prospettiva visuale fino a mostrare la Via Lattea quando il livello di zoom raggiunge valori minimi.</w:t>
+      </w:r>
+    </w:p>
+    <w:p/>
+    <w:p>
+      <w:r>
         <w:t>Il flusso non presenta una conclusione lineare, ma un ciclo operativo illimitato che permette all’utente di continuare a navigare tra le schermate finché decide di lasciare l’applicazione.</w:t>
       </w:r>
     </w:p>
@@ -10584,7 +10899,6 @@
       <w:bookmarkStart w:id="25" w:name="_Toc461179222"/>
       <w:bookmarkStart w:id="26" w:name="_Toc94790459"/>
       <w:r>
-        <w:lastRenderedPageBreak/>
         <w:t>Implementazione</w:t>
       </w:r>
       <w:bookmarkEnd w:id="25"/>
@@ -10593,6 +10907,10 @@
     <w:p>
       <w:pPr>
         <w:pStyle w:val="Titolo2"/>
+        <w:numPr>
+          <w:ilvl w:val="2"/>
+          <w:numId w:val="38"/>
+        </w:numPr>
       </w:pPr>
       <w:r>
         <w:t>Creazione applicativo</w:t>
@@ -10681,33 +10999,106 @@
       <w:pPr>
         <w:pStyle w:val="Titolo2"/>
       </w:pPr>
+      <w:proofErr w:type="spellStart"/>
       <w:r>
         <w:t>ContentView.swift</w:t>
       </w:r>
-    </w:p>
-    <w:p>
-      <w:r>
-        <w:t>ContentView è la vista iniziale dell’applicazione. Fornisce un’immagine di sfondo a schermo intero e un’interfaccia molto semplice composta da un titolo e un pulsante che, quando premuto, esegue la navigazione verso HomeView tramite un NavigationStack. L’immagine di sfondo è resa con .scaledToFill() e ignoresSafeArea() per coprire l’intero schermo; il pulsante è implementato come NavigationLink stilizzato (sfondo bianco, testo nero, angoli arrotondati e ombra). La view è puramente presentazionale e non mantiene stato applicativo. Per garantire compatibilità e accessibilità si raccomanda di evitare dimensioni fisse per il layout, di aggiungere etichette di accessibilità e di localizzare tutte le stringhe.</w:t>
+      <w:proofErr w:type="spellEnd"/>
+    </w:p>
+    <w:p>
+      <w:proofErr w:type="spellStart"/>
+      <w:r>
+        <w:t>ContentView</w:t>
+      </w:r>
+      <w:proofErr w:type="spellEnd"/>
+      <w:r>
+        <w:t xml:space="preserve"> è la vista iniziale dell’applicazione. Fornisce un’immagine di sfondo a schermo intero e un’interfaccia molto semplice composta da un titolo e un pulsante che, quando premuto, esegue la navigazione verso </w:t>
+      </w:r>
+      <w:proofErr w:type="spellStart"/>
+      <w:r>
+        <w:t>HomeView</w:t>
+      </w:r>
+      <w:proofErr w:type="spellEnd"/>
+      <w:r>
+        <w:t xml:space="preserve"> tramite un </w:t>
+      </w:r>
+      <w:proofErr w:type="spellStart"/>
+      <w:r>
+        <w:t>NavigationStack</w:t>
+      </w:r>
+      <w:proofErr w:type="spellEnd"/>
+      <w:r>
+        <w:t xml:space="preserve">. L’immagine di sfondo è resa </w:t>
+      </w:r>
+      <w:proofErr w:type="gramStart"/>
+      <w:r>
+        <w:t>con .</w:t>
+      </w:r>
+      <w:proofErr w:type="spellStart"/>
+      <w:r>
+        <w:t>scaledToFill</w:t>
+      </w:r>
+      <w:proofErr w:type="spellEnd"/>
+      <w:proofErr w:type="gramEnd"/>
+      <w:r>
+        <w:t xml:space="preserve">() e </w:t>
+      </w:r>
+      <w:proofErr w:type="spellStart"/>
+      <w:r>
+        <w:t>ignoresSafeArea</w:t>
+      </w:r>
+      <w:proofErr w:type="spellEnd"/>
+      <w:r>
+        <w:t xml:space="preserve">() per coprire l’intero schermo; il pulsante è implementato come </w:t>
+      </w:r>
+      <w:proofErr w:type="spellStart"/>
+      <w:r>
+        <w:t>NavigationLink</w:t>
+      </w:r>
+      <w:proofErr w:type="spellEnd"/>
+      <w:r>
+        <w:t xml:space="preserve"> stilizzato (sfondo bianco, testo nero, angoli arrotondati e ombra). La </w:t>
+      </w:r>
+      <w:proofErr w:type="spellStart"/>
+      <w:r>
+        <w:t>view</w:t>
+      </w:r>
+      <w:proofErr w:type="spellEnd"/>
+      <w:r>
+        <w:t xml:space="preserve"> è puramente </w:t>
+      </w:r>
+      <w:proofErr w:type="spellStart"/>
+      <w:r>
+        <w:t>presentazionale</w:t>
+      </w:r>
+      <w:proofErr w:type="spellEnd"/>
+      <w:r>
+        <w:t xml:space="preserve"> e non mantiene stato applicativo. Per garantire compatibilità e accessibilità si raccomanda di evitare dimensioni fisse per il layout, di aggiungere etichette di accessibilità e di localizzare tutte le stringhe.</w:t>
       </w:r>
     </w:p>
     <w:p>
       <w:pPr>
         <w:pStyle w:val="Titolo3"/>
-      </w:pPr>
-      <w:r>
-        <w:rPr>
-          <w:noProof/>
-        </w:rPr>
+        <w:numPr>
+          <w:ilvl w:val="2"/>
+          <w:numId w:val="39"/>
+        </w:numPr>
+      </w:pPr>
+      <w:r>
+        <w:rPr>
+          <w:noProof/>
+        </w:rPr>
+        <w:lastRenderedPageBreak/>
         <mc:AlternateContent>
           <mc:Choice Requires="wps">
             <w:drawing>
-              <wp:anchor distT="0" distB="0" distL="114300" distR="114300" simplePos="0" relativeHeight="251687936" behindDoc="0" locked="0" layoutInCell="1" allowOverlap="1" wp14:anchorId="0833E42B" wp14:editId="65EE6642">
+              <wp:anchor distT="0" distB="0" distL="114300" distR="114300" simplePos="0" relativeHeight="251687936" behindDoc="0" locked="0" layoutInCell="1" allowOverlap="1" wp14:anchorId="0833E42B" wp14:editId="323119DE">
                 <wp:simplePos x="0" y="0"/>
                 <wp:positionH relativeFrom="margin">
                   <wp:align>center</wp:align>
                 </wp:positionH>
                 <wp:positionV relativeFrom="paragraph">
-                  <wp:posOffset>2046389</wp:posOffset>
+                  <wp:posOffset>2212947</wp:posOffset>
                 </wp:positionV>
                 <wp:extent cx="1242060" cy="249555"/>
                 <wp:effectExtent l="0" t="0" r="0" b="0"/>
@@ -10766,8 +11157,13 @@
                               <w:fldChar w:fldCharType="end"/>
                             </w:r>
                             <w:r>
-                              <w:t xml:space="preserve"> - NavigationLink</w:t>
+                              <w:t xml:space="preserve"> - </w:t>
                             </w:r>
+                            <w:proofErr w:type="spellStart"/>
+                            <w:r>
+                              <w:t>NavigationLink</w:t>
+                            </w:r>
+                            <w:proofErr w:type="spellEnd"/>
                           </w:p>
                         </w:txbxContent>
                       </wps:txbx>
@@ -10791,7 +11187,7 @@
           </mc:Choice>
           <mc:Fallback>
             <w:pict>
-              <v:shape w14:anchorId="0833E42B" id="Casella di testo 32" o:spid="_x0000_s1035" type="#_x0000_t202" style="position:absolute;left:0;text-align:left;margin-left:0;margin-top:161.15pt;width:97.8pt;height:19.65pt;z-index:251687936;visibility:visible;mso-wrap-style:square;mso-width-percent:0;mso-height-percent:0;mso-wrap-distance-left:9pt;mso-wrap-distance-top:0;mso-wrap-distance-right:9pt;mso-wrap-distance-bottom:0;mso-position-horizontal:center;mso-position-horizontal-relative:margin;mso-position-vertical:absolute;mso-position-vertical-relative:text;mso-width-percent:0;mso-height-percent:0;mso-width-relative:margin;mso-height-relative:margin;v-text-anchor:top" o:gfxdata="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" stroked="f">
+              <v:shape w14:anchorId="0833E42B" id="Casella di testo 32" o:spid="_x0000_s1035" type="#_x0000_t202" style="position:absolute;left:0;text-align:left;margin-left:0;margin-top:174.25pt;width:97.8pt;height:19.65pt;z-index:251687936;visibility:visible;mso-wrap-style:square;mso-width-percent:0;mso-height-percent:0;mso-wrap-distance-left:9pt;mso-wrap-distance-top:0;mso-wrap-distance-right:9pt;mso-wrap-distance-bottom:0;mso-position-horizontal:center;mso-position-horizontal-relative:margin;mso-position-vertical:absolute;mso-position-vertical-relative:text;mso-width-percent:0;mso-height-percent:0;mso-width-relative:margin;mso-height-relative:margin;v-text-anchor:top" o:gfxdata="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" stroked="f">
                 <v:textbox inset="0,0,0,0">
                   <w:txbxContent>
                     <w:p>
@@ -10825,8 +11221,13 @@
                         <w:fldChar w:fldCharType="end"/>
                       </w:r>
                       <w:r>
-                        <w:t xml:space="preserve"> - NavigationLink</w:t>
+                        <w:t xml:space="preserve"> - </w:t>
                       </w:r>
+                      <w:proofErr w:type="spellStart"/>
+                      <w:r>
+                        <w:t>NavigationLink</w:t>
+                      </w:r>
+                      <w:proofErr w:type="spellEnd"/>
                     </w:p>
                   </w:txbxContent>
                 </v:textbox>
@@ -10837,17 +11238,20 @@
         </mc:AlternateContent>
       </w:r>
       <w:r>
+        <w:rPr>
+          <w:noProof/>
+        </w:rPr>
         <w:drawing>
-          <wp:anchor distT="0" distB="0" distL="114300" distR="114300" simplePos="0" relativeHeight="251685888" behindDoc="0" locked="0" layoutInCell="1" allowOverlap="1" wp14:anchorId="329344BB" wp14:editId="7CA624B2">
+          <wp:anchor distT="0" distB="0" distL="114300" distR="114300" simplePos="0" relativeHeight="251685888" behindDoc="0" locked="0" layoutInCell="1" allowOverlap="1" wp14:anchorId="329344BB" wp14:editId="7FC01CFA">
             <wp:simplePos x="0" y="0"/>
             <wp:positionH relativeFrom="margin">
               <wp:align>center</wp:align>
             </wp:positionH>
             <wp:positionV relativeFrom="paragraph">
-              <wp:posOffset>571285</wp:posOffset>
+              <wp:posOffset>551153</wp:posOffset>
             </wp:positionV>
-            <wp:extent cx="3224530" cy="1449070"/>
-            <wp:effectExtent l="0" t="0" r="0" b="0"/>
+            <wp:extent cx="3545840" cy="1593215"/>
+            <wp:effectExtent l="0" t="0" r="0" b="6985"/>
             <wp:wrapTopAndBottom/>
             <wp:docPr id="31" name="Immagine 31"/>
             <wp:cNvGraphicFramePr>
@@ -10875,7 +11279,7 @@
                   <pic:spPr>
                     <a:xfrm>
                       <a:off x="0" y="0"/>
-                      <a:ext cx="3224530" cy="1449070"/>
+                      <a:ext cx="3545840" cy="1593215"/>
                     </a:xfrm>
                     <a:prstGeom prst="rect">
                       <a:avLst/>
@@ -10899,77 +11303,1283 @@
     </w:p>
     <w:p>
       <w:r>
-        <w:t>Il pulsante principale è implementato attraverso un NavigationLink che conduce alla schermata successiva (HomeView). L’elemento è stilizzato con bordi arrotondati, ombra e dimensioni personalizzate per renderlo ben visibile e facilmente selezionabile dall’utente.</w:t>
-      </w:r>
-    </w:p>
+        <w:t xml:space="preserve">Il pulsante principale è implementato attraverso un </w:t>
+      </w:r>
+      <w:proofErr w:type="spellStart"/>
+      <w:r>
+        <w:t>NavigationLink</w:t>
+      </w:r>
+      <w:proofErr w:type="spellEnd"/>
+      <w:r>
+        <w:t xml:space="preserve"> che conduce alla schermata successiva (</w:t>
+      </w:r>
+      <w:proofErr w:type="spellStart"/>
+      <w:r>
+        <w:t>HomeView</w:t>
+      </w:r>
+      <w:proofErr w:type="spellEnd"/>
+      <w:r>
+        <w:t>). L’elemento è stilizzato con bordi arrotondati, ombra e dimensioni personalizzate per renderlo ben visibile e facilmente selezionabile dall’utente.</w:t>
+      </w:r>
+    </w:p>
+    <w:p>
+      <w:pPr>
+        <w:pStyle w:val="Titolo3"/>
+        <w:numPr>
+          <w:ilvl w:val="2"/>
+          <w:numId w:val="39"/>
+        </w:numPr>
+      </w:pPr>
+      <w:r>
+        <w:rPr>
+          <w:noProof/>
+        </w:rPr>
+        <mc:AlternateContent>
+          <mc:Choice Requires="wps">
+            <w:drawing>
+              <wp:anchor distT="0" distB="0" distL="114300" distR="114300" simplePos="0" relativeHeight="251697152" behindDoc="0" locked="0" layoutInCell="1" allowOverlap="1" wp14:anchorId="6D3E9D59" wp14:editId="7954B84E">
+                <wp:simplePos x="0" y="0"/>
+                <wp:positionH relativeFrom="margin">
+                  <wp:align>center</wp:align>
+                </wp:positionH>
+                <wp:positionV relativeFrom="paragraph">
+                  <wp:posOffset>5110342</wp:posOffset>
+                </wp:positionV>
+                <wp:extent cx="1287780" cy="635"/>
+                <wp:effectExtent l="0" t="0" r="7620" b="0"/>
+                <wp:wrapTopAndBottom/>
+                <wp:docPr id="15" name="Casella di testo 15"/>
+                <wp:cNvGraphicFramePr/>
+                <a:graphic xmlns:a="http://schemas.openxmlformats.org/drawingml/2006/main">
+                  <a:graphicData uri="http://schemas.microsoft.com/office/word/2010/wordprocessingShape">
+                    <wps:wsp>
+                      <wps:cNvSpPr txBox="1"/>
+                      <wps:spPr>
+                        <a:xfrm>
+                          <a:off x="0" y="0"/>
+                          <a:ext cx="1287780" cy="635"/>
+                        </a:xfrm>
+                        <a:prstGeom prst="rect">
+                          <a:avLst/>
+                        </a:prstGeom>
+                        <a:solidFill>
+                          <a:prstClr val="white"/>
+                        </a:solidFill>
+                        <a:ln>
+                          <a:noFill/>
+                        </a:ln>
+                      </wps:spPr>
+                      <wps:txbx>
+                        <w:txbxContent>
+                          <w:p>
+                            <w:pPr>
+                              <w:pStyle w:val="Didascalia"/>
+                              <w:rPr>
+                                <w:b/>
+                                <w:noProof/>
+                                <w:sz w:val="20"/>
+                                <w:lang w:val="it-IT"/>
+                              </w:rPr>
+                            </w:pPr>
+                            <w:r>
+                              <w:t xml:space="preserve">Figura </w:t>
+                            </w:r>
+                            <w:r>
+                              <w:fldChar w:fldCharType="begin"/>
+                            </w:r>
+                            <w:r>
+                              <w:instrText xml:space="preserve"> SEQ Figura \* ARABIC </w:instrText>
+                            </w:r>
+                            <w:r>
+                              <w:fldChar w:fldCharType="separate"/>
+                            </w:r>
+                            <w:r>
+                              <w:rPr>
+                                <w:noProof/>
+                              </w:rPr>
+                              <w:t>12</w:t>
+                            </w:r>
+                            <w:r>
+                              <w:fldChar w:fldCharType="end"/>
+                            </w:r>
+                            <w:r>
+                              <w:t xml:space="preserve"> - Pagina iniziale</w:t>
+                            </w:r>
+                          </w:p>
+                        </w:txbxContent>
+                      </wps:txbx>
+                      <wps:bodyPr rot="0" spcFirstLastPara="0" vertOverflow="overflow" horzOverflow="overflow" vert="horz" wrap="square" lIns="0" tIns="0" rIns="0" bIns="0" numCol="1" spcCol="0" rtlCol="0" fromWordArt="0" anchor="t" anchorCtr="0" forceAA="0" compatLnSpc="1">
+                        <a:prstTxWarp prst="textNoShape">
+                          <a:avLst/>
+                        </a:prstTxWarp>
+                        <a:spAutoFit/>
+                      </wps:bodyPr>
+                    </wps:wsp>
+                  </a:graphicData>
+                </a:graphic>
+                <wp14:sizeRelH relativeFrom="margin">
+                  <wp14:pctWidth>0</wp14:pctWidth>
+                </wp14:sizeRelH>
+              </wp:anchor>
+            </w:drawing>
+          </mc:Choice>
+          <mc:Fallback>
+            <w:pict>
+              <v:shape w14:anchorId="6D3E9D59" id="Casella di testo 15" o:spid="_x0000_s1036" type="#_x0000_t202" style="position:absolute;left:0;text-align:left;margin-left:0;margin-top:402.4pt;width:101.4pt;height:.05pt;z-index:251697152;visibility:visible;mso-wrap-style:square;mso-width-percent:0;mso-wrap-distance-left:9pt;mso-wrap-distance-top:0;mso-wrap-distance-right:9pt;mso-wrap-distance-bottom:0;mso-position-horizontal:center;mso-position-horizontal-relative:margin;mso-position-vertical:absolute;mso-position-vertical-relative:text;mso-width-percent:0;mso-width-relative:margin;v-text-anchor:top" o:gfxdata="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" stroked="f">
+                <v:textbox style="mso-fit-shape-to-text:t" inset="0,0,0,0">
+                  <w:txbxContent>
+                    <w:p>
+                      <w:pPr>
+                        <w:pStyle w:val="Didascalia"/>
+                        <w:rPr>
+                          <w:b/>
+                          <w:noProof/>
+                          <w:sz w:val="20"/>
+                          <w:lang w:val="it-IT"/>
+                        </w:rPr>
+                      </w:pPr>
+                      <w:r>
+                        <w:t xml:space="preserve">Figura </w:t>
+                      </w:r>
+                      <w:r>
+                        <w:fldChar w:fldCharType="begin"/>
+                      </w:r>
+                      <w:r>
+                        <w:instrText xml:space="preserve"> SEQ Figura \* ARABIC </w:instrText>
+                      </w:r>
+                      <w:r>
+                        <w:fldChar w:fldCharType="separate"/>
+                      </w:r>
+                      <w:r>
+                        <w:rPr>
+                          <w:noProof/>
+                        </w:rPr>
+                        <w:t>12</w:t>
+                      </w:r>
+                      <w:r>
+                        <w:fldChar w:fldCharType="end"/>
+                      </w:r>
+                      <w:r>
+                        <w:t xml:space="preserve"> - Pagina iniziale</w:t>
+                      </w:r>
+                    </w:p>
+                  </w:txbxContent>
+                </v:textbox>
+                <w10:wrap type="topAndBottom" anchorx="margin"/>
+              </v:shape>
+            </w:pict>
+          </mc:Fallback>
+        </mc:AlternateContent>
+      </w:r>
+      <w:r>
+        <w:rPr>
+          <w:noProof/>
+        </w:rPr>
+        <w:drawing>
+          <wp:anchor distT="0" distB="0" distL="114300" distR="114300" simplePos="0" relativeHeight="251695104" behindDoc="0" locked="0" layoutInCell="1" allowOverlap="1" wp14:anchorId="36C91048" wp14:editId="42829658">
+            <wp:simplePos x="0" y="0"/>
+            <wp:positionH relativeFrom="margin">
+              <wp:align>center</wp:align>
+            </wp:positionH>
+            <wp:positionV relativeFrom="paragraph">
+              <wp:posOffset>485610</wp:posOffset>
+            </wp:positionV>
+            <wp:extent cx="3648075" cy="4563745"/>
+            <wp:effectExtent l="0" t="0" r="9525" b="8255"/>
+            <wp:wrapTopAndBottom/>
+            <wp:docPr id="14" name="Immagine 14"/>
+            <wp:cNvGraphicFramePr>
+              <a:graphicFrameLocks xmlns:a="http://schemas.openxmlformats.org/drawingml/2006/main" noChangeAspect="1"/>
+            </wp:cNvGraphicFramePr>
+            <a:graphic xmlns:a="http://schemas.openxmlformats.org/drawingml/2006/main">
+              <a:graphicData uri="http://schemas.openxmlformats.org/drawingml/2006/picture">
+                <pic:pic xmlns:pic="http://schemas.openxmlformats.org/drawingml/2006/picture">
+                  <pic:nvPicPr>
+                    <pic:cNvPr id="0" name="Picture 1"/>
+                    <pic:cNvPicPr>
+                      <a:picLocks noChangeAspect="1" noChangeArrowheads="1"/>
+                    </pic:cNvPicPr>
+                  </pic:nvPicPr>
+                  <pic:blipFill>
+                    <a:blip r:embed="rId19" cstate="print">
+                      <a:extLst>
+                        <a:ext uri="{28A0092B-C50C-407E-A947-70E740481C1C}">
+                          <a14:useLocalDpi xmlns:a14="http://schemas.microsoft.com/office/drawing/2010/main" val="0"/>
+                        </a:ext>
+                      </a:extLst>
+                    </a:blip>
+                    <a:srcRect/>
+                    <a:stretch>
+                      <a:fillRect/>
+                    </a:stretch>
+                  </pic:blipFill>
+                  <pic:spPr bwMode="auto">
+                    <a:xfrm>
+                      <a:off x="0" y="0"/>
+                      <a:ext cx="3648075" cy="4563745"/>
+                    </a:xfrm>
+                    <a:prstGeom prst="rect">
+                      <a:avLst/>
+                    </a:prstGeom>
+                    <a:noFill/>
+                    <a:ln>
+                      <a:noFill/>
+                    </a:ln>
+                  </pic:spPr>
+                </pic:pic>
+              </a:graphicData>
+            </a:graphic>
+            <wp14:sizeRelH relativeFrom="margin">
+              <wp14:pctWidth>0</wp14:pctWidth>
+            </wp14:sizeRelH>
+            <wp14:sizeRelV relativeFrom="margin">
+              <wp14:pctHeight>0</wp14:pctHeight>
+            </wp14:sizeRelV>
+          </wp:anchor>
+        </w:drawing>
+      </w:r>
+      <w:r>
+        <w:t>Interfaccia</w:t>
+      </w:r>
+    </w:p>
+    <w:p>
+      <w:pPr>
+        <w:rPr>
+          <w:lang w:val="it-IT"/>
+        </w:rPr>
+      </w:pPr>
+      <w:r>
+        <w:rPr>
+          <w:rFonts w:cs="Arial"/>
+          <w:lang w:eastAsia="it-CH"/>
+        </w:rPr>
+        <w:t xml:space="preserve">La </w:t>
+      </w:r>
+      <w:proofErr w:type="spellStart"/>
+      <w:r>
+        <w:rPr>
+          <w:rFonts w:cs="Arial"/>
+          <w:lang w:eastAsia="it-CH"/>
+        </w:rPr>
+        <w:t>ContentView</w:t>
+      </w:r>
+      <w:proofErr w:type="spellEnd"/>
+      <w:r>
+        <w:rPr>
+          <w:rFonts w:cs="Arial"/>
+          <w:lang w:eastAsia="it-CH"/>
+        </w:rPr>
+        <w:t xml:space="preserve"> ha permesso di creare la pagina iniziale; grazie ai suoi metodi e alla struttura modulare di </w:t>
+      </w:r>
+      <w:proofErr w:type="spellStart"/>
+      <w:r>
+        <w:rPr>
+          <w:rFonts w:cs="Arial"/>
+          <w:lang w:eastAsia="it-CH"/>
+        </w:rPr>
+        <w:t>SwiftUI</w:t>
+      </w:r>
+      <w:proofErr w:type="spellEnd"/>
+      <w:r>
+        <w:rPr>
+          <w:rFonts w:cs="Arial"/>
+          <w:lang w:eastAsia="it-CH"/>
+        </w:rPr>
+        <w:t xml:space="preserve">, è stato possibile definire l’aspetto e il comportamento dell’interfaccia in modo chiaro e </w:t>
+      </w:r>
+      <w:r>
+        <w:rPr>
+          <w:rFonts w:cs="Arial"/>
+          <w:lang w:eastAsia="it-CH"/>
+        </w:rPr>
+        <w:lastRenderedPageBreak/>
+        <w:t>personalizzato. Questa schermata rappresenta il punto di ingresso dell’applicazione e svolge un ruolo fondamentale nell’esperienza utente, poiché introduce la navigazione verso le diverse sezioni disponibili.</w:t>
+      </w:r>
+    </w:p>
+    <w:p/>
     <w:p>
       <w:pPr>
         <w:pStyle w:val="Titolo2"/>
-      </w:pPr>
+        <w:numPr>
+          <w:ilvl w:val="2"/>
+          <w:numId w:val="40"/>
+        </w:numPr>
+      </w:pPr>
+      <w:proofErr w:type="spellStart"/>
+      <w:r>
+        <w:t>HomeView.swift</w:t>
+      </w:r>
+      <w:proofErr w:type="spellEnd"/>
+    </w:p>
+    <w:p>
+      <w:proofErr w:type="spellStart"/>
       <w:r>
         <w:t>HomeView</w:t>
       </w:r>
-      <w:r>
-        <w:t>.swift</w:t>
-      </w:r>
-    </w:p>
-    <w:p>
-      <w:r>
-        <w:t xml:space="preserve">HomeView rappresenta la pagina principale dell’applicazione e permette all’utente di interagire con una rappresentazione simulata del Sistema Solare. La schermata mostra il Sole al centro e i pianeti disposti su orbite animate. Ogni pianeta può essere selezionato tramite un NavigationLink, che conduce alla pagina informativa dedicata. L’interfaccia supporta anche un gesto di zoom: se il valore di ingrandimento scende </w:t>
-      </w:r>
-      <w:r>
+      <w:proofErr w:type="spellEnd"/>
+      <w:r>
+        <w:t xml:space="preserve"> rappresenta la pagina principale dell’applicazione e permette all’utente di interagire con una rappresentazione simulata del Sistema Solare. La schermata mostra il Sole al centro e i pianeti disposti su orbite animate. Ogni pianeta può essere selezionato tramite un </w:t>
+      </w:r>
+      <w:proofErr w:type="spellStart"/>
+      <w:r>
+        <w:t>NavigationLink</w:t>
+      </w:r>
+      <w:proofErr w:type="spellEnd"/>
+      <w:r>
+        <w:t xml:space="preserve">, che conduce alla pagina informativa dedicata. L’interfaccia supporta anche un gesto di zoom: se il valore di ingrandimento scende sotto una soglia predefinita, la rappresentazione del Sistema Solare si trasforma in una vista più ampia della Via Lattea. La schermata include inoltre un accesso diretto alla pagina della Luna e una toolbar che consente la navigazione verso la funzionalità "Information of the day" collegata a un’API NASA. La struttura della </w:t>
+      </w:r>
+      <w:proofErr w:type="spellStart"/>
+      <w:r>
+        <w:t>view</w:t>
+      </w:r>
+      <w:proofErr w:type="spellEnd"/>
+      <w:r>
+        <w:t xml:space="preserve"> combina componenti statici (immagini e layout) con elementi dinamici e interattivi, rendendo la pagina sia esplorativa che informativa.</w:t>
+      </w:r>
+    </w:p>
+    <w:p>
+      <w:pPr>
+        <w:pStyle w:val="Titolo3"/>
+        <w:numPr>
+          <w:ilvl w:val="2"/>
+          <w:numId w:val="40"/>
+        </w:numPr>
+      </w:pPr>
+      <w:r>
+        <w:rPr>
+          <w:noProof/>
+        </w:rPr>
+        <mc:AlternateContent>
+          <mc:Choice Requires="wps">
+            <w:drawing>
+              <wp:anchor distT="0" distB="0" distL="114300" distR="114300" simplePos="0" relativeHeight="251691008" behindDoc="0" locked="0" layoutInCell="1" allowOverlap="1" wp14:anchorId="3FDD7072" wp14:editId="2736C5AB">
+                <wp:simplePos x="0" y="0"/>
+                <wp:positionH relativeFrom="margin">
+                  <wp:align>center</wp:align>
+                </wp:positionH>
+                <wp:positionV relativeFrom="paragraph">
+                  <wp:posOffset>2148039</wp:posOffset>
+                </wp:positionV>
+                <wp:extent cx="1446530" cy="246380"/>
+                <wp:effectExtent l="0" t="0" r="1270" b="1270"/>
+                <wp:wrapTopAndBottom/>
+                <wp:docPr id="6" name="Casella di testo 6"/>
+                <wp:cNvGraphicFramePr/>
+                <a:graphic xmlns:a="http://schemas.openxmlformats.org/drawingml/2006/main">
+                  <a:graphicData uri="http://schemas.microsoft.com/office/word/2010/wordprocessingShape">
+                    <wps:wsp>
+                      <wps:cNvSpPr txBox="1"/>
+                      <wps:spPr>
+                        <a:xfrm>
+                          <a:off x="0" y="0"/>
+                          <a:ext cx="1446530" cy="246380"/>
+                        </a:xfrm>
+                        <a:prstGeom prst="rect">
+                          <a:avLst/>
+                        </a:prstGeom>
+                        <a:solidFill>
+                          <a:prstClr val="white"/>
+                        </a:solidFill>
+                        <a:ln>
+                          <a:noFill/>
+                        </a:ln>
+                      </wps:spPr>
+                      <wps:txbx>
+                        <w:txbxContent>
+                          <w:p>
+                            <w:pPr>
+                              <w:pStyle w:val="Didascalia"/>
+                              <w:rPr>
+                                <w:sz w:val="20"/>
+                              </w:rPr>
+                            </w:pPr>
+                            <w:r>
+                              <w:t xml:space="preserve">Figura </w:t>
+                            </w:r>
+                            <w:r>
+                              <w:fldChar w:fldCharType="begin"/>
+                            </w:r>
+                            <w:r>
+                              <w:instrText xml:space="preserve"> SEQ Figura \* ARABIC </w:instrText>
+                            </w:r>
+                            <w:r>
+                              <w:fldChar w:fldCharType="separate"/>
+                            </w:r>
+                            <w:r>
+                              <w:rPr>
+                                <w:noProof/>
+                              </w:rPr>
+                              <w:t>13</w:t>
+                            </w:r>
+                            <w:r>
+                              <w:fldChar w:fldCharType="end"/>
+                            </w:r>
+                            <w:r>
+                              <w:t xml:space="preserve"> - Pianeti che ruotano</w:t>
+                            </w:r>
+                          </w:p>
+                        </w:txbxContent>
+                      </wps:txbx>
+                      <wps:bodyPr rot="0" spcFirstLastPara="0" vertOverflow="overflow" horzOverflow="overflow" vert="horz" wrap="square" lIns="0" tIns="0" rIns="0" bIns="0" numCol="1" spcCol="0" rtlCol="0" fromWordArt="0" anchor="t" anchorCtr="0" forceAA="0" compatLnSpc="1">
+                        <a:prstTxWarp prst="textNoShape">
+                          <a:avLst/>
+                        </a:prstTxWarp>
+                        <a:noAutofit/>
+                      </wps:bodyPr>
+                    </wps:wsp>
+                  </a:graphicData>
+                </a:graphic>
+                <wp14:sizeRelH relativeFrom="margin">
+                  <wp14:pctWidth>0</wp14:pctWidth>
+                </wp14:sizeRelH>
+                <wp14:sizeRelV relativeFrom="margin">
+                  <wp14:pctHeight>0</wp14:pctHeight>
+                </wp14:sizeRelV>
+              </wp:anchor>
+            </w:drawing>
+          </mc:Choice>
+          <mc:Fallback>
+            <w:pict>
+              <v:shape w14:anchorId="3FDD7072" id="Casella di testo 6" o:spid="_x0000_s1037" type="#_x0000_t202" style="position:absolute;left:0;text-align:left;margin-left:0;margin-top:169.15pt;width:113.9pt;height:19.4pt;z-index:251691008;visibility:visible;mso-wrap-style:square;mso-width-percent:0;mso-height-percent:0;mso-wrap-distance-left:9pt;mso-wrap-distance-top:0;mso-wrap-distance-right:9pt;mso-wrap-distance-bottom:0;mso-position-horizontal:center;mso-position-horizontal-relative:margin;mso-position-vertical:absolute;mso-position-vertical-relative:text;mso-width-percent:0;mso-height-percent:0;mso-width-relative:margin;mso-height-relative:margin;v-text-anchor:top" o:gfxdata="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" stroked="f">
+                <v:textbox inset="0,0,0,0">
+                  <w:txbxContent>
+                    <w:p>
+                      <w:pPr>
+                        <w:pStyle w:val="Didascalia"/>
+                        <w:rPr>
+                          <w:sz w:val="20"/>
+                        </w:rPr>
+                      </w:pPr>
+                      <w:r>
+                        <w:t xml:space="preserve">Figura </w:t>
+                      </w:r>
+                      <w:r>
+                        <w:fldChar w:fldCharType="begin"/>
+                      </w:r>
+                      <w:r>
+                        <w:instrText xml:space="preserve"> SEQ Figura \* ARABIC </w:instrText>
+                      </w:r>
+                      <w:r>
+                        <w:fldChar w:fldCharType="separate"/>
+                      </w:r>
+                      <w:r>
+                        <w:rPr>
+                          <w:noProof/>
+                        </w:rPr>
+                        <w:t>13</w:t>
+                      </w:r>
+                      <w:r>
+                        <w:fldChar w:fldCharType="end"/>
+                      </w:r>
+                      <w:r>
+                        <w:t xml:space="preserve"> - Pianeti che ruotano</w:t>
+                      </w:r>
+                    </w:p>
+                  </w:txbxContent>
+                </v:textbox>
+                <w10:wrap type="topAndBottom" anchorx="margin"/>
+              </v:shape>
+            </w:pict>
+          </mc:Fallback>
+        </mc:AlternateContent>
+      </w:r>
+      <w:r>
+        <w:rPr>
+          <w:noProof/>
+        </w:rPr>
+        <w:drawing>
+          <wp:anchor distT="0" distB="0" distL="114300" distR="114300" simplePos="0" relativeHeight="251688960" behindDoc="0" locked="0" layoutInCell="1" allowOverlap="1" wp14:anchorId="2BB60A77" wp14:editId="37A49095">
+            <wp:simplePos x="0" y="0"/>
+            <wp:positionH relativeFrom="margin">
+              <wp:align>center</wp:align>
+            </wp:positionH>
+            <wp:positionV relativeFrom="paragraph">
+              <wp:posOffset>549910</wp:posOffset>
+            </wp:positionV>
+            <wp:extent cx="4452620" cy="1550035"/>
+            <wp:effectExtent l="0" t="0" r="5080" b="0"/>
+            <wp:wrapTopAndBottom/>
+            <wp:docPr id="4" name="Immagine 4"/>
+            <wp:cNvGraphicFramePr>
+              <a:graphicFrameLocks xmlns:a="http://schemas.openxmlformats.org/drawingml/2006/main" noChangeAspect="1"/>
+            </wp:cNvGraphicFramePr>
+            <a:graphic xmlns:a="http://schemas.openxmlformats.org/drawingml/2006/main">
+              <a:graphicData uri="http://schemas.openxmlformats.org/drawingml/2006/picture">
+                <pic:pic xmlns:pic="http://schemas.openxmlformats.org/drawingml/2006/picture">
+                  <pic:nvPicPr>
+                    <pic:cNvPr id="1" name=""/>
+                    <pic:cNvPicPr/>
+                  </pic:nvPicPr>
+                  <pic:blipFill>
+                    <a:blip r:embed="rId20">
+                      <a:extLst>
+                        <a:ext uri="{28A0092B-C50C-407E-A947-70E740481C1C}">
+                          <a14:useLocalDpi xmlns:a14="http://schemas.microsoft.com/office/drawing/2010/main" val="0"/>
+                        </a:ext>
+                      </a:extLst>
+                    </a:blip>
+                    <a:stretch>
+                      <a:fillRect/>
+                    </a:stretch>
+                  </pic:blipFill>
+                  <pic:spPr>
+                    <a:xfrm>
+                      <a:off x="0" y="0"/>
+                      <a:ext cx="4452620" cy="1550035"/>
+                    </a:xfrm>
+                    <a:prstGeom prst="rect">
+                      <a:avLst/>
+                    </a:prstGeom>
+                  </pic:spPr>
+                </pic:pic>
+              </a:graphicData>
+            </a:graphic>
+            <wp14:sizeRelH relativeFrom="margin">
+              <wp14:pctWidth>0</wp14:pctWidth>
+            </wp14:sizeRelH>
+            <wp14:sizeRelV relativeFrom="margin">
+              <wp14:pctHeight>0</wp14:pctHeight>
+            </wp14:sizeRelV>
+          </wp:anchor>
+        </w:drawing>
+      </w:r>
+      <w:r>
+        <w:t>Codice significativo</w:t>
+      </w:r>
+    </w:p>
+    <w:p>
+      <w:r>
+        <w:t>Questo blocco di codice crea una lista dinamica di pianeti basata sui dati forniti.</w:t>
+      </w:r>
+      <w:r>
+        <w:br/>
+        <w:t xml:space="preserve">Ogni elemento viene verificato contro un array di informazioni orbitali e, se disponibile, viene mostrato all'interno di un </w:t>
+      </w:r>
+      <w:proofErr w:type="spellStart"/>
+      <w:r>
+        <w:t>NavigationLink</w:t>
+      </w:r>
+      <w:proofErr w:type="spellEnd"/>
+      <w:r>
+        <w:t xml:space="preserve">. Toccando un pianeta, l'utente accede alla schermata di dettaglio corrispondente. La vista del pianeta viene </w:t>
+      </w:r>
+      <w:proofErr w:type="spellStart"/>
+      <w:r>
+        <w:t>renderizzata</w:t>
+      </w:r>
+      <w:proofErr w:type="spellEnd"/>
+      <w:r>
+        <w:t xml:space="preserve"> tramite </w:t>
+      </w:r>
+      <w:proofErr w:type="spellStart"/>
+      <w:r>
+        <w:t>PlanetView</w:t>
+      </w:r>
+      <w:proofErr w:type="spellEnd"/>
+      <w:r>
+        <w:t xml:space="preserve">, alla quale vengono passati i valori orbitali estratti dall'array </w:t>
+      </w:r>
+      <w:proofErr w:type="spellStart"/>
+      <w:r>
+        <w:t>orbitals</w:t>
+      </w:r>
+      <w:proofErr w:type="spellEnd"/>
+      <w:r>
+        <w:t xml:space="preserve">. Il bottone utilizza </w:t>
+      </w:r>
+      <w:proofErr w:type="spellStart"/>
+      <w:proofErr w:type="gramStart"/>
+      <w:r>
+        <w:t>PlainButtonStyle</w:t>
+      </w:r>
+      <w:proofErr w:type="spellEnd"/>
+      <w:r>
+        <w:t>(</w:t>
+      </w:r>
+      <w:proofErr w:type="gramEnd"/>
+      <w:r>
+        <w:t>) per rimuovere lo stile standard e mantenere l'aspetto personalizzato.</w:t>
+      </w:r>
+    </w:p>
+    <w:p>
+      <w:pPr>
+        <w:pStyle w:val="Titolo3"/>
+        <w:numPr>
+          <w:ilvl w:val="2"/>
+          <w:numId w:val="40"/>
+        </w:numPr>
+      </w:pPr>
+      <w:r>
+        <w:rPr>
+          <w:noProof/>
+        </w:rPr>
         <w:lastRenderedPageBreak/>
-        <w:t>sotto una soglia predefinita, la rappresentazione del Sistema Solare si trasforma in una vista più ampia della Via Lattea. La schermata include inoltre un accesso diretto alla pagina della Luna e una toolbar che consente la navigazione verso la funzionalità "Information of the day" collegata a un’API NASA. La struttura della view combina componenti statici (immagini e layout) con elementi dinamici e interattivi, rendendo la pagina sia esplorativa che informativa.</w:t>
-      </w:r>
-    </w:p>
+        <w:drawing>
+          <wp:anchor distT="0" distB="0" distL="114300" distR="114300" simplePos="0" relativeHeight="251698176" behindDoc="0" locked="0" layoutInCell="1" allowOverlap="1" wp14:anchorId="2EF2F612" wp14:editId="6761D95D">
+            <wp:simplePos x="0" y="0"/>
+            <wp:positionH relativeFrom="margin">
+              <wp:align>center</wp:align>
+            </wp:positionH>
+            <wp:positionV relativeFrom="paragraph">
+              <wp:posOffset>250025</wp:posOffset>
+            </wp:positionV>
+            <wp:extent cx="3696970" cy="4624070"/>
+            <wp:effectExtent l="0" t="0" r="0" b="5080"/>
+            <wp:wrapTopAndBottom/>
+            <wp:docPr id="16" name="Immagine 16"/>
+            <wp:cNvGraphicFramePr>
+              <a:graphicFrameLocks xmlns:a="http://schemas.openxmlformats.org/drawingml/2006/main" noChangeAspect="1"/>
+            </wp:cNvGraphicFramePr>
+            <a:graphic xmlns:a="http://schemas.openxmlformats.org/drawingml/2006/main">
+              <a:graphicData uri="http://schemas.openxmlformats.org/drawingml/2006/picture">
+                <pic:pic xmlns:pic="http://schemas.openxmlformats.org/drawingml/2006/picture">
+                  <pic:nvPicPr>
+                    <pic:cNvPr id="16" name="Immagine 16"/>
+                    <pic:cNvPicPr>
+                      <a:picLocks noChangeAspect="1" noChangeArrowheads="1"/>
+                    </pic:cNvPicPr>
+                  </pic:nvPicPr>
+                  <pic:blipFill>
+                    <a:blip r:embed="rId21" cstate="print">
+                      <a:extLst>
+                        <a:ext uri="{28A0092B-C50C-407E-A947-70E740481C1C}">
+                          <a14:useLocalDpi xmlns:a14="http://schemas.microsoft.com/office/drawing/2010/main" val="0"/>
+                        </a:ext>
+                      </a:extLst>
+                    </a:blip>
+                    <a:stretch>
+                      <a:fillRect/>
+                    </a:stretch>
+                  </pic:blipFill>
+                  <pic:spPr bwMode="auto">
+                    <a:xfrm>
+                      <a:off x="0" y="0"/>
+                      <a:ext cx="3696970" cy="4624345"/>
+                    </a:xfrm>
+                    <a:prstGeom prst="rect">
+                      <a:avLst/>
+                    </a:prstGeom>
+                    <a:noFill/>
+                    <a:ln>
+                      <a:noFill/>
+                    </a:ln>
+                  </pic:spPr>
+                </pic:pic>
+              </a:graphicData>
+            </a:graphic>
+            <wp14:sizeRelH relativeFrom="margin">
+              <wp14:pctWidth>0</wp14:pctWidth>
+            </wp14:sizeRelH>
+            <wp14:sizeRelV relativeFrom="margin">
+              <wp14:pctHeight>0</wp14:pctHeight>
+            </wp14:sizeRelV>
+          </wp:anchor>
+        </w:drawing>
+      </w:r>
+      <w:r>
+        <w:rPr>
+          <w:noProof/>
+        </w:rPr>
+        <mc:AlternateContent>
+          <mc:Choice Requires="wps">
+            <w:drawing>
+              <wp:anchor distT="0" distB="0" distL="114300" distR="114300" simplePos="0" relativeHeight="251700224" behindDoc="0" locked="0" layoutInCell="1" allowOverlap="1" wp14:anchorId="2A06E08C" wp14:editId="282EEDAE">
+                <wp:simplePos x="0" y="0"/>
+                <wp:positionH relativeFrom="margin">
+                  <wp:align>center</wp:align>
+                </wp:positionH>
+                <wp:positionV relativeFrom="paragraph">
+                  <wp:posOffset>4875972</wp:posOffset>
+                </wp:positionV>
+                <wp:extent cx="1303655" cy="278130"/>
+                <wp:effectExtent l="0" t="0" r="0" b="7620"/>
+                <wp:wrapTopAndBottom/>
+                <wp:docPr id="19" name="Casella di testo 19"/>
+                <wp:cNvGraphicFramePr/>
+                <a:graphic xmlns:a="http://schemas.openxmlformats.org/drawingml/2006/main">
+                  <a:graphicData uri="http://schemas.microsoft.com/office/word/2010/wordprocessingShape">
+                    <wps:wsp>
+                      <wps:cNvSpPr txBox="1"/>
+                      <wps:spPr>
+                        <a:xfrm>
+                          <a:off x="0" y="0"/>
+                          <a:ext cx="1303655" cy="278130"/>
+                        </a:xfrm>
+                        <a:prstGeom prst="rect">
+                          <a:avLst/>
+                        </a:prstGeom>
+                        <a:solidFill>
+                          <a:prstClr val="white"/>
+                        </a:solidFill>
+                        <a:ln>
+                          <a:noFill/>
+                        </a:ln>
+                      </wps:spPr>
+                      <wps:txbx>
+                        <w:txbxContent>
+                          <w:p>
+                            <w:pPr>
+                              <w:pStyle w:val="Didascalia"/>
+                              <w:rPr>
+                                <w:b/>
+                                <w:noProof/>
+                                <w:sz w:val="20"/>
+                                <w:lang w:val="it-IT"/>
+                              </w:rPr>
+                            </w:pPr>
+                            <w:r>
+                              <w:t xml:space="preserve">Figura </w:t>
+                            </w:r>
+                            <w:r>
+                              <w:fldChar w:fldCharType="begin"/>
+                            </w:r>
+                            <w:r>
+                              <w:instrText xml:space="preserve"> SEQ Figura \* ARABIC </w:instrText>
+                            </w:r>
+                            <w:r>
+                              <w:fldChar w:fldCharType="separate"/>
+                            </w:r>
+                            <w:r>
+                              <w:rPr>
+                                <w:noProof/>
+                              </w:rPr>
+                              <w:t>14</w:t>
+                            </w:r>
+                            <w:r>
+                              <w:fldChar w:fldCharType="end"/>
+                            </w:r>
+                            <w:r>
+                              <w:t xml:space="preserve"> - Sistema Solare</w:t>
+                            </w:r>
+                          </w:p>
+                        </w:txbxContent>
+                      </wps:txbx>
+                      <wps:bodyPr rot="0" spcFirstLastPara="0" vertOverflow="overflow" horzOverflow="overflow" vert="horz" wrap="square" lIns="0" tIns="0" rIns="0" bIns="0" numCol="1" spcCol="0" rtlCol="0" fromWordArt="0" anchor="t" anchorCtr="0" forceAA="0" compatLnSpc="1">
+                        <a:prstTxWarp prst="textNoShape">
+                          <a:avLst/>
+                        </a:prstTxWarp>
+                        <a:noAutofit/>
+                      </wps:bodyPr>
+                    </wps:wsp>
+                  </a:graphicData>
+                </a:graphic>
+                <wp14:sizeRelH relativeFrom="margin">
+                  <wp14:pctWidth>0</wp14:pctWidth>
+                </wp14:sizeRelH>
+                <wp14:sizeRelV relativeFrom="margin">
+                  <wp14:pctHeight>0</wp14:pctHeight>
+                </wp14:sizeRelV>
+              </wp:anchor>
+            </w:drawing>
+          </mc:Choice>
+          <mc:Fallback>
+            <w:pict>
+              <v:shapetype w14:anchorId="2A06E08C" id="_x0000_t202" coordsize="21600,21600" o:spt="202" path="m,l,21600r21600,l21600,xe">
+                <v:stroke joinstyle="miter"/>
+                <v:path gradientshapeok="t" o:connecttype="rect"/>
+              </v:shapetype>
+              <v:shape id="Casella di testo 19" o:spid="_x0000_s1038" type="#_x0000_t202" style="position:absolute;left:0;text-align:left;margin-left:0;margin-top:383.95pt;width:102.65pt;height:21.9pt;z-index:251700224;visibility:visible;mso-wrap-style:square;mso-width-percent:0;mso-height-percent:0;mso-wrap-distance-left:9pt;mso-wrap-distance-top:0;mso-wrap-distance-right:9pt;mso-wrap-distance-bottom:0;mso-position-horizontal:center;mso-position-horizontal-relative:margin;mso-position-vertical:absolute;mso-position-vertical-relative:text;mso-width-percent:0;mso-height-percent:0;mso-width-relative:margin;mso-height-relative:margin;v-text-anchor:top" o:gfxdata="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" stroked="f">
+                <v:textbox inset="0,0,0,0">
+                  <w:txbxContent>
+                    <w:p>
+                      <w:pPr>
+                        <w:pStyle w:val="Didascalia"/>
+                        <w:rPr>
+                          <w:b/>
+                          <w:noProof/>
+                          <w:sz w:val="20"/>
+                          <w:lang w:val="it-IT"/>
+                        </w:rPr>
+                      </w:pPr>
+                      <w:r>
+                        <w:t xml:space="preserve">Figura </w:t>
+                      </w:r>
+                      <w:r>
+                        <w:fldChar w:fldCharType="begin"/>
+                      </w:r>
+                      <w:r>
+                        <w:instrText xml:space="preserve"> SEQ Figura \* ARABIC </w:instrText>
+                      </w:r>
+                      <w:r>
+                        <w:fldChar w:fldCharType="separate"/>
+                      </w:r>
+                      <w:r>
+                        <w:rPr>
+                          <w:noProof/>
+                        </w:rPr>
+                        <w:t>14</w:t>
+                      </w:r>
+                      <w:r>
+                        <w:fldChar w:fldCharType="end"/>
+                      </w:r>
+                      <w:r>
+                        <w:t xml:space="preserve"> - Sistema Solare</w:t>
+                      </w:r>
+                    </w:p>
+                  </w:txbxContent>
+                </v:textbox>
+                <w10:wrap type="topAndBottom" anchorx="margin"/>
+              </v:shape>
+            </w:pict>
+          </mc:Fallback>
+        </mc:AlternateContent>
+      </w:r>
+      <w:r>
+        <w:t>Interfaccia</w:t>
+      </w:r>
+    </w:p>
+    <w:p>
+      <w:pPr>
+        <w:pStyle w:val="NormaleWeb"/>
+        <w:ind w:left="435"/>
+      </w:pPr>
+    </w:p>
+    <w:p>
+      <w:pPr>
+        <w:rPr>
+          <w:lang w:val="it-IT"/>
+        </w:rPr>
+      </w:pPr>
+    </w:p>
+    <w:p/>
     <w:p>
       <w:pPr>
         <w:pStyle w:val="Titolo2"/>
-      </w:pPr>
-      <w:r>
-        <w:t>Info</w:t>
-      </w:r>
-      <w:r>
-        <w:t>View.swift</w:t>
-      </w:r>
-    </w:p>
-    <w:p>
-      <w:pPr>
-        <w:rPr>
-          <w:lang w:val="it-IT"/>
-        </w:rPr>
-      </w:pPr>
-      <w:r>
-        <w:t>InfoView è la schermata dedicata alla funzione "Curiosità del giorno". Essa utilizza un modello architetturale basato su MVVM, dove APODViewModel gestisce la richiesta della risorsa APOD (Astronomy Picture of the Day) fornita dalla NASA tramite API REST. La view effettua la chiamata automaticamente all'apparizione della schermata (onAppear) e mostra dinamicamente il contenuto ricevuto, includendo immagine, titolo e descrizione. La UI è progettata per gestire correttamente stati di caricamento, errori di rete e visualizzazione remota di immagini tramite AsyncImage. Questa funzionalità arricchisce l’app con contenuti aggiornati e scientificamente verificati, migliorando l’esperienza didattica e interattiva dell’utente.</w:t>
+        <w:numPr>
+          <w:ilvl w:val="2"/>
+          <w:numId w:val="42"/>
+        </w:numPr>
+      </w:pPr>
+      <w:proofErr w:type="spellStart"/>
+      <w:r>
+        <w:t>InfoView.swift</w:t>
+      </w:r>
+      <w:proofErr w:type="spellEnd"/>
+    </w:p>
+    <w:p>
+      <w:pPr>
+        <w:rPr>
+          <w:lang w:val="it-IT"/>
+        </w:rPr>
+      </w:pPr>
+      <w:proofErr w:type="spellStart"/>
+      <w:r>
+        <w:t>InfoView</w:t>
+      </w:r>
+      <w:proofErr w:type="spellEnd"/>
+      <w:r>
+        <w:t xml:space="preserve"> è la schermata dedicata alla funzione "Curiosità del giorno". Essa utilizza un modello architetturale basato su MVVM, dove </w:t>
+      </w:r>
+      <w:proofErr w:type="spellStart"/>
+      <w:r>
+        <w:t>APODViewModel</w:t>
+      </w:r>
+      <w:proofErr w:type="spellEnd"/>
+      <w:r>
+        <w:t xml:space="preserve"> gestisce la richiesta della risorsa APOD (</w:t>
+      </w:r>
+      <w:proofErr w:type="spellStart"/>
+      <w:r>
+        <w:t>Astronomy</w:t>
+      </w:r>
+      <w:proofErr w:type="spellEnd"/>
+      <w:r>
+        <w:t xml:space="preserve"> Picture of the Day) fornita dalla NASA tramite API REST. La </w:t>
+      </w:r>
+      <w:proofErr w:type="spellStart"/>
+      <w:r>
+        <w:t>view</w:t>
+      </w:r>
+      <w:proofErr w:type="spellEnd"/>
+      <w:r>
+        <w:t xml:space="preserve"> effettua la chiamata automaticamente all'apparizione della schermata (</w:t>
+      </w:r>
+      <w:proofErr w:type="spellStart"/>
+      <w:r>
+        <w:t>onAppear</w:t>
+      </w:r>
+      <w:proofErr w:type="spellEnd"/>
+      <w:r>
+        <w:t xml:space="preserve">) e mostra dinamicamente il contenuto ricevuto, includendo immagine, titolo e descrizione. La UI è progettata per gestire correttamente stati di caricamento, errori di rete e visualizzazione remota di immagini tramite </w:t>
+      </w:r>
+      <w:proofErr w:type="spellStart"/>
+      <w:r>
+        <w:t>AsyncImage</w:t>
+      </w:r>
+      <w:proofErr w:type="spellEnd"/>
+      <w:r>
+        <w:t>. Questa funzionalità arricchisce l’app con contenuti aggiornati e scientificamente verificati, migliorando l’esperienza didattica e interattiva dell’utente.</w:t>
+      </w:r>
+    </w:p>
+    <w:p>
+      <w:pPr>
+        <w:pStyle w:val="Titolo3"/>
+        <w:numPr>
+          <w:ilvl w:val="2"/>
+          <w:numId w:val="42"/>
+        </w:numPr>
+      </w:pPr>
+      <w:r>
+        <w:rPr>
+          <w:noProof/>
+        </w:rPr>
+        <w:lastRenderedPageBreak/>
+        <mc:AlternateContent>
+          <mc:Choice Requires="wps">
+            <w:drawing>
+              <wp:anchor distT="0" distB="0" distL="114300" distR="114300" simplePos="0" relativeHeight="251694080" behindDoc="0" locked="0" layoutInCell="1" allowOverlap="1" wp14:anchorId="6FD4E544" wp14:editId="19BD2A2B">
+                <wp:simplePos x="0" y="0"/>
+                <wp:positionH relativeFrom="margin">
+                  <wp:align>center</wp:align>
+                </wp:positionH>
+                <wp:positionV relativeFrom="paragraph">
+                  <wp:posOffset>5583362</wp:posOffset>
+                </wp:positionV>
+                <wp:extent cx="834390" cy="246380"/>
+                <wp:effectExtent l="0" t="0" r="3810" b="1270"/>
+                <wp:wrapTopAndBottom/>
+                <wp:docPr id="8" name="Casella di testo 8"/>
+                <wp:cNvGraphicFramePr/>
+                <a:graphic xmlns:a="http://schemas.openxmlformats.org/drawingml/2006/main">
+                  <a:graphicData uri="http://schemas.microsoft.com/office/word/2010/wordprocessingShape">
+                    <wps:wsp>
+                      <wps:cNvSpPr txBox="1"/>
+                      <wps:spPr>
+                        <a:xfrm>
+                          <a:off x="0" y="0"/>
+                          <a:ext cx="834390" cy="246380"/>
+                        </a:xfrm>
+                        <a:prstGeom prst="rect">
+                          <a:avLst/>
+                        </a:prstGeom>
+                        <a:solidFill>
+                          <a:prstClr val="white"/>
+                        </a:solidFill>
+                        <a:ln>
+                          <a:noFill/>
+                        </a:ln>
+                      </wps:spPr>
+                      <wps:txbx>
+                        <w:txbxContent>
+                          <w:p>
+                            <w:pPr>
+                              <w:pStyle w:val="Didascalia"/>
+                              <w:rPr>
+                                <w:b/>
+                                <w:sz w:val="20"/>
+                                <w:lang w:val="it-IT"/>
+                              </w:rPr>
+                            </w:pPr>
+                            <w:r>
+                              <w:t xml:space="preserve">Figura </w:t>
+                            </w:r>
+                            <w:r>
+                              <w:fldChar w:fldCharType="begin"/>
+                            </w:r>
+                            <w:r>
+                              <w:instrText xml:space="preserve"> SEQ Figura \* ARABIC </w:instrText>
+                            </w:r>
+                            <w:r>
+                              <w:fldChar w:fldCharType="separate"/>
+                            </w:r>
+                            <w:r>
+                              <w:rPr>
+                                <w:noProof/>
+                              </w:rPr>
+                              <w:t>15</w:t>
+                            </w:r>
+                            <w:r>
+                              <w:fldChar w:fldCharType="end"/>
+                            </w:r>
+                            <w:r>
+                              <w:t xml:space="preserve"> - API</w:t>
+                            </w:r>
+                          </w:p>
+                        </w:txbxContent>
+                      </wps:txbx>
+                      <wps:bodyPr rot="0" spcFirstLastPara="0" vertOverflow="overflow" horzOverflow="overflow" vert="horz" wrap="square" lIns="0" tIns="0" rIns="0" bIns="0" numCol="1" spcCol="0" rtlCol="0" fromWordArt="0" anchor="t" anchorCtr="0" forceAA="0" compatLnSpc="1">
+                        <a:prstTxWarp prst="textNoShape">
+                          <a:avLst/>
+                        </a:prstTxWarp>
+                        <a:noAutofit/>
+                      </wps:bodyPr>
+                    </wps:wsp>
+                  </a:graphicData>
+                </a:graphic>
+                <wp14:sizeRelH relativeFrom="margin">
+                  <wp14:pctWidth>0</wp14:pctWidth>
+                </wp14:sizeRelH>
+                <wp14:sizeRelV relativeFrom="margin">
+                  <wp14:pctHeight>0</wp14:pctHeight>
+                </wp14:sizeRelV>
+              </wp:anchor>
+            </w:drawing>
+          </mc:Choice>
+          <mc:Fallback>
+            <w:pict>
+              <v:shape w14:anchorId="6FD4E544" id="Casella di testo 8" o:spid="_x0000_s1039" type="#_x0000_t202" style="position:absolute;left:0;text-align:left;margin-left:0;margin-top:439.65pt;width:65.7pt;height:19.4pt;z-index:251694080;visibility:visible;mso-wrap-style:square;mso-width-percent:0;mso-height-percent:0;mso-wrap-distance-left:9pt;mso-wrap-distance-top:0;mso-wrap-distance-right:9pt;mso-wrap-distance-bottom:0;mso-position-horizontal:center;mso-position-horizontal-relative:margin;mso-position-vertical:absolute;mso-position-vertical-relative:text;mso-width-percent:0;mso-height-percent:0;mso-width-relative:margin;mso-height-relative:margin;v-text-anchor:top" o:gfxdata="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" stroked="f">
+                <v:textbox inset="0,0,0,0">
+                  <w:txbxContent>
+                    <w:p>
+                      <w:pPr>
+                        <w:pStyle w:val="Didascalia"/>
+                        <w:rPr>
+                          <w:b/>
+                          <w:sz w:val="20"/>
+                          <w:lang w:val="it-IT"/>
+                        </w:rPr>
+                      </w:pPr>
+                      <w:r>
+                        <w:t xml:space="preserve">Figura </w:t>
+                      </w:r>
+                      <w:r>
+                        <w:fldChar w:fldCharType="begin"/>
+                      </w:r>
+                      <w:r>
+                        <w:instrText xml:space="preserve"> SEQ Figura \* ARABIC </w:instrText>
+                      </w:r>
+                      <w:r>
+                        <w:fldChar w:fldCharType="separate"/>
+                      </w:r>
+                      <w:r>
+                        <w:rPr>
+                          <w:noProof/>
+                        </w:rPr>
+                        <w:t>15</w:t>
+                      </w:r>
+                      <w:r>
+                        <w:fldChar w:fldCharType="end"/>
+                      </w:r>
+                      <w:r>
+                        <w:t xml:space="preserve"> - API</w:t>
+                      </w:r>
+                    </w:p>
+                  </w:txbxContent>
+                </v:textbox>
+                <w10:wrap type="topAndBottom" anchorx="margin"/>
+              </v:shape>
+            </w:pict>
+          </mc:Fallback>
+        </mc:AlternateContent>
+      </w:r>
+      <w:r>
+        <w:rPr>
+          <w:noProof/>
+        </w:rPr>
+        <w:drawing>
+          <wp:anchor distT="0" distB="0" distL="114300" distR="114300" simplePos="0" relativeHeight="251692032" behindDoc="0" locked="0" layoutInCell="1" allowOverlap="1" wp14:anchorId="3469E742" wp14:editId="19DD69A9">
+            <wp:simplePos x="0" y="0"/>
+            <wp:positionH relativeFrom="column">
+              <wp:posOffset>789995</wp:posOffset>
+            </wp:positionH>
+            <wp:positionV relativeFrom="paragraph">
+              <wp:posOffset>192985</wp:posOffset>
+            </wp:positionV>
+            <wp:extent cx="5072932" cy="5352949"/>
+            <wp:effectExtent l="0" t="0" r="0" b="635"/>
+            <wp:wrapTopAndBottom/>
+            <wp:docPr id="7" name="Immagine 7"/>
+            <wp:cNvGraphicFramePr>
+              <a:graphicFrameLocks xmlns:a="http://schemas.openxmlformats.org/drawingml/2006/main" noChangeAspect="1"/>
+            </wp:cNvGraphicFramePr>
+            <a:graphic xmlns:a="http://schemas.openxmlformats.org/drawingml/2006/main">
+              <a:graphicData uri="http://schemas.openxmlformats.org/drawingml/2006/picture">
+                <pic:pic xmlns:pic="http://schemas.openxmlformats.org/drawingml/2006/picture">
+                  <pic:nvPicPr>
+                    <pic:cNvPr id="1" name=""/>
+                    <pic:cNvPicPr/>
+                  </pic:nvPicPr>
+                  <pic:blipFill>
+                    <a:blip r:embed="rId22">
+                      <a:extLst>
+                        <a:ext uri="{28A0092B-C50C-407E-A947-70E740481C1C}">
+                          <a14:useLocalDpi xmlns:a14="http://schemas.microsoft.com/office/drawing/2010/main" val="0"/>
+                        </a:ext>
+                      </a:extLst>
+                    </a:blip>
+                    <a:stretch>
+                      <a:fillRect/>
+                    </a:stretch>
+                  </pic:blipFill>
+                  <pic:spPr>
+                    <a:xfrm>
+                      <a:off x="0" y="0"/>
+                      <a:ext cx="5072932" cy="5352949"/>
+                    </a:xfrm>
+                    <a:prstGeom prst="rect">
+                      <a:avLst/>
+                    </a:prstGeom>
+                  </pic:spPr>
+                </pic:pic>
+              </a:graphicData>
+            </a:graphic>
+          </wp:anchor>
+        </w:drawing>
+      </w:r>
+      <w:r>
+        <w:t>Codice significativo</w:t>
+      </w:r>
+    </w:p>
+    <w:p>
+      <w:pPr>
+        <w:rPr>
+          <w:lang w:val="it-IT"/>
+        </w:rPr>
+      </w:pPr>
+    </w:p>
+    <w:p>
+      <w:r>
+        <w:t xml:space="preserve">Questo </w:t>
+      </w:r>
+      <w:proofErr w:type="spellStart"/>
+      <w:r>
+        <w:t>ViewModel</w:t>
+      </w:r>
+      <w:proofErr w:type="spellEnd"/>
+      <w:r>
+        <w:t xml:space="preserve"> gestisce il processo di comunicazione con l’API NASA APOD</w:t>
+      </w:r>
+      <w:r>
+        <w:rPr>
+          <w:rStyle w:val="Rimandonotaapidipagina"/>
+        </w:rPr>
+        <w:footnoteReference w:id="1"/>
+      </w:r>
+      <w:r>
+        <w:t xml:space="preserve">, occupandosi di scaricare i dati relativi alla foto astronomica del giorno. Quando viene invocato </w:t>
+      </w:r>
+      <w:proofErr w:type="spellStart"/>
+      <w:proofErr w:type="gramStart"/>
+      <w:r>
+        <w:t>fetchAPOD</w:t>
+      </w:r>
+      <w:proofErr w:type="spellEnd"/>
+      <w:r>
+        <w:t>(</w:t>
+      </w:r>
+      <w:proofErr w:type="gramEnd"/>
+      <w:r>
+        <w:t>), viene creata e inviata una richiesta HTTP verso l’endpoint ufficiale dell’API. La risposta ricevuta viene analizzata: se il server restituisce dati validi, questi vengono decodificati dal formato JSON nel modello Swift APOD.</w:t>
+      </w:r>
+    </w:p>
+    <w:p>
+      <w:r>
+        <w:t xml:space="preserve">Durante questo processo il </w:t>
+      </w:r>
+      <w:proofErr w:type="spellStart"/>
+      <w:r>
+        <w:t>ViewModel</w:t>
+      </w:r>
+      <w:proofErr w:type="spellEnd"/>
+      <w:r>
+        <w:t xml:space="preserve"> gestisce anche eventuali errori, come problemi di rete, risposta non valida o errori di decodifica, e li rende disponibili attraverso una proprietà osservabile dedicata (</w:t>
+      </w:r>
+      <w:proofErr w:type="spellStart"/>
+      <w:r>
+        <w:t>errorMessage</w:t>
+      </w:r>
+      <w:proofErr w:type="spellEnd"/>
+      <w:r>
+        <w:t>). Sia il dato ottenuto che gli errori vengono pubblicati tramite proprietà @Published, garantendo che qualsiasi vista collegata possa aggiornarsi automaticamente.</w:t>
+      </w:r>
+    </w:p>
+    <w:p>
+      <w:r>
+        <w:t xml:space="preserve">Tutte le modifiche allo stato osservabile avvengono sul </w:t>
+      </w:r>
+      <w:proofErr w:type="spellStart"/>
+      <w:r>
+        <w:t>main</w:t>
+      </w:r>
+      <w:proofErr w:type="spellEnd"/>
+      <w:r>
+        <w:t xml:space="preserve"> </w:t>
+      </w:r>
+      <w:proofErr w:type="spellStart"/>
+      <w:r>
+        <w:t>thread</w:t>
+      </w:r>
+      <w:proofErr w:type="spellEnd"/>
+      <w:r>
+        <w:t xml:space="preserve">, assicurando compatibilità con </w:t>
+      </w:r>
+      <w:proofErr w:type="spellStart"/>
+      <w:r>
+        <w:t>SwiftUI</w:t>
+      </w:r>
+      <w:proofErr w:type="spellEnd"/>
+      <w:r>
+        <w:t xml:space="preserve"> e impedendo comportamenti imprevisti nell’interfaccia. In questo modo la UI può reagire in modo fluido e coerente alla disponibilità dei dati o a eventuali problemi durante la richiesta.</w:t>
       </w:r>
     </w:p>
     <w:p/>
     <w:p>
       <w:pPr>
         <w:pStyle w:val="Titolo2"/>
-      </w:pPr>
+        <w:numPr>
+          <w:ilvl w:val="1"/>
+          <w:numId w:val="42"/>
+        </w:numPr>
+      </w:pPr>
+      <w:proofErr w:type="spellStart"/>
+      <w:r>
+        <w:lastRenderedPageBreak/>
+        <w:t>MyApp.swift</w:t>
+      </w:r>
+      <w:proofErr w:type="spellEnd"/>
+    </w:p>
+    <w:p>
+      <w:proofErr w:type="spellStart"/>
       <w:r>
         <w:t>MyApp</w:t>
       </w:r>
-      <w:r>
-        <w:t>.swift</w:t>
-      </w:r>
-    </w:p>
-    <w:p>
-      <w:r>
-        <w:t>MyApp rappresenta il punto di ingresso dell’applicazione. Utilizza l’attributo @main per indicare la struttura principale dell’app, conforme al protocollo App, che definisce il ciclo di vita dell’applicazione in ambiente SwiftUI. All'interno della proprietà body, viene dichiarato un WindowGroup che crea la finestra principale dell’app contenente la schermata iniziale ContentView(). Da questa struttura inizia l’esecuzione dell’intera interfaccia e la navigazione verso le altre viste. Il file funge quindi da configurazione base dell’app e garantisce l’avvio corretto dell’esperienza utente.</w:t>
+      <w:proofErr w:type="spellEnd"/>
+      <w:r>
+        <w:t xml:space="preserve"> rappresenta il punto di ingresso dell’applicazione. Utilizza l’attributo @main per indicare la struttura principale dell’app, conforme al protocollo App, che definisce il ciclo di vita dell’applicazione in ambiente </w:t>
+      </w:r>
+      <w:proofErr w:type="spellStart"/>
+      <w:r>
+        <w:t>SwiftUI</w:t>
+      </w:r>
+      <w:proofErr w:type="spellEnd"/>
+      <w:r>
+        <w:t xml:space="preserve">. All'interno della proprietà body, viene dichiarato un </w:t>
+      </w:r>
+      <w:proofErr w:type="spellStart"/>
+      <w:r>
+        <w:t>WindowGroup</w:t>
+      </w:r>
+      <w:proofErr w:type="spellEnd"/>
+      <w:r>
+        <w:t xml:space="preserve"> che crea la finestra principale dell’app contenente la schermata iniziale </w:t>
+      </w:r>
+      <w:proofErr w:type="spellStart"/>
+      <w:proofErr w:type="gramStart"/>
+      <w:r>
+        <w:t>ContentView</w:t>
+      </w:r>
+      <w:proofErr w:type="spellEnd"/>
+      <w:r>
+        <w:t>(</w:t>
+      </w:r>
+      <w:proofErr w:type="gramEnd"/>
+      <w:r>
+        <w:t>). Da questa struttura inizia l’esecuzione dell’intera interfaccia e la navigazione verso le altre viste. Il file funge quindi da configurazione base dell’app e garantisce l’avvio corretto dell’esperienza utente.</w:t>
       </w:r>
     </w:p>
     <w:p>
       <w:pPr>
         <w:pStyle w:val="Titolo2"/>
-      </w:pPr>
-      <w:r>
-        <w:t>Package.</w:t>
-      </w:r>
-      <w:r>
-        <w:t>swift</w:t>
-      </w:r>
+        <w:numPr>
+          <w:ilvl w:val="1"/>
+          <w:numId w:val="42"/>
+        </w:numPr>
+      </w:pPr>
+      <w:proofErr w:type="spellStart"/>
+      <w:r>
+        <w:t>Package.swift</w:t>
+      </w:r>
+      <w:proofErr w:type="spellEnd"/>
     </w:p>
     <w:p>
       <w:r>
@@ -10989,16 +12599,16 @@
     <w:p>
       <w:pPr>
         <w:pStyle w:val="Titolo2"/>
-      </w:pPr>
-      <w:r>
-        <w:t>P</w:t>
-      </w:r>
-      <w:r>
-        <w:t>lanet</w:t>
-      </w:r>
-      <w:r>
-        <w:t>.swift</w:t>
-      </w:r>
+        <w:numPr>
+          <w:ilvl w:val="1"/>
+          <w:numId w:val="42"/>
+        </w:numPr>
+      </w:pPr>
+      <w:proofErr w:type="spellStart"/>
+      <w:r>
+        <w:t>Planet.swift</w:t>
+      </w:r>
+      <w:proofErr w:type="spellEnd"/>
     </w:p>
     <w:p>
       <w:r>
@@ -11012,22 +12622,38 @@
         <w:t>Planet</w:t>
       </w:r>
       <w:r>
-        <w:t xml:space="preserve"> definisce le strutture dati utilizzate per rappresentare i pianeti e i contenuti multimediali associati. Le strutture Planet e Video adottano il protocollo Codable, permettendo la lettura e la decodifica dei dati da un file JSON. Ogni pianeta possiede un nome, una lista di dettagli informativi e, se disponibile, un video esplicativo proveniente da YouTube tramite il modello Video. Questo approccio consente una gestione dinamica e strutturata delle informazioni, rendendo il sistema facilmente espandibile e manutenibile.</w:t>
+        <w:t xml:space="preserve"> definisce le strutture dati utilizzate per rappresentare i pianeti e i contenuti multimediali associati. Le strutture Planet e Video adottano il protocollo </w:t>
+      </w:r>
+      <w:proofErr w:type="spellStart"/>
+      <w:r>
+        <w:t>Codable</w:t>
+      </w:r>
+      <w:proofErr w:type="spellEnd"/>
+      <w:r>
+        <w:t xml:space="preserve">, permettendo la lettura e la decodifica dei dati da un file JSON. Ogni pianeta possiede un nome, una lista di dettagli informativi e, se disponibile, un video esplicativo proveniente da YouTube tramite il modello Video. Questo approccio consente una gestione dinamica e strutturata delle informazioni, rendendo il sistema facilmente espandibile e </w:t>
+      </w:r>
+      <w:proofErr w:type="spellStart"/>
+      <w:r>
+        <w:t>manutenibile</w:t>
+      </w:r>
+      <w:proofErr w:type="spellEnd"/>
+      <w:r>
+        <w:t>.</w:t>
       </w:r>
     </w:p>
     <w:p>
       <w:pPr>
         <w:pStyle w:val="Titolo2"/>
-      </w:pPr>
-      <w:r>
-        <w:t>Planet</w:t>
-      </w:r>
-      <w:r>
-        <w:t>Data</w:t>
-      </w:r>
-      <w:r>
-        <w:t>.swift</w:t>
-      </w:r>
+        <w:numPr>
+          <w:ilvl w:val="1"/>
+          <w:numId w:val="42"/>
+        </w:numPr>
+      </w:pPr>
+      <w:proofErr w:type="spellStart"/>
+      <w:r>
+        <w:t>PlanetData.swift</w:t>
+      </w:r>
+      <w:proofErr w:type="spellEnd"/>
     </w:p>
     <w:p>
       <w:pPr>
@@ -11038,6 +12664,7 @@
       <w:r>
         <w:t xml:space="preserve">Il file </w:t>
       </w:r>
+      <w:proofErr w:type="spellStart"/>
       <w:r>
         <w:rPr>
           <w:b/>
@@ -11045,28 +12672,46 @@
         </w:rPr>
         <w:t>PlanetData</w:t>
       </w:r>
-      <w:r>
-        <w:t xml:space="preserve"> implementa una classe responsabile del caricamento dei dati relativi ai pianeti da un file JSON incluso nel progetto. Il metodo statico load() individua il file nel bundle dell'applicazione, ne legge il contenuto e lo decodifica in una lista di oggetti Planet tramite JSONDecoder. In caso di errore (file mancante o struttura JSON non valida), il metodo restituisce un array vuoto e stampa un messaggio diagnostico. Questo meccanismo consente di separare i dati dalla logica applicativa, garantendo scalabilità, modularità e semplicità nella gestione e nell’aggiornamento dei contenuti.</w:t>
+      <w:proofErr w:type="spellEnd"/>
+      <w:r>
+        <w:t xml:space="preserve"> implementa una classe responsabile del caricamento dei dati relativi ai pianeti da un file JSON incluso nel progetto. Il metodo statico </w:t>
+      </w:r>
+      <w:proofErr w:type="gramStart"/>
+      <w:r>
+        <w:t>load(</w:t>
+      </w:r>
+      <w:proofErr w:type="gramEnd"/>
+      <w:r>
+        <w:t xml:space="preserve">) individua il file nel bundle dell'applicazione, ne legge il contenuto e lo decodifica in una lista di oggetti Planet tramite </w:t>
+      </w:r>
+      <w:proofErr w:type="spellStart"/>
+      <w:r>
+        <w:t>JSONDecoder</w:t>
+      </w:r>
+      <w:proofErr w:type="spellEnd"/>
+      <w:r>
+        <w:t>. In caso di errore (file mancante o struttura JSON non valida), il metodo restituisce un array vuoto e stampa un messaggio diagnostico. Questo meccanismo consente di separare i dati dalla logica applicativa, garantendo scalabilità, modularità e semplicità nella gestione e nell’aggiornamento dei contenuti.</w:t>
       </w:r>
     </w:p>
     <w:p>
       <w:pPr>
         <w:pStyle w:val="Titolo2"/>
-      </w:pPr>
-      <w:r>
-        <w:t>PlanetD</w:t>
-      </w:r>
-      <w:r>
-        <w:t>etailView</w:t>
-      </w:r>
-      <w:r>
-        <w:t>.swift</w:t>
-      </w:r>
+        <w:numPr>
+          <w:ilvl w:val="1"/>
+          <w:numId w:val="42"/>
+        </w:numPr>
+      </w:pPr>
+      <w:proofErr w:type="spellStart"/>
+      <w:r>
+        <w:t>PlanetDetailView.swift</w:t>
+      </w:r>
+      <w:proofErr w:type="spellEnd"/>
     </w:p>
     <w:p>
       <w:r>
         <w:t xml:space="preserve">Il file </w:t>
       </w:r>
+      <w:proofErr w:type="spellStart"/>
       <w:r>
         <w:rPr>
           <w:b/>
@@ -11074,20 +12719,33 @@
         </w:rPr>
         <w:t>PlanetDetailView</w:t>
       </w:r>
+      <w:proofErr w:type="spellEnd"/>
       <w:r>
         <w:t xml:space="preserve"> implementa l’interfaccia dedicata alla visualizzazione dei contenuti informativi relativi ai pianeti.</w:t>
       </w:r>
       <w:r>
         <w:br/>
-        <w:t xml:space="preserve">La vista riceve in input un’istanza del modello Planet e costruisce dinamicamente il layout mostrando nome, </w:t>
-      </w:r>
-      <w:r>
-        <w:lastRenderedPageBreak/>
-        <w:t>immagine associata, descrizioni testuali e, quando disponibile, un video esplicativo riprodotto tramite AVPlayer.</w:t>
+        <w:t xml:space="preserve">La vista riceve in input un’istanza del modello Planet e costruisce dinamicamente il layout mostrando nome, immagine associata, descrizioni testuali e, quando disponibile, un video esplicativo riprodotto tramite </w:t>
+      </w:r>
+      <w:proofErr w:type="spellStart"/>
+      <w:r>
+        <w:t>AVPlayer</w:t>
+      </w:r>
+      <w:proofErr w:type="spellEnd"/>
+      <w:r>
+        <w:t>.</w:t>
       </w:r>
       <w:r>
         <w:br/>
-        <w:t>La disposizione degli elementi è gestita tramite una ScrollView per permettere la consultazione completa dei contenuti anche su schermi di dimensioni ridotte. L’interfaccia mantiene coerenza estetica con il resto dell’applicazione utilizzando sfondo tematico e palette cromatica appropriata.</w:t>
+        <w:t xml:space="preserve">La disposizione degli elementi è gestita tramite una </w:t>
+      </w:r>
+      <w:proofErr w:type="spellStart"/>
+      <w:r>
+        <w:t>ScrollView</w:t>
+      </w:r>
+      <w:proofErr w:type="spellEnd"/>
+      <w:r>
+        <w:t xml:space="preserve"> per permettere la consultazione completa dei contenuti anche su schermi di dimensioni ridotte. L’interfaccia mantiene coerenza estetica con il resto dell’applicazione utilizzando sfondo tematico e palette cromatica appropriata.</w:t>
       </w:r>
       <w:r>
         <w:br/>
@@ -11097,15 +12755,22 @@
     <w:p>
       <w:pPr>
         <w:pStyle w:val="Titolo2"/>
-      </w:pPr>
+        <w:numPr>
+          <w:ilvl w:val="1"/>
+          <w:numId w:val="42"/>
+        </w:numPr>
+      </w:pPr>
+      <w:proofErr w:type="spellStart"/>
       <w:r>
         <w:t>PlanetView.swift</w:t>
       </w:r>
+      <w:proofErr w:type="spellEnd"/>
     </w:p>
     <w:p>
       <w:r>
         <w:t xml:space="preserve">Il file </w:t>
       </w:r>
+      <w:proofErr w:type="spellStart"/>
       <w:r>
         <w:rPr>
           <w:b/>
@@ -11113,6 +12778,7 @@
         </w:rPr>
         <w:t>PlanetView</w:t>
       </w:r>
+      <w:proofErr w:type="spellEnd"/>
       <w:r>
         <w:t xml:space="preserve"> definisce una vista riutilizzabile che simula graficamente il movimento orbitale dei pianeti.</w:t>
       </w:r>
@@ -11126,6 +12792,7 @@
       </w:r>
     </w:p>
     <w:p/>
+    <w:p/>
     <w:p>
       <w:pPr>
         <w:rPr>
@@ -11136,6 +12803,10 @@
     <w:p>
       <w:pPr>
         <w:pStyle w:val="Titolo1"/>
+        <w:numPr>
+          <w:ilvl w:val="0"/>
+          <w:numId w:val="42"/>
+        </w:numPr>
         <w:rPr>
           <w:lang w:val="it-IT"/>
         </w:rPr>
@@ -11154,6 +12825,10 @@
     <w:p>
       <w:pPr>
         <w:pStyle w:val="Titolo2"/>
+        <w:numPr>
+          <w:ilvl w:val="1"/>
+          <w:numId w:val="42"/>
+        </w:numPr>
       </w:pPr>
       <w:bookmarkStart w:id="29" w:name="_Toc461179224"/>
       <w:bookmarkStart w:id="30" w:name="_Toc94790461"/>
@@ -11240,6 +12915,7 @@
                 <w:lang w:val="en-GB" w:eastAsia="en-US"/>
               </w:rPr>
             </w:pPr>
+            <w:proofErr w:type="spellStart"/>
             <w:r>
               <w:rPr>
                 <w:b/>
@@ -11249,6 +12925,7 @@
               </w:rPr>
               <w:t>Riferimento</w:t>
             </w:r>
+            <w:proofErr w:type="spellEnd"/>
             <w:r>
               <w:rPr>
                 <w:sz w:val="18"/>
@@ -11380,6 +13057,7 @@
                 <w:szCs w:val="18"/>
               </w:rPr>
             </w:pPr>
+            <w:proofErr w:type="spellStart"/>
             <w:r>
               <w:rPr>
                 <w:b/>
@@ -11388,6 +13066,7 @@
               </w:rPr>
               <w:t>Descrizione</w:t>
             </w:r>
+            <w:proofErr w:type="spellEnd"/>
             <w:r>
               <w:rPr>
                 <w:b/>
@@ -11442,6 +13121,7 @@
                 <w:szCs w:val="18"/>
               </w:rPr>
             </w:pPr>
+            <w:proofErr w:type="spellStart"/>
             <w:r>
               <w:rPr>
                 <w:b/>
@@ -11450,6 +13130,7 @@
               </w:rPr>
               <w:t>Prerequisiti</w:t>
             </w:r>
+            <w:proofErr w:type="spellEnd"/>
             <w:r>
               <w:rPr>
                 <w:b/>
@@ -11483,6 +13164,7 @@
               </w:rPr>
               <w:t xml:space="preserve">Store on local PC: Profile_1.2.001.xml (appendix </w:t>
             </w:r>
+            <w:proofErr w:type="spellStart"/>
             <w:r>
               <w:rPr>
                 <w:sz w:val="18"/>
@@ -11491,6 +13173,7 @@
               </w:rPr>
               <w:t>n_n</w:t>
             </w:r>
+            <w:proofErr w:type="spellEnd"/>
             <w:r>
               <w:rPr>
                 <w:sz w:val="18"/>
@@ -11498,6 +13181,7 @@
               </w:rPr>
               <w:t xml:space="preserve">) and Cards_1.2.001.txt (appendix </w:t>
             </w:r>
+            <w:proofErr w:type="spellStart"/>
             <w:r>
               <w:rPr>
                 <w:sz w:val="18"/>
@@ -11506,6 +13190,7 @@
               </w:rPr>
               <w:t>n_n</w:t>
             </w:r>
+            <w:proofErr w:type="spellEnd"/>
             <w:r>
               <w:rPr>
                 <w:sz w:val="18"/>
@@ -11550,6 +13235,7 @@
                 <w:szCs w:val="18"/>
               </w:rPr>
             </w:pPr>
+            <w:proofErr w:type="spellStart"/>
             <w:r>
               <w:rPr>
                 <w:b/>
@@ -11558,6 +13244,7 @@
               </w:rPr>
               <w:t>Procedura</w:t>
             </w:r>
+            <w:proofErr w:type="spellEnd"/>
             <w:r>
               <w:rPr>
                 <w:b/>
@@ -11724,7 +13411,23 @@
                 <w:szCs w:val="18"/>
               </w:rPr>
               <w:br/>
-              <w:t>Click the imsi card link</w:t>
+              <w:t xml:space="preserve">Click the </w:t>
+            </w:r>
+            <w:proofErr w:type="spellStart"/>
+            <w:r>
+              <w:rPr>
+                <w:sz w:val="18"/>
+                <w:szCs w:val="18"/>
+              </w:rPr>
+              <w:t>imsi</w:t>
+            </w:r>
+            <w:proofErr w:type="spellEnd"/>
+            <w:r>
+              <w:rPr>
+                <w:sz w:val="18"/>
+                <w:szCs w:val="18"/>
+              </w:rPr>
+              <w:t xml:space="preserve"> card link</w:t>
             </w:r>
             <w:r>
               <w:rPr>
@@ -11772,7 +13475,287 @@
                 <w:szCs w:val="16"/>
                 <w:lang w:eastAsia="ja-JP"/>
               </w:rPr>
-              <w:t>SELECT imsi, dir, keyset, cntr, rawtohex(kickey), rawtohex(kidkey), rawtohex(kikkey), rawtohex(chv), rawtohex(dap)FROM otacardkey a where imsi='340041795924770' ORDER BY keyset;</w:t>
+              <w:t xml:space="preserve">SELECT </w:t>
+            </w:r>
+            <w:proofErr w:type="spellStart"/>
+            <w:r>
+              <w:rPr>
+                <w:rFonts w:ascii="Courier New" w:eastAsia="MS Mincho" w:hAnsi="Courier New" w:cs="Courier New"/>
+                <w:sz w:val="16"/>
+                <w:szCs w:val="16"/>
+                <w:lang w:eastAsia="ja-JP"/>
+              </w:rPr>
+              <w:t>imsi</w:t>
+            </w:r>
+            <w:proofErr w:type="spellEnd"/>
+            <w:r>
+              <w:rPr>
+                <w:rFonts w:ascii="Courier New" w:eastAsia="MS Mincho" w:hAnsi="Courier New" w:cs="Courier New"/>
+                <w:sz w:val="16"/>
+                <w:szCs w:val="16"/>
+                <w:lang w:eastAsia="ja-JP"/>
+              </w:rPr>
+              <w:t xml:space="preserve">, </w:t>
+            </w:r>
+            <w:proofErr w:type="spellStart"/>
+            <w:r>
+              <w:rPr>
+                <w:rFonts w:ascii="Courier New" w:eastAsia="MS Mincho" w:hAnsi="Courier New" w:cs="Courier New"/>
+                <w:sz w:val="16"/>
+                <w:szCs w:val="16"/>
+                <w:lang w:eastAsia="ja-JP"/>
+              </w:rPr>
+              <w:t>dir</w:t>
+            </w:r>
+            <w:proofErr w:type="spellEnd"/>
+            <w:r>
+              <w:rPr>
+                <w:rFonts w:ascii="Courier New" w:eastAsia="MS Mincho" w:hAnsi="Courier New" w:cs="Courier New"/>
+                <w:sz w:val="16"/>
+                <w:szCs w:val="16"/>
+                <w:lang w:eastAsia="ja-JP"/>
+              </w:rPr>
+              <w:t xml:space="preserve">, keyset, </w:t>
+            </w:r>
+            <w:proofErr w:type="spellStart"/>
+            <w:r>
+              <w:rPr>
+                <w:rFonts w:ascii="Courier New" w:eastAsia="MS Mincho" w:hAnsi="Courier New" w:cs="Courier New"/>
+                <w:sz w:val="16"/>
+                <w:szCs w:val="16"/>
+                <w:lang w:eastAsia="ja-JP"/>
+              </w:rPr>
+              <w:t>cntr</w:t>
+            </w:r>
+            <w:proofErr w:type="spellEnd"/>
+            <w:r>
+              <w:rPr>
+                <w:rFonts w:ascii="Courier New" w:eastAsia="MS Mincho" w:hAnsi="Courier New" w:cs="Courier New"/>
+                <w:sz w:val="16"/>
+                <w:szCs w:val="16"/>
+                <w:lang w:eastAsia="ja-JP"/>
+              </w:rPr>
+              <w:t xml:space="preserve">, </w:t>
+            </w:r>
+            <w:proofErr w:type="spellStart"/>
+            <w:r>
+              <w:rPr>
+                <w:rFonts w:ascii="Courier New" w:eastAsia="MS Mincho" w:hAnsi="Courier New" w:cs="Courier New"/>
+                <w:sz w:val="16"/>
+                <w:szCs w:val="16"/>
+                <w:lang w:eastAsia="ja-JP"/>
+              </w:rPr>
+              <w:t>rawtohex</w:t>
+            </w:r>
+            <w:proofErr w:type="spellEnd"/>
+            <w:r>
+              <w:rPr>
+                <w:rFonts w:ascii="Courier New" w:eastAsia="MS Mincho" w:hAnsi="Courier New" w:cs="Courier New"/>
+                <w:sz w:val="16"/>
+                <w:szCs w:val="16"/>
+                <w:lang w:eastAsia="ja-JP"/>
+              </w:rPr>
+              <w:t>(</w:t>
+            </w:r>
+            <w:proofErr w:type="spellStart"/>
+            <w:r>
+              <w:rPr>
+                <w:rFonts w:ascii="Courier New" w:eastAsia="MS Mincho" w:hAnsi="Courier New" w:cs="Courier New"/>
+                <w:sz w:val="16"/>
+                <w:szCs w:val="16"/>
+                <w:lang w:eastAsia="ja-JP"/>
+              </w:rPr>
+              <w:t>kickey</w:t>
+            </w:r>
+            <w:proofErr w:type="spellEnd"/>
+            <w:r>
+              <w:rPr>
+                <w:rFonts w:ascii="Courier New" w:eastAsia="MS Mincho" w:hAnsi="Courier New" w:cs="Courier New"/>
+                <w:sz w:val="16"/>
+                <w:szCs w:val="16"/>
+                <w:lang w:eastAsia="ja-JP"/>
+              </w:rPr>
+              <w:t xml:space="preserve">), </w:t>
+            </w:r>
+            <w:proofErr w:type="spellStart"/>
+            <w:r>
+              <w:rPr>
+                <w:rFonts w:ascii="Courier New" w:eastAsia="MS Mincho" w:hAnsi="Courier New" w:cs="Courier New"/>
+                <w:sz w:val="16"/>
+                <w:szCs w:val="16"/>
+                <w:lang w:eastAsia="ja-JP"/>
+              </w:rPr>
+              <w:t>rawtohex</w:t>
+            </w:r>
+            <w:proofErr w:type="spellEnd"/>
+            <w:r>
+              <w:rPr>
+                <w:rFonts w:ascii="Courier New" w:eastAsia="MS Mincho" w:hAnsi="Courier New" w:cs="Courier New"/>
+                <w:sz w:val="16"/>
+                <w:szCs w:val="16"/>
+                <w:lang w:eastAsia="ja-JP"/>
+              </w:rPr>
+              <w:t>(</w:t>
+            </w:r>
+            <w:proofErr w:type="spellStart"/>
+            <w:r>
+              <w:rPr>
+                <w:rFonts w:ascii="Courier New" w:eastAsia="MS Mincho" w:hAnsi="Courier New" w:cs="Courier New"/>
+                <w:sz w:val="16"/>
+                <w:szCs w:val="16"/>
+                <w:lang w:eastAsia="ja-JP"/>
+              </w:rPr>
+              <w:t>kidkey</w:t>
+            </w:r>
+            <w:proofErr w:type="spellEnd"/>
+            <w:r>
+              <w:rPr>
+                <w:rFonts w:ascii="Courier New" w:eastAsia="MS Mincho" w:hAnsi="Courier New" w:cs="Courier New"/>
+                <w:sz w:val="16"/>
+                <w:szCs w:val="16"/>
+                <w:lang w:eastAsia="ja-JP"/>
+              </w:rPr>
+              <w:t xml:space="preserve">), </w:t>
+            </w:r>
+            <w:proofErr w:type="spellStart"/>
+            <w:r>
+              <w:rPr>
+                <w:rFonts w:ascii="Courier New" w:eastAsia="MS Mincho" w:hAnsi="Courier New" w:cs="Courier New"/>
+                <w:sz w:val="16"/>
+                <w:szCs w:val="16"/>
+                <w:lang w:eastAsia="ja-JP"/>
+              </w:rPr>
+              <w:t>rawtohex</w:t>
+            </w:r>
+            <w:proofErr w:type="spellEnd"/>
+            <w:r>
+              <w:rPr>
+                <w:rFonts w:ascii="Courier New" w:eastAsia="MS Mincho" w:hAnsi="Courier New" w:cs="Courier New"/>
+                <w:sz w:val="16"/>
+                <w:szCs w:val="16"/>
+                <w:lang w:eastAsia="ja-JP"/>
+              </w:rPr>
+              <w:t>(</w:t>
+            </w:r>
+            <w:proofErr w:type="spellStart"/>
+            <w:r>
+              <w:rPr>
+                <w:rFonts w:ascii="Courier New" w:eastAsia="MS Mincho" w:hAnsi="Courier New" w:cs="Courier New"/>
+                <w:sz w:val="16"/>
+                <w:szCs w:val="16"/>
+                <w:lang w:eastAsia="ja-JP"/>
+              </w:rPr>
+              <w:t>kikkey</w:t>
+            </w:r>
+            <w:proofErr w:type="spellEnd"/>
+            <w:r>
+              <w:rPr>
+                <w:rFonts w:ascii="Courier New" w:eastAsia="MS Mincho" w:hAnsi="Courier New" w:cs="Courier New"/>
+                <w:sz w:val="16"/>
+                <w:szCs w:val="16"/>
+                <w:lang w:eastAsia="ja-JP"/>
+              </w:rPr>
+              <w:t xml:space="preserve">), </w:t>
+            </w:r>
+            <w:proofErr w:type="spellStart"/>
+            <w:r>
+              <w:rPr>
+                <w:rFonts w:ascii="Courier New" w:eastAsia="MS Mincho" w:hAnsi="Courier New" w:cs="Courier New"/>
+                <w:sz w:val="16"/>
+                <w:szCs w:val="16"/>
+                <w:lang w:eastAsia="ja-JP"/>
+              </w:rPr>
+              <w:t>rawtohex</w:t>
+            </w:r>
+            <w:proofErr w:type="spellEnd"/>
+            <w:r>
+              <w:rPr>
+                <w:rFonts w:ascii="Courier New" w:eastAsia="MS Mincho" w:hAnsi="Courier New" w:cs="Courier New"/>
+                <w:sz w:val="16"/>
+                <w:szCs w:val="16"/>
+                <w:lang w:eastAsia="ja-JP"/>
+              </w:rPr>
+              <w:t>(</w:t>
+            </w:r>
+            <w:proofErr w:type="spellStart"/>
+            <w:r>
+              <w:rPr>
+                <w:rFonts w:ascii="Courier New" w:eastAsia="MS Mincho" w:hAnsi="Courier New" w:cs="Courier New"/>
+                <w:sz w:val="16"/>
+                <w:szCs w:val="16"/>
+                <w:lang w:eastAsia="ja-JP"/>
+              </w:rPr>
+              <w:t>chv</w:t>
+            </w:r>
+            <w:proofErr w:type="spellEnd"/>
+            <w:r>
+              <w:rPr>
+                <w:rFonts w:ascii="Courier New" w:eastAsia="MS Mincho" w:hAnsi="Courier New" w:cs="Courier New"/>
+                <w:sz w:val="16"/>
+                <w:szCs w:val="16"/>
+                <w:lang w:eastAsia="ja-JP"/>
+              </w:rPr>
+              <w:t xml:space="preserve">), </w:t>
+            </w:r>
+            <w:proofErr w:type="spellStart"/>
+            <w:r>
+              <w:rPr>
+                <w:rFonts w:ascii="Courier New" w:eastAsia="MS Mincho" w:hAnsi="Courier New" w:cs="Courier New"/>
+                <w:sz w:val="16"/>
+                <w:szCs w:val="16"/>
+                <w:lang w:eastAsia="ja-JP"/>
+              </w:rPr>
+              <w:t>rawtohex</w:t>
+            </w:r>
+            <w:proofErr w:type="spellEnd"/>
+            <w:r>
+              <w:rPr>
+                <w:rFonts w:ascii="Courier New" w:eastAsia="MS Mincho" w:hAnsi="Courier New" w:cs="Courier New"/>
+                <w:sz w:val="16"/>
+                <w:szCs w:val="16"/>
+                <w:lang w:eastAsia="ja-JP"/>
+              </w:rPr>
+              <w:t xml:space="preserve">(dap)FROM </w:t>
+            </w:r>
+            <w:proofErr w:type="spellStart"/>
+            <w:r>
+              <w:rPr>
+                <w:rFonts w:ascii="Courier New" w:eastAsia="MS Mincho" w:hAnsi="Courier New" w:cs="Courier New"/>
+                <w:sz w:val="16"/>
+                <w:szCs w:val="16"/>
+                <w:lang w:eastAsia="ja-JP"/>
+              </w:rPr>
+              <w:t>otacardkey</w:t>
+            </w:r>
+            <w:proofErr w:type="spellEnd"/>
+            <w:r>
+              <w:rPr>
+                <w:rFonts w:ascii="Courier New" w:eastAsia="MS Mincho" w:hAnsi="Courier New" w:cs="Courier New"/>
+                <w:sz w:val="16"/>
+                <w:szCs w:val="16"/>
+                <w:lang w:eastAsia="ja-JP"/>
+              </w:rPr>
+              <w:t xml:space="preserve"> a where </w:t>
+            </w:r>
+            <w:proofErr w:type="spellStart"/>
+            <w:r>
+              <w:rPr>
+                <w:rFonts w:ascii="Courier New" w:eastAsia="MS Mincho" w:hAnsi="Courier New" w:cs="Courier New"/>
+                <w:sz w:val="16"/>
+                <w:szCs w:val="16"/>
+                <w:lang w:eastAsia="ja-JP"/>
+              </w:rPr>
+              <w:t>imsi</w:t>
+            </w:r>
+            <w:proofErr w:type="spellEnd"/>
+            <w:r>
+              <w:rPr>
+                <w:rFonts w:ascii="Courier New" w:eastAsia="MS Mincho" w:hAnsi="Courier New" w:cs="Courier New"/>
+                <w:sz w:val="16"/>
+                <w:szCs w:val="16"/>
+                <w:lang w:eastAsia="ja-JP"/>
+              </w:rPr>
+              <w:t>='340041795924770' ORDER BY keyset;</w:t>
             </w:r>
           </w:p>
         </w:tc>
@@ -11795,14 +13778,34 @@
                 <w:szCs w:val="18"/>
               </w:rPr>
             </w:pPr>
+            <w:proofErr w:type="spellStart"/>
             <w:r>
               <w:rPr>
                 <w:b/>
                 <w:sz w:val="18"/>
                 <w:szCs w:val="18"/>
               </w:rPr>
-              <w:t>Risultati attesi</w:t>
+              <w:t>Risultati</w:t>
             </w:r>
+            <w:proofErr w:type="spellEnd"/>
+            <w:r>
+              <w:rPr>
+                <w:b/>
+                <w:sz w:val="18"/>
+                <w:szCs w:val="18"/>
+              </w:rPr>
+              <w:t xml:space="preserve"> </w:t>
+            </w:r>
+            <w:proofErr w:type="spellStart"/>
+            <w:r>
+              <w:rPr>
+                <w:b/>
+                <w:sz w:val="18"/>
+                <w:szCs w:val="18"/>
+              </w:rPr>
+              <w:t>attesi</w:t>
+            </w:r>
+            <w:proofErr w:type="spellEnd"/>
             <w:r>
               <w:rPr>
                 <w:b/>
@@ -11834,7 +13837,23 @@
                 <w:sz w:val="18"/>
                 <w:szCs w:val="18"/>
               </w:rPr>
-              <w:t>Keys visible in the DB (OtaCardKey) but not visible in the GUI (Card details)</w:t>
+              <w:t>Keys visible in the DB (</w:t>
+            </w:r>
+            <w:proofErr w:type="spellStart"/>
+            <w:r>
+              <w:rPr>
+                <w:sz w:val="18"/>
+                <w:szCs w:val="18"/>
+              </w:rPr>
+              <w:t>OtaCardKey</w:t>
+            </w:r>
+            <w:proofErr w:type="spellEnd"/>
+            <w:r>
+              <w:rPr>
+                <w:sz w:val="18"/>
+                <w:szCs w:val="18"/>
+              </w:rPr>
+              <w:t>) but not visible in the GUI (Card details)</w:t>
             </w:r>
           </w:p>
         </w:tc>
@@ -11843,33 +13862,22 @@
     <w:p>
       <w:pPr>
         <w:rPr>
-          <w:lang w:val="en-US"/>
-        </w:rPr>
-      </w:pPr>
-    </w:p>
-    <w:p>
-      <w:pPr>
-        <w:rPr>
           <w:b/>
           <w:lang w:val="fr-CH"/>
         </w:rPr>
       </w:pPr>
       <w:bookmarkStart w:id="31" w:name="_Toc461179225"/>
-      <w:r>
-        <w:rPr>
-          <w:lang w:val="fr-CH"/>
-        </w:rPr>
-        <w:lastRenderedPageBreak/>
-        <w:br w:type="page"/>
-      </w:r>
     </w:p>
     <w:p>
       <w:pPr>
         <w:pStyle w:val="Titolo2"/>
+        <w:numPr>
+          <w:ilvl w:val="1"/>
+          <w:numId w:val="42"/>
+        </w:numPr>
       </w:pPr>
       <w:bookmarkStart w:id="32" w:name="_Toc94790462"/>
       <w:r>
-        <w:lastRenderedPageBreak/>
         <w:t>Risultati test</w:t>
       </w:r>
       <w:bookmarkEnd w:id="31"/>
@@ -11891,6 +13899,10 @@
     <w:p>
       <w:pPr>
         <w:pStyle w:val="Titolo2"/>
+        <w:numPr>
+          <w:ilvl w:val="1"/>
+          <w:numId w:val="42"/>
+        </w:numPr>
       </w:pPr>
       <w:bookmarkStart w:id="33" w:name="_Toc461179226"/>
       <w:bookmarkStart w:id="34" w:name="_Toc94790463"/>
@@ -11919,6 +13931,10 @@
     <w:p>
       <w:pPr>
         <w:pStyle w:val="Titolo1"/>
+        <w:numPr>
+          <w:ilvl w:val="0"/>
+          <w:numId w:val="42"/>
+        </w:numPr>
         <w:rPr>
           <w:lang w:val="it-IT"/>
         </w:rPr>
@@ -11956,7 +13972,14 @@
         <w:rPr>
           <w:lang w:val="it-IT"/>
         </w:rPr>
-        <w:t xml:space="preserve"> 1.7) (ad esempio Gan</w:t>
+        <w:t xml:space="preserve"> 1.7) (ad esempio </w:t>
+      </w:r>
+      <w:proofErr w:type="spellStart"/>
+      <w:r>
+        <w:rPr>
+          <w:lang w:val="it-IT"/>
+        </w:rPr>
+        <w:t>Gan</w:t>
       </w:r>
       <w:r>
         <w:rPr>
@@ -11968,12 +13991,23 @@
         <w:rPr>
           <w:lang w:val="it-IT"/>
         </w:rPr>
-        <w:t>t consuntivo).</w:t>
+        <w:t>t</w:t>
+      </w:r>
+      <w:proofErr w:type="spellEnd"/>
+      <w:r>
+        <w:rPr>
+          <w:lang w:val="it-IT"/>
+        </w:rPr>
+        <w:t xml:space="preserve"> consuntivo).</w:t>
       </w:r>
     </w:p>
     <w:p>
       <w:pPr>
         <w:pStyle w:val="Titolo1"/>
+        <w:numPr>
+          <w:ilvl w:val="0"/>
+          <w:numId w:val="42"/>
+        </w:numPr>
         <w:rPr>
           <w:lang w:val="it-IT"/>
         </w:rPr>
@@ -11984,6 +14018,7 @@
         <w:rPr>
           <w:lang w:val="it-IT"/>
         </w:rPr>
+        <w:lastRenderedPageBreak/>
         <w:t>Conclusioni</w:t>
       </w:r>
       <w:bookmarkEnd w:id="37"/>
@@ -12077,6 +14112,10 @@
     <w:p>
       <w:pPr>
         <w:pStyle w:val="Titolo2"/>
+        <w:numPr>
+          <w:ilvl w:val="1"/>
+          <w:numId w:val="42"/>
+        </w:numPr>
       </w:pPr>
       <w:bookmarkStart w:id="39" w:name="_Toc461179229"/>
       <w:bookmarkStart w:id="40" w:name="_Toc94790466"/>
@@ -12102,6 +14141,10 @@
     <w:p>
       <w:pPr>
         <w:pStyle w:val="Titolo2"/>
+        <w:numPr>
+          <w:ilvl w:val="1"/>
+          <w:numId w:val="42"/>
+        </w:numPr>
       </w:pPr>
       <w:bookmarkStart w:id="41" w:name="_Toc461179230"/>
       <w:bookmarkStart w:id="42" w:name="_Toc94790467"/>
@@ -12133,6 +14176,10 @@
     <w:p>
       <w:pPr>
         <w:pStyle w:val="Titolo1"/>
+        <w:numPr>
+          <w:ilvl w:val="0"/>
+          <w:numId w:val="42"/>
+        </w:numPr>
         <w:rPr>
           <w:lang w:val="it-IT"/>
         </w:rPr>
@@ -12265,6 +14312,7 @@
             <w:pPr>
               <w:jc w:val="both"/>
             </w:pPr>
+            <w:proofErr w:type="spellStart"/>
             <w:r>
               <w:rPr>
                 <w:b/>
@@ -12272,6 +14320,7 @@
               </w:rPr>
               <w:t>Asynchronous</w:t>
             </w:r>
+            <w:proofErr w:type="spellEnd"/>
             <w:r>
               <w:rPr>
                 <w:b/>
@@ -12317,13 +14366,31 @@
                 <w:bCs/>
               </w:rPr>
             </w:pPr>
+            <w:proofErr w:type="spellStart"/>
             <w:r>
               <w:rPr>
                 <w:b/>
                 <w:bCs/>
               </w:rPr>
-              <w:t>Cascading Style Sheets</w:t>
+              <w:t>Cascading</w:t>
             </w:r>
+            <w:proofErr w:type="spellEnd"/>
+            <w:r>
+              <w:rPr>
+                <w:b/>
+                <w:bCs/>
+              </w:rPr>
+              <w:t xml:space="preserve"> Style </w:t>
+            </w:r>
+            <w:proofErr w:type="spellStart"/>
+            <w:r>
+              <w:rPr>
+                <w:b/>
+                <w:bCs/>
+              </w:rPr>
+              <w:t>Sheets</w:t>
+            </w:r>
+            <w:proofErr w:type="spellEnd"/>
             <w:r>
               <w:t>: linguaggio che per</w:t>
             </w:r>
@@ -12362,6 +14429,10 @@
     <w:p>
       <w:pPr>
         <w:pStyle w:val="Titolo1"/>
+        <w:numPr>
+          <w:ilvl w:val="0"/>
+          <w:numId w:val="42"/>
+        </w:numPr>
         <w:rPr>
           <w:lang w:val="it-IT"/>
         </w:rPr>
@@ -12378,6 +14449,10 @@
     <w:p>
       <w:pPr>
         <w:pStyle w:val="Titolo2"/>
+        <w:numPr>
+          <w:ilvl w:val="1"/>
+          <w:numId w:val="42"/>
+        </w:numPr>
       </w:pPr>
       <w:bookmarkStart w:id="46" w:name="_Toc94790470"/>
       <w:r>
@@ -12492,6 +14567,10 @@
     <w:p>
       <w:pPr>
         <w:pStyle w:val="Titolo2"/>
+        <w:numPr>
+          <w:ilvl w:val="1"/>
+          <w:numId w:val="42"/>
+        </w:numPr>
       </w:pPr>
       <w:bookmarkStart w:id="47" w:name="_Toc461179233"/>
       <w:bookmarkStart w:id="48" w:name="_Toc94790471"/>
@@ -12545,11 +14624,19 @@
           <w:lang w:val="it-IT"/>
         </w:rPr>
       </w:pPr>
-      <w:r>
-        <w:rPr>
-          <w:lang w:val="it-IT"/>
-        </w:rPr>
-        <w:t>ev. Numero di edizione,</w:t>
+      <w:proofErr w:type="spellStart"/>
+      <w:r>
+        <w:rPr>
+          <w:lang w:val="it-IT"/>
+        </w:rPr>
+        <w:t>ev</w:t>
+      </w:r>
+      <w:proofErr w:type="spellEnd"/>
+      <w:r>
+        <w:rPr>
+          <w:lang w:val="it-IT"/>
+        </w:rPr>
+        <w:t>. Numero di edizione,</w:t>
       </w:r>
     </w:p>
     <w:p>
@@ -12621,6 +14708,10 @@
     <w:p>
       <w:pPr>
         <w:pStyle w:val="Titolo2"/>
+        <w:numPr>
+          <w:ilvl w:val="1"/>
+          <w:numId w:val="42"/>
+        </w:numPr>
       </w:pPr>
       <w:bookmarkStart w:id="50" w:name="_Toc94790472"/>
       <w:r>
@@ -12649,7 +14740,21 @@
         <w:rPr>
           <w:lang w:val="it-IT"/>
         </w:rPr>
-        <w:t xml:space="preserve"> (se troppo lungo solo dominio, evt completo nel diario)</w:t>
+        <w:t xml:space="preserve"> (se troppo lungo solo dominio, </w:t>
+      </w:r>
+      <w:proofErr w:type="spellStart"/>
+      <w:r>
+        <w:rPr>
+          <w:lang w:val="it-IT"/>
+        </w:rPr>
+        <w:t>evt</w:t>
+      </w:r>
+      <w:proofErr w:type="spellEnd"/>
+      <w:r>
+        <w:rPr>
+          <w:lang w:val="it-IT"/>
+        </w:rPr>
+        <w:t xml:space="preserve"> completo nel diario)</w:t>
       </w:r>
       <w:r>
         <w:rPr>
@@ -12767,6 +14872,10 @@
     <w:p>
       <w:pPr>
         <w:pStyle w:val="Titolo1"/>
+        <w:numPr>
+          <w:ilvl w:val="0"/>
+          <w:numId w:val="42"/>
+        </w:numPr>
         <w:rPr>
           <w:lang w:val="it-IT"/>
         </w:rPr>
@@ -12912,7 +15021,14 @@
         <w:rPr>
           <w:lang w:val="it-IT"/>
         </w:rPr>
-        <w:t>Mandato e/o Qd</w:t>
+        <w:t xml:space="preserve">Mandato e/o </w:t>
+      </w:r>
+      <w:proofErr w:type="spellStart"/>
+      <w:r>
+        <w:rPr>
+          <w:lang w:val="it-IT"/>
+        </w:rPr>
+        <w:t>Qd</w:t>
       </w:r>
       <w:r>
         <w:rPr>
@@ -12920,6 +15036,7 @@
         </w:rPr>
         <w:t>C</w:t>
       </w:r>
+      <w:proofErr w:type="spellEnd"/>
     </w:p>
     <w:p>
       <w:pPr>
@@ -12953,10 +15070,10 @@
       </w:pPr>
     </w:p>
     <w:sectPr>
-      <w:headerReference w:type="default" r:id="rId19"/>
-      <w:footerReference w:type="default" r:id="rId20"/>
-      <w:headerReference w:type="first" r:id="rId21"/>
-      <w:footerReference w:type="first" r:id="rId22"/>
+      <w:headerReference w:type="default" r:id="rId23"/>
+      <w:footerReference w:type="default" r:id="rId24"/>
+      <w:headerReference w:type="first" r:id="rId25"/>
+      <w:footerReference w:type="first" r:id="rId26"/>
       <w:pgSz w:w="11906" w:h="16838"/>
       <w:pgMar w:top="1985" w:right="1134" w:bottom="1418" w:left="1134" w:header="567" w:footer="567" w:gutter="0"/>
       <w:pgNumType w:start="1"/>
@@ -12993,8 +15110,13 @@
       <w:pStyle w:val="Pidipagina"/>
     </w:pPr>
     <w:r>
-      <w:t>Linda Bytyqi</w:t>
+      <w:t xml:space="preserve">Linda </w:t>
     </w:r>
+    <w:proofErr w:type="spellStart"/>
+    <w:r>
+      <w:t>Bytyqi</w:t>
+    </w:r>
+    <w:proofErr w:type="spellEnd"/>
     <w:r>
       <w:tab/>
     </w:r>
@@ -13104,8 +15226,16 @@
             <w:rPr>
               <w:lang w:val="it-IT"/>
             </w:rPr>
-            <w:t>Linda Bytyqi</w:t>
+            <w:t xml:space="preserve">Linda </w:t>
           </w:r>
+          <w:proofErr w:type="spellStart"/>
+          <w:r>
+            <w:rPr>
+              <w:lang w:val="it-IT"/>
+            </w:rPr>
+            <w:t>Bytyqi</w:t>
+          </w:r>
+          <w:proofErr w:type="spellEnd"/>
         </w:p>
       </w:tc>
     </w:tr>
@@ -13260,6 +15390,43 @@
     <w:p>
       <w:r>
         <w:continuationSeparator/>
+      </w:r>
+    </w:p>
+  </w:footnote>
+  <w:footnote w:id="1">
+    <w:p>
+      <w:pPr>
+        <w:pStyle w:val="Testonotaapidipagina"/>
+        <w:rPr>
+          <w:lang w:val="fr-CH"/>
+        </w:rPr>
+      </w:pPr>
+      <w:r>
+        <w:rPr>
+          <w:rStyle w:val="Rimandonotaapidipagina"/>
+        </w:rPr>
+        <w:footnoteRef/>
+      </w:r>
+      <w:r>
+        <w:t xml:space="preserve"> </w:t>
+      </w:r>
+      <w:proofErr w:type="spellStart"/>
+      <w:r>
+        <w:rPr>
+          <w:sz w:val="16"/>
+          <w:szCs w:val="16"/>
+          <w:lang w:val="fr-CH"/>
+        </w:rPr>
+        <w:t>Astronomy</w:t>
+      </w:r>
+      <w:proofErr w:type="spellEnd"/>
+      <w:r>
+        <w:rPr>
+          <w:sz w:val="16"/>
+          <w:szCs w:val="16"/>
+          <w:lang w:val="fr-CH"/>
+        </w:rPr>
+        <w:t xml:space="preserve"> Picture of the Day</w:t>
       </w:r>
     </w:p>
   </w:footnote>
@@ -15430,6 +17597,119 @@
     </w:lvl>
   </w:abstractNum>
   <w:abstractNum w:abstractNumId="12" w15:restartNumberingAfterBreak="0">
+    <w:nsid w:val="2A3C7E68"/>
+    <w:multiLevelType w:val="multilevel"/>
+    <w:tmpl w:val="5FD282AA"/>
+    <w:lvl w:ilvl="0">
+      <w:start w:val="4"/>
+      <w:numFmt w:val="decimal"/>
+      <w:lvlText w:val="%1"/>
+      <w:lvlJc w:val="left"/>
+      <w:pPr>
+        <w:ind w:left="435" w:hanging="435"/>
+      </w:pPr>
+      <w:rPr>
+        <w:rFonts w:hint="default"/>
+      </w:rPr>
+    </w:lvl>
+    <w:lvl w:ilvl="1">
+      <w:start w:val="1"/>
+      <w:numFmt w:val="decimal"/>
+      <w:lvlText w:val="%1.%2"/>
+      <w:lvlJc w:val="left"/>
+      <w:pPr>
+        <w:ind w:left="435" w:hanging="435"/>
+      </w:pPr>
+      <w:rPr>
+        <w:rFonts w:hint="default"/>
+      </w:rPr>
+    </w:lvl>
+    <w:lvl w:ilvl="2">
+      <w:start w:val="1"/>
+      <w:numFmt w:val="decimal"/>
+      <w:lvlText w:val="%1.%2.%3"/>
+      <w:lvlJc w:val="left"/>
+      <w:pPr>
+        <w:ind w:left="720" w:hanging="720"/>
+      </w:pPr>
+      <w:rPr>
+        <w:rFonts w:hint="default"/>
+      </w:rPr>
+    </w:lvl>
+    <w:lvl w:ilvl="3">
+      <w:start w:val="1"/>
+      <w:numFmt w:val="decimal"/>
+      <w:lvlText w:val="%1.%2.%3.%4"/>
+      <w:lvlJc w:val="left"/>
+      <w:pPr>
+        <w:ind w:left="720" w:hanging="720"/>
+      </w:pPr>
+      <w:rPr>
+        <w:rFonts w:hint="default"/>
+      </w:rPr>
+    </w:lvl>
+    <w:lvl w:ilvl="4">
+      <w:start w:val="1"/>
+      <w:numFmt w:val="decimal"/>
+      <w:lvlText w:val="%1.%2.%3.%4.%5"/>
+      <w:lvlJc w:val="left"/>
+      <w:pPr>
+        <w:ind w:left="1080" w:hanging="1080"/>
+      </w:pPr>
+      <w:rPr>
+        <w:rFonts w:hint="default"/>
+      </w:rPr>
+    </w:lvl>
+    <w:lvl w:ilvl="5">
+      <w:start w:val="1"/>
+      <w:numFmt w:val="decimal"/>
+      <w:lvlText w:val="%1.%2.%3.%4.%5.%6"/>
+      <w:lvlJc w:val="left"/>
+      <w:pPr>
+        <w:ind w:left="1080" w:hanging="1080"/>
+      </w:pPr>
+      <w:rPr>
+        <w:rFonts w:hint="default"/>
+      </w:rPr>
+    </w:lvl>
+    <w:lvl w:ilvl="6">
+      <w:start w:val="1"/>
+      <w:numFmt w:val="decimal"/>
+      <w:lvlText w:val="%1.%2.%3.%4.%5.%6.%7"/>
+      <w:lvlJc w:val="left"/>
+      <w:pPr>
+        <w:ind w:left="1440" w:hanging="1440"/>
+      </w:pPr>
+      <w:rPr>
+        <w:rFonts w:hint="default"/>
+      </w:rPr>
+    </w:lvl>
+    <w:lvl w:ilvl="7">
+      <w:start w:val="1"/>
+      <w:numFmt w:val="decimal"/>
+      <w:lvlText w:val="%1.%2.%3.%4.%5.%6.%7.%8"/>
+      <w:lvlJc w:val="left"/>
+      <w:pPr>
+        <w:ind w:left="1440" w:hanging="1440"/>
+      </w:pPr>
+      <w:rPr>
+        <w:rFonts w:hint="default"/>
+      </w:rPr>
+    </w:lvl>
+    <w:lvl w:ilvl="8">
+      <w:start w:val="1"/>
+      <w:numFmt w:val="decimal"/>
+      <w:lvlText w:val="%1.%2.%3.%4.%5.%6.%7.%8.%9"/>
+      <w:lvlJc w:val="left"/>
+      <w:pPr>
+        <w:ind w:left="1800" w:hanging="1800"/>
+      </w:pPr>
+      <w:rPr>
+        <w:rFonts w:hint="default"/>
+      </w:rPr>
+    </w:lvl>
+  </w:abstractNum>
+  <w:abstractNum w:abstractNumId="13" w15:restartNumberingAfterBreak="0">
     <w:nsid w:val="329F3EE5"/>
     <w:multiLevelType w:val="hybridMultilevel"/>
     <w:tmpl w:val="3DA89F94"/>
@@ -15542,7 +17822,120 @@
       </w:rPr>
     </w:lvl>
   </w:abstractNum>
-  <w:abstractNum w:abstractNumId="13" w15:restartNumberingAfterBreak="0">
+  <w:abstractNum w:abstractNumId="14" w15:restartNumberingAfterBreak="0">
+    <w:nsid w:val="3495663A"/>
+    <w:multiLevelType w:val="multilevel"/>
+    <w:tmpl w:val="345655CE"/>
+    <w:lvl w:ilvl="0">
+      <w:start w:val="4"/>
+      <w:numFmt w:val="decimal"/>
+      <w:lvlText w:val="%1."/>
+      <w:lvlJc w:val="left"/>
+      <w:pPr>
+        <w:ind w:left="360" w:hanging="360"/>
+      </w:pPr>
+      <w:rPr>
+        <w:rFonts w:hint="default"/>
+      </w:rPr>
+    </w:lvl>
+    <w:lvl w:ilvl="1">
+      <w:start w:val="3"/>
+      <w:numFmt w:val="decimal"/>
+      <w:lvlText w:val="%1.%2."/>
+      <w:lvlJc w:val="left"/>
+      <w:pPr>
+        <w:ind w:left="360" w:hanging="360"/>
+      </w:pPr>
+      <w:rPr>
+        <w:rFonts w:hint="default"/>
+      </w:rPr>
+    </w:lvl>
+    <w:lvl w:ilvl="2">
+      <w:start w:val="1"/>
+      <w:numFmt w:val="decimal"/>
+      <w:lvlText w:val="%1.%2.%3."/>
+      <w:lvlJc w:val="left"/>
+      <w:pPr>
+        <w:ind w:left="720" w:hanging="720"/>
+      </w:pPr>
+      <w:rPr>
+        <w:rFonts w:hint="default"/>
+      </w:rPr>
+    </w:lvl>
+    <w:lvl w:ilvl="3">
+      <w:start w:val="1"/>
+      <w:numFmt w:val="decimal"/>
+      <w:lvlText w:val="%1.%2.%3.%4."/>
+      <w:lvlJc w:val="left"/>
+      <w:pPr>
+        <w:ind w:left="720" w:hanging="720"/>
+      </w:pPr>
+      <w:rPr>
+        <w:rFonts w:hint="default"/>
+      </w:rPr>
+    </w:lvl>
+    <w:lvl w:ilvl="4">
+      <w:start w:val="1"/>
+      <w:numFmt w:val="decimal"/>
+      <w:lvlText w:val="%1.%2.%3.%4.%5."/>
+      <w:lvlJc w:val="left"/>
+      <w:pPr>
+        <w:ind w:left="1080" w:hanging="1080"/>
+      </w:pPr>
+      <w:rPr>
+        <w:rFonts w:hint="default"/>
+      </w:rPr>
+    </w:lvl>
+    <w:lvl w:ilvl="5">
+      <w:start w:val="1"/>
+      <w:numFmt w:val="decimal"/>
+      <w:lvlText w:val="%1.%2.%3.%4.%5.%6."/>
+      <w:lvlJc w:val="left"/>
+      <w:pPr>
+        <w:ind w:left="1080" w:hanging="1080"/>
+      </w:pPr>
+      <w:rPr>
+        <w:rFonts w:hint="default"/>
+      </w:rPr>
+    </w:lvl>
+    <w:lvl w:ilvl="6">
+      <w:start w:val="1"/>
+      <w:numFmt w:val="decimal"/>
+      <w:lvlText w:val="%1.%2.%3.%4.%5.%6.%7."/>
+      <w:lvlJc w:val="left"/>
+      <w:pPr>
+        <w:ind w:left="1440" w:hanging="1440"/>
+      </w:pPr>
+      <w:rPr>
+        <w:rFonts w:hint="default"/>
+      </w:rPr>
+    </w:lvl>
+    <w:lvl w:ilvl="7">
+      <w:start w:val="1"/>
+      <w:numFmt w:val="decimal"/>
+      <w:lvlText w:val="%1.%2.%3.%4.%5.%6.%7.%8."/>
+      <w:lvlJc w:val="left"/>
+      <w:pPr>
+        <w:ind w:left="1440" w:hanging="1440"/>
+      </w:pPr>
+      <w:rPr>
+        <w:rFonts w:hint="default"/>
+      </w:rPr>
+    </w:lvl>
+    <w:lvl w:ilvl="8">
+      <w:start w:val="1"/>
+      <w:numFmt w:val="decimal"/>
+      <w:lvlText w:val="%1.%2.%3.%4.%5.%6.%7.%8.%9."/>
+      <w:lvlJc w:val="left"/>
+      <w:pPr>
+        <w:ind w:left="1800" w:hanging="1800"/>
+      </w:pPr>
+      <w:rPr>
+        <w:rFonts w:hint="default"/>
+      </w:rPr>
+    </w:lvl>
+  </w:abstractNum>
+  <w:abstractNum w:abstractNumId="15" w15:restartNumberingAfterBreak="0">
     <w:nsid w:val="39C27C0B"/>
     <w:multiLevelType w:val="multilevel"/>
     <w:tmpl w:val="013EE49A"/>
@@ -15691,7 +18084,7 @@
       </w:rPr>
     </w:lvl>
   </w:abstractNum>
-  <w:abstractNum w:abstractNumId="14" w15:restartNumberingAfterBreak="0">
+  <w:abstractNum w:abstractNumId="16" w15:restartNumberingAfterBreak="0">
     <w:nsid w:val="4C504BEF"/>
     <w:multiLevelType w:val="multilevel"/>
     <w:tmpl w:val="BB10D4E2"/>
@@ -15840,10 +18233,123 @@
       </w:rPr>
     </w:lvl>
   </w:abstractNum>
-  <w:abstractNum w:abstractNumId="15" w15:restartNumberingAfterBreak="0">
+  <w:abstractNum w:abstractNumId="17" w15:restartNumberingAfterBreak="0">
+    <w:nsid w:val="4DAA458B"/>
+    <w:multiLevelType w:val="multilevel"/>
+    <w:tmpl w:val="645EE3A2"/>
+    <w:lvl w:ilvl="0">
+      <w:start w:val="4"/>
+      <w:numFmt w:val="decimal"/>
+      <w:lvlText w:val="%1"/>
+      <w:lvlJc w:val="left"/>
+      <w:pPr>
+        <w:ind w:left="435" w:hanging="435"/>
+      </w:pPr>
+      <w:rPr>
+        <w:rFonts w:hint="default"/>
+      </w:rPr>
+    </w:lvl>
+    <w:lvl w:ilvl="1">
+      <w:start w:val="3"/>
+      <w:numFmt w:val="decimal"/>
+      <w:lvlText w:val="%1.%2"/>
+      <w:lvlJc w:val="left"/>
+      <w:pPr>
+        <w:ind w:left="435" w:hanging="435"/>
+      </w:pPr>
+      <w:rPr>
+        <w:rFonts w:hint="default"/>
+      </w:rPr>
+    </w:lvl>
+    <w:lvl w:ilvl="2">
+      <w:start w:val="1"/>
+      <w:numFmt w:val="decimal"/>
+      <w:lvlText w:val="%1.%2.%3"/>
+      <w:lvlJc w:val="left"/>
+      <w:pPr>
+        <w:ind w:left="720" w:hanging="720"/>
+      </w:pPr>
+      <w:rPr>
+        <w:rFonts w:hint="default"/>
+      </w:rPr>
+    </w:lvl>
+    <w:lvl w:ilvl="3">
+      <w:start w:val="1"/>
+      <w:numFmt w:val="decimal"/>
+      <w:lvlText w:val="%1.%2.%3.%4"/>
+      <w:lvlJc w:val="left"/>
+      <w:pPr>
+        <w:ind w:left="720" w:hanging="720"/>
+      </w:pPr>
+      <w:rPr>
+        <w:rFonts w:hint="default"/>
+      </w:rPr>
+    </w:lvl>
+    <w:lvl w:ilvl="4">
+      <w:start w:val="1"/>
+      <w:numFmt w:val="decimal"/>
+      <w:lvlText w:val="%1.%2.%3.%4.%5"/>
+      <w:lvlJc w:val="left"/>
+      <w:pPr>
+        <w:ind w:left="1080" w:hanging="1080"/>
+      </w:pPr>
+      <w:rPr>
+        <w:rFonts w:hint="default"/>
+      </w:rPr>
+    </w:lvl>
+    <w:lvl w:ilvl="5">
+      <w:start w:val="1"/>
+      <w:numFmt w:val="decimal"/>
+      <w:lvlText w:val="%1.%2.%3.%4.%5.%6"/>
+      <w:lvlJc w:val="left"/>
+      <w:pPr>
+        <w:ind w:left="1080" w:hanging="1080"/>
+      </w:pPr>
+      <w:rPr>
+        <w:rFonts w:hint="default"/>
+      </w:rPr>
+    </w:lvl>
+    <w:lvl w:ilvl="6">
+      <w:start w:val="1"/>
+      <w:numFmt w:val="decimal"/>
+      <w:lvlText w:val="%1.%2.%3.%4.%5.%6.%7"/>
+      <w:lvlJc w:val="left"/>
+      <w:pPr>
+        <w:ind w:left="1440" w:hanging="1440"/>
+      </w:pPr>
+      <w:rPr>
+        <w:rFonts w:hint="default"/>
+      </w:rPr>
+    </w:lvl>
+    <w:lvl w:ilvl="7">
+      <w:start w:val="1"/>
+      <w:numFmt w:val="decimal"/>
+      <w:lvlText w:val="%1.%2.%3.%4.%5.%6.%7.%8"/>
+      <w:lvlJc w:val="left"/>
+      <w:pPr>
+        <w:ind w:left="1440" w:hanging="1440"/>
+      </w:pPr>
+      <w:rPr>
+        <w:rFonts w:hint="default"/>
+      </w:rPr>
+    </w:lvl>
+    <w:lvl w:ilvl="8">
+      <w:start w:val="1"/>
+      <w:numFmt w:val="decimal"/>
+      <w:lvlText w:val="%1.%2.%3.%4.%5.%6.%7.%8.%9"/>
+      <w:lvlJc w:val="left"/>
+      <w:pPr>
+        <w:ind w:left="1800" w:hanging="1800"/>
+      </w:pPr>
+      <w:rPr>
+        <w:rFonts w:hint="default"/>
+      </w:rPr>
+    </w:lvl>
+  </w:abstractNum>
+  <w:abstractNum w:abstractNumId="18" w15:restartNumberingAfterBreak="0">
     <w:nsid w:val="57C86EE7"/>
     <w:multiLevelType w:val="multilevel"/>
-    <w:tmpl w:val="4DE6CDEC"/>
+    <w:tmpl w:val="07AE1822"/>
     <w:lvl w:ilvl="0">
       <w:start w:val="1"/>
       <w:numFmt w:val="decimal"/>
@@ -15862,9 +18368,9 @@
     </w:lvl>
     <w:lvl w:ilvl="1">
       <w:start w:val="1"/>
-      <w:numFmt w:val="decimal"/>
+      <w:numFmt w:val="none"/>
       <w:pStyle w:val="Titolo2"/>
-      <w:lvlText w:val="%1.%2"/>
+      <w:lvlText w:val="4.2.1"/>
       <w:lvlJc w:val="left"/>
       <w:pPr>
         <w:tabs>
@@ -15989,7 +18495,120 @@
       </w:rPr>
     </w:lvl>
   </w:abstractNum>
-  <w:abstractNum w:abstractNumId="16" w15:restartNumberingAfterBreak="0">
+  <w:abstractNum w:abstractNumId="19" w15:restartNumberingAfterBreak="0">
+    <w:nsid w:val="5C365668"/>
+    <w:multiLevelType w:val="multilevel"/>
+    <w:tmpl w:val="3362AC8E"/>
+    <w:lvl w:ilvl="0">
+      <w:start w:val="4"/>
+      <w:numFmt w:val="decimal"/>
+      <w:lvlText w:val="%1"/>
+      <w:lvlJc w:val="left"/>
+      <w:pPr>
+        <w:ind w:left="435" w:hanging="435"/>
+      </w:pPr>
+      <w:rPr>
+        <w:rFonts w:hint="default"/>
+      </w:rPr>
+    </w:lvl>
+    <w:lvl w:ilvl="1">
+      <w:start w:val="4"/>
+      <w:numFmt w:val="decimal"/>
+      <w:lvlText w:val="%1.%2"/>
+      <w:lvlJc w:val="left"/>
+      <w:pPr>
+        <w:ind w:left="435" w:hanging="435"/>
+      </w:pPr>
+      <w:rPr>
+        <w:rFonts w:hint="default"/>
+      </w:rPr>
+    </w:lvl>
+    <w:lvl w:ilvl="2">
+      <w:start w:val="1"/>
+      <w:numFmt w:val="decimal"/>
+      <w:lvlText w:val="%1.%2.%3"/>
+      <w:lvlJc w:val="left"/>
+      <w:pPr>
+        <w:ind w:left="720" w:hanging="720"/>
+      </w:pPr>
+      <w:rPr>
+        <w:rFonts w:hint="default"/>
+      </w:rPr>
+    </w:lvl>
+    <w:lvl w:ilvl="3">
+      <w:start w:val="1"/>
+      <w:numFmt w:val="decimal"/>
+      <w:lvlText w:val="%1.%2.%3.%4"/>
+      <w:lvlJc w:val="left"/>
+      <w:pPr>
+        <w:ind w:left="720" w:hanging="720"/>
+      </w:pPr>
+      <w:rPr>
+        <w:rFonts w:hint="default"/>
+      </w:rPr>
+    </w:lvl>
+    <w:lvl w:ilvl="4">
+      <w:start w:val="1"/>
+      <w:numFmt w:val="decimal"/>
+      <w:lvlText w:val="%1.%2.%3.%4.%5"/>
+      <w:lvlJc w:val="left"/>
+      <w:pPr>
+        <w:ind w:left="1080" w:hanging="1080"/>
+      </w:pPr>
+      <w:rPr>
+        <w:rFonts w:hint="default"/>
+      </w:rPr>
+    </w:lvl>
+    <w:lvl w:ilvl="5">
+      <w:start w:val="1"/>
+      <w:numFmt w:val="decimal"/>
+      <w:lvlText w:val="%1.%2.%3.%4.%5.%6"/>
+      <w:lvlJc w:val="left"/>
+      <w:pPr>
+        <w:ind w:left="1080" w:hanging="1080"/>
+      </w:pPr>
+      <w:rPr>
+        <w:rFonts w:hint="default"/>
+      </w:rPr>
+    </w:lvl>
+    <w:lvl w:ilvl="6">
+      <w:start w:val="1"/>
+      <w:numFmt w:val="decimal"/>
+      <w:lvlText w:val="%1.%2.%3.%4.%5.%6.%7"/>
+      <w:lvlJc w:val="left"/>
+      <w:pPr>
+        <w:ind w:left="1440" w:hanging="1440"/>
+      </w:pPr>
+      <w:rPr>
+        <w:rFonts w:hint="default"/>
+      </w:rPr>
+    </w:lvl>
+    <w:lvl w:ilvl="7">
+      <w:start w:val="1"/>
+      <w:numFmt w:val="decimal"/>
+      <w:lvlText w:val="%1.%2.%3.%4.%5.%6.%7.%8"/>
+      <w:lvlJc w:val="left"/>
+      <w:pPr>
+        <w:ind w:left="1440" w:hanging="1440"/>
+      </w:pPr>
+      <w:rPr>
+        <w:rFonts w:hint="default"/>
+      </w:rPr>
+    </w:lvl>
+    <w:lvl w:ilvl="8">
+      <w:start w:val="1"/>
+      <w:numFmt w:val="decimal"/>
+      <w:lvlText w:val="%1.%2.%3.%4.%5.%6.%7.%8.%9"/>
+      <w:lvlJc w:val="left"/>
+      <w:pPr>
+        <w:ind w:left="1800" w:hanging="1800"/>
+      </w:pPr>
+      <w:rPr>
+        <w:rFonts w:hint="default"/>
+      </w:rPr>
+    </w:lvl>
+  </w:abstractNum>
+  <w:abstractNum w:abstractNumId="20" w15:restartNumberingAfterBreak="0">
     <w:nsid w:val="5F4A5F69"/>
     <w:multiLevelType w:val="multilevel"/>
     <w:tmpl w:val="3272BCCA"/>
@@ -16138,7 +18757,7 @@
       </w:rPr>
     </w:lvl>
   </w:abstractNum>
-  <w:abstractNum w:abstractNumId="17" w15:restartNumberingAfterBreak="0">
+  <w:abstractNum w:abstractNumId="21" w15:restartNumberingAfterBreak="0">
     <w:nsid w:val="652809B9"/>
     <w:multiLevelType w:val="hybridMultilevel"/>
     <w:tmpl w:val="C10EC632"/>
@@ -16251,7 +18870,147 @@
       </w:rPr>
     </w:lvl>
   </w:abstractNum>
-  <w:abstractNum w:abstractNumId="18" w15:restartNumberingAfterBreak="0">
+  <w:abstractNum w:abstractNumId="22" w15:restartNumberingAfterBreak="0">
+    <w:nsid w:val="66867FD0"/>
+    <w:multiLevelType w:val="multilevel"/>
+    <w:tmpl w:val="AF70F744"/>
+    <w:lvl w:ilvl="0">
+      <w:start w:val="1"/>
+      <w:numFmt w:val="decimal"/>
+      <w:lvlText w:val="%1"/>
+      <w:lvlJc w:val="left"/>
+      <w:pPr>
+        <w:tabs>
+          <w:tab w:val="num" w:pos="432"/>
+        </w:tabs>
+        <w:ind w:left="432" w:hanging="432"/>
+      </w:pPr>
+      <w:rPr>
+        <w:rFonts w:hint="default"/>
+      </w:rPr>
+    </w:lvl>
+    <w:lvl w:ilvl="1">
+      <w:start w:val="1"/>
+      <w:numFmt w:val="none"/>
+      <w:lvlText w:val="4.1.1"/>
+      <w:lvlJc w:val="left"/>
+      <w:pPr>
+        <w:tabs>
+          <w:tab w:val="num" w:pos="576"/>
+        </w:tabs>
+        <w:ind w:left="576" w:hanging="576"/>
+      </w:pPr>
+      <w:rPr>
+        <w:rFonts w:hint="default"/>
+      </w:rPr>
+    </w:lvl>
+    <w:lvl w:ilvl="2">
+      <w:start w:val="1"/>
+      <w:numFmt w:val="decimal"/>
+      <w:lvlText w:val="%1.%2.%3"/>
+      <w:lvlJc w:val="left"/>
+      <w:pPr>
+        <w:tabs>
+          <w:tab w:val="num" w:pos="720"/>
+        </w:tabs>
+        <w:ind w:left="720" w:hanging="720"/>
+      </w:pPr>
+      <w:rPr>
+        <w:rFonts w:hint="default"/>
+      </w:rPr>
+    </w:lvl>
+    <w:lvl w:ilvl="3">
+      <w:start w:val="1"/>
+      <w:numFmt w:val="decimal"/>
+      <w:lvlText w:val="%1.%2.%3.%4"/>
+      <w:lvlJc w:val="left"/>
+      <w:pPr>
+        <w:tabs>
+          <w:tab w:val="num" w:pos="864"/>
+        </w:tabs>
+        <w:ind w:left="864" w:hanging="864"/>
+      </w:pPr>
+      <w:rPr>
+        <w:rFonts w:hint="default"/>
+      </w:rPr>
+    </w:lvl>
+    <w:lvl w:ilvl="4">
+      <w:start w:val="1"/>
+      <w:numFmt w:val="decimal"/>
+      <w:lvlText w:val="%1.%2.%3.%4.%5"/>
+      <w:lvlJc w:val="left"/>
+      <w:pPr>
+        <w:tabs>
+          <w:tab w:val="num" w:pos="1008"/>
+        </w:tabs>
+        <w:ind w:left="1008" w:hanging="1008"/>
+      </w:pPr>
+      <w:rPr>
+        <w:rFonts w:hint="default"/>
+      </w:rPr>
+    </w:lvl>
+    <w:lvl w:ilvl="5">
+      <w:start w:val="1"/>
+      <w:numFmt w:val="decimal"/>
+      <w:lvlText w:val="%1.%2.%3.%4.%5.%6"/>
+      <w:lvlJc w:val="left"/>
+      <w:pPr>
+        <w:tabs>
+          <w:tab w:val="num" w:pos="1152"/>
+        </w:tabs>
+        <w:ind w:left="1152" w:hanging="1152"/>
+      </w:pPr>
+      <w:rPr>
+        <w:rFonts w:hint="default"/>
+      </w:rPr>
+    </w:lvl>
+    <w:lvl w:ilvl="6">
+      <w:start w:val="1"/>
+      <w:numFmt w:val="decimal"/>
+      <w:lvlText w:val="%1.%2.%3.%4.%5.%6.%7"/>
+      <w:lvlJc w:val="left"/>
+      <w:pPr>
+        <w:tabs>
+          <w:tab w:val="num" w:pos="1296"/>
+        </w:tabs>
+        <w:ind w:left="1296" w:hanging="1296"/>
+      </w:pPr>
+      <w:rPr>
+        <w:rFonts w:hint="default"/>
+      </w:rPr>
+    </w:lvl>
+    <w:lvl w:ilvl="7">
+      <w:start w:val="1"/>
+      <w:numFmt w:val="decimal"/>
+      <w:lvlText w:val="%1.%2.%3.%4.%5.%6.%7.%8"/>
+      <w:lvlJc w:val="left"/>
+      <w:pPr>
+        <w:tabs>
+          <w:tab w:val="num" w:pos="1440"/>
+        </w:tabs>
+        <w:ind w:left="1440" w:hanging="1440"/>
+      </w:pPr>
+      <w:rPr>
+        <w:rFonts w:hint="default"/>
+      </w:rPr>
+    </w:lvl>
+    <w:lvl w:ilvl="8">
+      <w:start w:val="1"/>
+      <w:numFmt w:val="decimal"/>
+      <w:lvlText w:val="%1.%2.%3.%4.%5.%6.%7.%8.%9"/>
+      <w:lvlJc w:val="left"/>
+      <w:pPr>
+        <w:tabs>
+          <w:tab w:val="num" w:pos="1584"/>
+        </w:tabs>
+        <w:ind w:left="1584" w:hanging="1584"/>
+      </w:pPr>
+      <w:rPr>
+        <w:rFonts w:hint="default"/>
+      </w:rPr>
+    </w:lvl>
+  </w:abstractNum>
+  <w:abstractNum w:abstractNumId="23" w15:restartNumberingAfterBreak="0">
     <w:nsid w:val="66871ECE"/>
     <w:multiLevelType w:val="hybridMultilevel"/>
     <w:tmpl w:val="7F74FC56"/>
@@ -16367,7 +19126,7 @@
       </w:pPr>
     </w:lvl>
   </w:abstractNum>
-  <w:abstractNum w:abstractNumId="19" w15:restartNumberingAfterBreak="0">
+  <w:abstractNum w:abstractNumId="24" w15:restartNumberingAfterBreak="0">
     <w:nsid w:val="6ABE5228"/>
     <w:multiLevelType w:val="hybridMultilevel"/>
     <w:tmpl w:val="089EE6D8"/>
@@ -16483,7 +19242,7 @@
       </w:pPr>
     </w:lvl>
   </w:abstractNum>
-  <w:abstractNum w:abstractNumId="20" w15:restartNumberingAfterBreak="0">
+  <w:abstractNum w:abstractNumId="25" w15:restartNumberingAfterBreak="0">
     <w:nsid w:val="6C1D7334"/>
     <w:multiLevelType w:val="hybridMultilevel"/>
     <w:tmpl w:val="7F20929C"/>
@@ -16599,7 +19358,120 @@
       </w:pPr>
     </w:lvl>
   </w:abstractNum>
-  <w:abstractNum w:abstractNumId="21" w15:restartNumberingAfterBreak="0">
+  <w:abstractNum w:abstractNumId="26" w15:restartNumberingAfterBreak="0">
+    <w:nsid w:val="6CB351D4"/>
+    <w:multiLevelType w:val="multilevel"/>
+    <w:tmpl w:val="0D7A7DA4"/>
+    <w:lvl w:ilvl="0">
+      <w:start w:val="4"/>
+      <w:numFmt w:val="decimal"/>
+      <w:lvlText w:val="%1"/>
+      <w:lvlJc w:val="left"/>
+      <w:pPr>
+        <w:ind w:left="435" w:hanging="435"/>
+      </w:pPr>
+      <w:rPr>
+        <w:rFonts w:hint="default"/>
+      </w:rPr>
+    </w:lvl>
+    <w:lvl w:ilvl="1">
+      <w:start w:val="2"/>
+      <w:numFmt w:val="decimal"/>
+      <w:lvlText w:val="%1.%2"/>
+      <w:lvlJc w:val="left"/>
+      <w:pPr>
+        <w:ind w:left="435" w:hanging="435"/>
+      </w:pPr>
+      <w:rPr>
+        <w:rFonts w:hint="default"/>
+      </w:rPr>
+    </w:lvl>
+    <w:lvl w:ilvl="2">
+      <w:start w:val="2"/>
+      <w:numFmt w:val="decimal"/>
+      <w:lvlText w:val="%1.%2.%3"/>
+      <w:lvlJc w:val="left"/>
+      <w:pPr>
+        <w:ind w:left="720" w:hanging="720"/>
+      </w:pPr>
+      <w:rPr>
+        <w:rFonts w:hint="default"/>
+      </w:rPr>
+    </w:lvl>
+    <w:lvl w:ilvl="3">
+      <w:start w:val="1"/>
+      <w:numFmt w:val="decimal"/>
+      <w:lvlText w:val="%1.%2.%3.%4"/>
+      <w:lvlJc w:val="left"/>
+      <w:pPr>
+        <w:ind w:left="720" w:hanging="720"/>
+      </w:pPr>
+      <w:rPr>
+        <w:rFonts w:hint="default"/>
+      </w:rPr>
+    </w:lvl>
+    <w:lvl w:ilvl="4">
+      <w:start w:val="1"/>
+      <w:numFmt w:val="decimal"/>
+      <w:lvlText w:val="%1.%2.%3.%4.%5"/>
+      <w:lvlJc w:val="left"/>
+      <w:pPr>
+        <w:ind w:left="1080" w:hanging="1080"/>
+      </w:pPr>
+      <w:rPr>
+        <w:rFonts w:hint="default"/>
+      </w:rPr>
+    </w:lvl>
+    <w:lvl w:ilvl="5">
+      <w:start w:val="1"/>
+      <w:numFmt w:val="decimal"/>
+      <w:lvlText w:val="%1.%2.%3.%4.%5.%6"/>
+      <w:lvlJc w:val="left"/>
+      <w:pPr>
+        <w:ind w:left="1080" w:hanging="1080"/>
+      </w:pPr>
+      <w:rPr>
+        <w:rFonts w:hint="default"/>
+      </w:rPr>
+    </w:lvl>
+    <w:lvl w:ilvl="6">
+      <w:start w:val="1"/>
+      <w:numFmt w:val="decimal"/>
+      <w:lvlText w:val="%1.%2.%3.%4.%5.%6.%7"/>
+      <w:lvlJc w:val="left"/>
+      <w:pPr>
+        <w:ind w:left="1440" w:hanging="1440"/>
+      </w:pPr>
+      <w:rPr>
+        <w:rFonts w:hint="default"/>
+      </w:rPr>
+    </w:lvl>
+    <w:lvl w:ilvl="7">
+      <w:start w:val="1"/>
+      <w:numFmt w:val="decimal"/>
+      <w:lvlText w:val="%1.%2.%3.%4.%5.%6.%7.%8"/>
+      <w:lvlJc w:val="left"/>
+      <w:pPr>
+        <w:ind w:left="1440" w:hanging="1440"/>
+      </w:pPr>
+      <w:rPr>
+        <w:rFonts w:hint="default"/>
+      </w:rPr>
+    </w:lvl>
+    <w:lvl w:ilvl="8">
+      <w:start w:val="1"/>
+      <w:numFmt w:val="decimal"/>
+      <w:lvlText w:val="%1.%2.%3.%4.%5.%6.%7.%8.%9"/>
+      <w:lvlJc w:val="left"/>
+      <w:pPr>
+        <w:ind w:left="1800" w:hanging="1800"/>
+      </w:pPr>
+      <w:rPr>
+        <w:rFonts w:hint="default"/>
+      </w:rPr>
+    </w:lvl>
+  </w:abstractNum>
+  <w:abstractNum w:abstractNumId="27" w15:restartNumberingAfterBreak="0">
     <w:nsid w:val="72904C79"/>
     <w:multiLevelType w:val="hybridMultilevel"/>
     <w:tmpl w:val="EB328896"/>
@@ -16739,7 +19611,7 @@
       </w:rPr>
     </w:lvl>
   </w:abstractNum>
-  <w:abstractNum w:abstractNumId="22" w15:restartNumberingAfterBreak="0">
+  <w:abstractNum w:abstractNumId="28" w15:restartNumberingAfterBreak="0">
     <w:nsid w:val="757601EE"/>
     <w:multiLevelType w:val="multilevel"/>
     <w:tmpl w:val="614ACFD4"/>
@@ -16888,7 +19760,7 @@
       </w:rPr>
     </w:lvl>
   </w:abstractNum>
-  <w:abstractNum w:abstractNumId="23" w15:restartNumberingAfterBreak="0">
+  <w:abstractNum w:abstractNumId="29" w15:restartNumberingAfterBreak="0">
     <w:nsid w:val="76F02295"/>
     <w:multiLevelType w:val="hybridMultilevel"/>
     <w:tmpl w:val="AB5A3EFA"/>
@@ -16974,7 +19846,7 @@
       </w:pPr>
     </w:lvl>
   </w:abstractNum>
-  <w:abstractNum w:abstractNumId="24" w15:restartNumberingAfterBreak="0">
+  <w:abstractNum w:abstractNumId="30" w15:restartNumberingAfterBreak="0">
     <w:nsid w:val="794050CD"/>
     <w:multiLevelType w:val="multilevel"/>
     <w:tmpl w:val="13FE5FDA"/>
@@ -17123,7 +19995,7 @@
       </w:rPr>
     </w:lvl>
   </w:abstractNum>
-  <w:abstractNum w:abstractNumId="25" w15:restartNumberingAfterBreak="0">
+  <w:abstractNum w:abstractNumId="31" w15:restartNumberingAfterBreak="0">
     <w:nsid w:val="799058E2"/>
     <w:multiLevelType w:val="multilevel"/>
     <w:tmpl w:val="2F5405E0"/>
@@ -17272,7 +20144,7 @@
       </w:rPr>
     </w:lvl>
   </w:abstractNum>
-  <w:abstractNum w:abstractNumId="26" w15:restartNumberingAfterBreak="0">
+  <w:abstractNum w:abstractNumId="32" w15:restartNumberingAfterBreak="0">
     <w:nsid w:val="7ACC392C"/>
     <w:multiLevelType w:val="hybridMultilevel"/>
     <w:tmpl w:val="F282F7F0"/>
@@ -17412,7 +20284,7 @@
       </w:rPr>
     </w:lvl>
   </w:abstractNum>
-  <w:abstractNum w:abstractNumId="27" w15:restartNumberingAfterBreak="0">
+  <w:abstractNum w:abstractNumId="33" w15:restartNumberingAfterBreak="0">
     <w:nsid w:val="7CD54937"/>
     <w:multiLevelType w:val="hybridMultilevel"/>
     <w:tmpl w:val="1AB0305A"/>
@@ -17553,7 +20425,7 @@
     </w:lvl>
   </w:abstractNum>
   <w:num w:numId="1" w16cid:durableId="16778104">
-    <w:abstractNumId w:val="15"/>
+    <w:abstractNumId w:val="18"/>
   </w:num>
   <w:num w:numId="2" w16cid:durableId="206921133">
     <w:abstractNumId w:val="3"/>
@@ -17568,22 +20440,22 @@
     <w:abstractNumId w:val="4"/>
   </w:num>
   <w:num w:numId="6" w16cid:durableId="1766030122">
-    <w:abstractNumId w:val="18"/>
+    <w:abstractNumId w:val="23"/>
   </w:num>
   <w:num w:numId="7" w16cid:durableId="744688335">
     <w:abstractNumId w:val="10"/>
   </w:num>
   <w:num w:numId="8" w16cid:durableId="1654211890">
-    <w:abstractNumId w:val="19"/>
+    <w:abstractNumId w:val="24"/>
   </w:num>
   <w:num w:numId="9" w16cid:durableId="306396487">
     <w:abstractNumId w:val="0"/>
   </w:num>
   <w:num w:numId="10" w16cid:durableId="1392844209">
-    <w:abstractNumId w:val="21"/>
+    <w:abstractNumId w:val="27"/>
   </w:num>
   <w:num w:numId="11" w16cid:durableId="1133519310">
-    <w:abstractNumId w:val="26"/>
+    <w:abstractNumId w:val="32"/>
   </w:num>
   <w:num w:numId="12" w16cid:durableId="1010252792">
     <w:abstractNumId w:val="6"/>
@@ -17592,73 +20464,91 @@
     <w:abstractNumId w:val="2"/>
   </w:num>
   <w:num w:numId="14" w16cid:durableId="1925186491">
-    <w:abstractNumId w:val="27"/>
+    <w:abstractNumId w:val="33"/>
   </w:num>
   <w:num w:numId="15" w16cid:durableId="590503191">
     <w:abstractNumId w:val="7"/>
   </w:num>
   <w:num w:numId="16" w16cid:durableId="567686737">
-    <w:abstractNumId w:val="15"/>
+    <w:abstractNumId w:val="18"/>
   </w:num>
   <w:num w:numId="17" w16cid:durableId="1236550754">
-    <w:abstractNumId w:val="20"/>
+    <w:abstractNumId w:val="25"/>
   </w:num>
   <w:num w:numId="18" w16cid:durableId="113791156">
-    <w:abstractNumId w:val="15"/>
+    <w:abstractNumId w:val="18"/>
   </w:num>
   <w:num w:numId="19" w16cid:durableId="211120316">
-    <w:abstractNumId w:val="15"/>
+    <w:abstractNumId w:val="18"/>
   </w:num>
   <w:num w:numId="20" w16cid:durableId="887882534">
-    <w:abstractNumId w:val="15"/>
+    <w:abstractNumId w:val="18"/>
   </w:num>
   <w:num w:numId="21" w16cid:durableId="1729645536">
-    <w:abstractNumId w:val="15"/>
+    <w:abstractNumId w:val="18"/>
   </w:num>
   <w:num w:numId="22" w16cid:durableId="89548686">
-    <w:abstractNumId w:val="15"/>
+    <w:abstractNumId w:val="18"/>
   </w:num>
   <w:num w:numId="23" w16cid:durableId="2088379685">
-    <w:abstractNumId w:val="17"/>
+    <w:abstractNumId w:val="21"/>
   </w:num>
   <w:num w:numId="24" w16cid:durableId="601763524">
-    <w:abstractNumId w:val="15"/>
+    <w:abstractNumId w:val="18"/>
   </w:num>
   <w:num w:numId="25" w16cid:durableId="1656182149">
-    <w:abstractNumId w:val="15"/>
+    <w:abstractNumId w:val="18"/>
   </w:num>
   <w:num w:numId="26" w16cid:durableId="1059596264">
     <w:abstractNumId w:val="11"/>
   </w:num>
   <w:num w:numId="27" w16cid:durableId="1656373481">
-    <w:abstractNumId w:val="23"/>
+    <w:abstractNumId w:val="29"/>
   </w:num>
   <w:num w:numId="28" w16cid:durableId="1706562637">
-    <w:abstractNumId w:val="25"/>
+    <w:abstractNumId w:val="31"/>
   </w:num>
   <w:num w:numId="29" w16cid:durableId="1281692781">
-    <w:abstractNumId w:val="22"/>
+    <w:abstractNumId w:val="28"/>
   </w:num>
   <w:num w:numId="30" w16cid:durableId="1243366966">
-    <w:abstractNumId w:val="14"/>
+    <w:abstractNumId w:val="16"/>
   </w:num>
   <w:num w:numId="31" w16cid:durableId="1478374561">
-    <w:abstractNumId w:val="12"/>
+    <w:abstractNumId w:val="13"/>
   </w:num>
   <w:num w:numId="32" w16cid:durableId="1944455075">
     <w:abstractNumId w:val="5"/>
   </w:num>
   <w:num w:numId="33" w16cid:durableId="1388064311">
-    <w:abstractNumId w:val="13"/>
+    <w:abstractNumId w:val="15"/>
   </w:num>
   <w:num w:numId="34" w16cid:durableId="1098407802">
-    <w:abstractNumId w:val="24"/>
+    <w:abstractNumId w:val="30"/>
   </w:num>
   <w:num w:numId="35" w16cid:durableId="1707411902">
     <w:abstractNumId w:val="8"/>
   </w:num>
   <w:num w:numId="36" w16cid:durableId="56900152">
-    <w:abstractNumId w:val="16"/>
+    <w:abstractNumId w:val="20"/>
+  </w:num>
+  <w:num w:numId="37" w16cid:durableId="777215320">
+    <w:abstractNumId w:val="22"/>
+  </w:num>
+  <w:num w:numId="38" w16cid:durableId="403726164">
+    <w:abstractNumId w:val="12"/>
+  </w:num>
+  <w:num w:numId="39" w16cid:durableId="1028989542">
+    <w:abstractNumId w:val="26"/>
+  </w:num>
+  <w:num w:numId="40" w16cid:durableId="863906994">
+    <w:abstractNumId w:val="17"/>
+  </w:num>
+  <w:num w:numId="41" w16cid:durableId="368385133">
+    <w:abstractNumId w:val="14"/>
+  </w:num>
+  <w:num w:numId="42" w16cid:durableId="626543020">
+    <w:abstractNumId w:val="19"/>
   </w:num>
   <w:numIdMacAtCleanup w:val="14"/>
 </w:numbering>
@@ -18257,6 +21147,7 @@
   <w:style w:type="character" w:default="1" w:styleId="Carpredefinitoparagrafo">
     <w:name w:val="Default Paragraph Font"/>
     <w:uiPriority w:val="1"/>
+    <w:semiHidden/>
     <w:unhideWhenUsed/>
   </w:style>
   <w:style w:type="table" w:default="1" w:styleId="Tabellanormale">
@@ -18640,6 +21531,38 @@
       <w:iCs/>
     </w:rPr>
   </w:style>
+  <w:style w:type="paragraph" w:styleId="Testonotaapidipagina">
+    <w:name w:val="footnote text"/>
+    <w:basedOn w:val="Normale"/>
+    <w:link w:val="TestonotaapidipaginaCarattere"/>
+    <w:uiPriority w:val="99"/>
+    <w:semiHidden/>
+    <w:unhideWhenUsed/>
+    <w:rsid w:val="001279BC"/>
+  </w:style>
+  <w:style w:type="character" w:customStyle="1" w:styleId="TestonotaapidipaginaCarattere">
+    <w:name w:val="Testo nota a piè di pagina Carattere"/>
+    <w:basedOn w:val="Carpredefinitoparagrafo"/>
+    <w:link w:val="Testonotaapidipagina"/>
+    <w:uiPriority w:val="99"/>
+    <w:semiHidden/>
+    <w:rsid w:val="001279BC"/>
+    <w:rPr>
+      <w:rFonts w:ascii="Arial" w:hAnsi="Arial"/>
+      <w:lang w:eastAsia="it-IT"/>
+    </w:rPr>
+  </w:style>
+  <w:style w:type="character" w:styleId="Rimandonotaapidipagina">
+    <w:name w:val="footnote reference"/>
+    <w:basedOn w:val="Carpredefinitoparagrafo"/>
+    <w:uiPriority w:val="99"/>
+    <w:semiHidden/>
+    <w:unhideWhenUsed/>
+    <w:rsid w:val="001279BC"/>
+    <w:rPr>
+      <w:vertAlign w:val="superscript"/>
+    </w:rPr>
+  </w:style>
 </w:styles>
 </file>
 

</xml_diff>

<commit_message>
Progetto finito + docu
</commit_message>
<xml_diff>
--- a/3_Documentazione/Documentazione_Nebula.docx
+++ b/3_Documentazione/Documentazione_Nebula.docx
@@ -868,7 +868,7 @@
         <w:rPr>
           <w:noProof/>
         </w:rPr>
-        <w:t>5</w:t>
+        <w:t>6</w:t>
       </w:r>
       <w:r>
         <w:rPr>
@@ -947,7 +947,7 @@
         <w:rPr>
           <w:noProof/>
         </w:rPr>
-        <w:t>5</w:t>
+        <w:t>6</w:t>
       </w:r>
       <w:r>
         <w:rPr>
@@ -1263,7 +1263,7 @@
         <w:rPr>
           <w:noProof/>
         </w:rPr>
-        <w:t>6</w:t>
+        <w:t>7</w:t>
       </w:r>
       <w:r>
         <w:rPr>
@@ -1342,7 +1342,7 @@
         <w:rPr>
           <w:noProof/>
         </w:rPr>
-        <w:t>6</w:t>
+        <w:t>7</w:t>
       </w:r>
       <w:r>
         <w:rPr>
@@ -1421,7 +1421,7 @@
         <w:rPr>
           <w:noProof/>
         </w:rPr>
-        <w:t>6</w:t>
+        <w:t>8</w:t>
       </w:r>
       <w:r>
         <w:rPr>
@@ -1500,7 +1500,7 @@
         <w:rPr>
           <w:noProof/>
         </w:rPr>
-        <w:t>6</w:t>
+        <w:t>13</w:t>
       </w:r>
       <w:r>
         <w:rPr>
@@ -1579,7 +1579,7 @@
         <w:rPr>
           <w:noProof/>
         </w:rPr>
-        <w:t>7</w:t>
+        <w:t>13</w:t>
       </w:r>
       <w:r>
         <w:rPr>
@@ -1660,7 +1660,7 @@
         <w:rPr>
           <w:noProof/>
         </w:rPr>
-        <w:t>7</w:t>
+        <w:t>17</w:t>
       </w:r>
       <w:r>
         <w:rPr>
@@ -1739,7 +1739,7 @@
         <w:rPr>
           <w:noProof/>
         </w:rPr>
-        <w:t>7</w:t>
+        <w:t>17</w:t>
       </w:r>
       <w:r>
         <w:rPr>
@@ -1818,7 +1818,7 @@
         <w:rPr>
           <w:noProof/>
         </w:rPr>
-        <w:t>8</w:t>
+        <w:t>17</w:t>
       </w:r>
       <w:r>
         <w:rPr>
@@ -1897,7 +1897,7 @@
         <w:rPr>
           <w:noProof/>
         </w:rPr>
-        <w:t>8</w:t>
+        <w:t>17</w:t>
       </w:r>
       <w:r>
         <w:rPr>
@@ -1978,7 +1978,7 @@
         <w:rPr>
           <w:noProof/>
         </w:rPr>
-        <w:t>8</w:t>
+        <w:t>17</w:t>
       </w:r>
       <w:r>
         <w:rPr>
@@ -2059,7 +2059,7 @@
         <w:rPr>
           <w:noProof/>
         </w:rPr>
-        <w:t>8</w:t>
+        <w:t>17</w:t>
       </w:r>
       <w:r>
         <w:rPr>
@@ -2138,7 +2138,7 @@
         <w:rPr>
           <w:noProof/>
         </w:rPr>
-        <w:t>8</w:t>
+        <w:t>17</w:t>
       </w:r>
       <w:r>
         <w:rPr>
@@ -2217,7 +2217,7 @@
         <w:rPr>
           <w:noProof/>
         </w:rPr>
-        <w:t>8</w:t>
+        <w:t>17</w:t>
       </w:r>
       <w:r>
         <w:rPr>
@@ -2298,7 +2298,7 @@
         <w:rPr>
           <w:noProof/>
         </w:rPr>
-        <w:t>8</w:t>
+        <w:t>17</w:t>
       </w:r>
       <w:r>
         <w:rPr>
@@ -2379,7 +2379,7 @@
         <w:rPr>
           <w:noProof/>
         </w:rPr>
-        <w:t>9</w:t>
+        <w:t>18</w:t>
       </w:r>
       <w:r>
         <w:rPr>
@@ -2458,7 +2458,7 @@
         <w:rPr>
           <w:noProof/>
         </w:rPr>
-        <w:t>9</w:t>
+        <w:t>18</w:t>
       </w:r>
       <w:r>
         <w:rPr>
@@ -2537,7 +2537,7 @@
         <w:rPr>
           <w:noProof/>
         </w:rPr>
-        <w:t>9</w:t>
+        <w:t>18</w:t>
       </w:r>
       <w:r>
         <w:rPr>
@@ -2616,7 +2616,7 @@
         <w:rPr>
           <w:noProof/>
         </w:rPr>
-        <w:t>9</w:t>
+        <w:t>18</w:t>
       </w:r>
       <w:r>
         <w:rPr>
@@ -2697,7 +2697,7 @@
         <w:rPr>
           <w:noProof/>
         </w:rPr>
-        <w:t>9</w:t>
+        <w:t>18</w:t>
       </w:r>
       <w:r>
         <w:rPr>
@@ -10644,12 +10644,12 @@
         <w:br w:type="page"/>
       </w:r>
     </w:p>
-    <w:bookmarkStart w:id="23" w:name="_Toc429059812"/>
-    <w:bookmarkStart w:id="24" w:name="_Toc94790458"/>
     <w:p>
       <w:pPr>
         <w:pStyle w:val="Titolo2"/>
       </w:pPr>
+      <w:bookmarkStart w:id="23" w:name="_Toc429059812"/>
+      <w:bookmarkStart w:id="24" w:name="_Toc94790458"/>
       <w:r>
         <w:rPr>
           <w:noProof/>
@@ -11077,13 +11077,6 @@
       </w:r>
     </w:p>
     <w:p>
-      <w:pPr>
-        <w:pStyle w:val="Titolo3"/>
-        <w:numPr>
-          <w:ilvl w:val="2"/>
-          <w:numId w:val="39"/>
-        </w:numPr>
-      </w:pPr>
       <w:r>
         <w:rPr>
           <w:noProof/>
@@ -11092,13 +11085,13 @@
         <mc:AlternateContent>
           <mc:Choice Requires="wps">
             <w:drawing>
-              <wp:anchor distT="0" distB="0" distL="114300" distR="114300" simplePos="0" relativeHeight="251687936" behindDoc="0" locked="0" layoutInCell="1" allowOverlap="1" wp14:anchorId="0833E42B" wp14:editId="323119DE">
+              <wp:anchor distT="0" distB="0" distL="114300" distR="114300" simplePos="0" relativeHeight="251687936" behindDoc="0" locked="0" layoutInCell="1" allowOverlap="1" wp14:anchorId="0833E42B" wp14:editId="38EDA2DE">
                 <wp:simplePos x="0" y="0"/>
                 <wp:positionH relativeFrom="margin">
                   <wp:align>center</wp:align>
                 </wp:positionH>
                 <wp:positionV relativeFrom="paragraph">
-                  <wp:posOffset>2212947</wp:posOffset>
+                  <wp:posOffset>1618283</wp:posOffset>
                 </wp:positionV>
                 <wp:extent cx="1242060" cy="249555"/>
                 <wp:effectExtent l="0" t="0" r="0" b="0"/>
@@ -11187,7 +11180,7 @@
           </mc:Choice>
           <mc:Fallback>
             <w:pict>
-              <v:shape w14:anchorId="0833E42B" id="Casella di testo 32" o:spid="_x0000_s1035" type="#_x0000_t202" style="position:absolute;left:0;text-align:left;margin-left:0;margin-top:174.25pt;width:97.8pt;height:19.65pt;z-index:251687936;visibility:visible;mso-wrap-style:square;mso-width-percent:0;mso-height-percent:0;mso-wrap-distance-left:9pt;mso-wrap-distance-top:0;mso-wrap-distance-right:9pt;mso-wrap-distance-bottom:0;mso-position-horizontal:center;mso-position-horizontal-relative:margin;mso-position-vertical:absolute;mso-position-vertical-relative:text;mso-width-percent:0;mso-height-percent:0;mso-width-relative:margin;mso-height-relative:margin;v-text-anchor:top" o:gfxdata="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" stroked="f">
+              <v:shape w14:anchorId="0833E42B" id="Casella di testo 32" o:spid="_x0000_s1035" type="#_x0000_t202" style="position:absolute;margin-left:0;margin-top:127.4pt;width:97.8pt;height:19.65pt;z-index:251687936;visibility:visible;mso-wrap-style:square;mso-width-percent:0;mso-height-percent:0;mso-wrap-distance-left:9pt;mso-wrap-distance-top:0;mso-wrap-distance-right:9pt;mso-wrap-distance-bottom:0;mso-position-horizontal:center;mso-position-horizontal-relative:margin;mso-position-vertical:absolute;mso-position-vertical-relative:text;mso-width-percent:0;mso-height-percent:0;mso-width-relative:margin;mso-height-relative:margin;v-text-anchor:top" o:gfxdata="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" stroked="f">
                 <v:textbox inset="0,0,0,0">
                   <w:txbxContent>
                     <w:p>
@@ -11242,13 +11235,13 @@
           <w:noProof/>
         </w:rPr>
         <w:drawing>
-          <wp:anchor distT="0" distB="0" distL="114300" distR="114300" simplePos="0" relativeHeight="251685888" behindDoc="0" locked="0" layoutInCell="1" allowOverlap="1" wp14:anchorId="329344BB" wp14:editId="7FC01CFA">
+          <wp:anchor distT="0" distB="0" distL="114300" distR="114300" simplePos="0" relativeHeight="251685888" behindDoc="0" locked="0" layoutInCell="1" allowOverlap="1" wp14:anchorId="329344BB" wp14:editId="4F6F9D9F">
             <wp:simplePos x="0" y="0"/>
             <wp:positionH relativeFrom="margin">
               <wp:align>center</wp:align>
             </wp:positionH>
             <wp:positionV relativeFrom="paragraph">
-              <wp:posOffset>551153</wp:posOffset>
+              <wp:posOffset>497</wp:posOffset>
             </wp:positionV>
             <wp:extent cx="3545840" cy="1593215"/>
             <wp:effectExtent l="0" t="0" r="0" b="6985"/>
@@ -11297,11 +11290,6 @@
           </wp:anchor>
         </w:drawing>
       </w:r>
-      <w:r>
-        <w:t>Codice significativo</w:t>
-      </w:r>
-    </w:p>
-    <w:p>
       <w:r>
         <w:t xml:space="preserve">Il pulsante principale è implementato attraverso un </w:t>
       </w:r>
@@ -11585,15 +11573,7 @@
           <w:rFonts w:cs="Arial"/>
           <w:lang w:eastAsia="it-CH"/>
         </w:rPr>
-        <w:t xml:space="preserve">, è stato possibile definire l’aspetto e il comportamento dell’interfaccia in modo chiaro e </w:t>
-      </w:r>
-      <w:r>
-        <w:rPr>
-          <w:rFonts w:cs="Arial"/>
-          <w:lang w:eastAsia="it-CH"/>
-        </w:rPr>
-        <w:lastRenderedPageBreak/>
-        <w:t>personalizzato. Questa schermata rappresenta il punto di ingresso dell’applicazione e svolge un ruolo fondamentale nell’esperienza utente, poiché introduce la navigazione verso le diverse sezioni disponibili.</w:t>
+        <w:t>, è stato possibile definire l’aspetto e il comportamento dell’interfaccia in modo chiaro e personalizzato. Questa schermata rappresenta il punto di ingresso dell’applicazione e svolge un ruolo fondamentale nell’esperienza utente, poiché introduce la navigazione verso le diverse sezioni disponibili.</w:t>
       </w:r>
     </w:p>
     <w:p/>
@@ -11607,44 +11587,12 @@
       </w:pPr>
       <w:proofErr w:type="spellStart"/>
       <w:r>
+        <w:lastRenderedPageBreak/>
         <w:t>HomeView.swift</w:t>
       </w:r>
       <w:proofErr w:type="spellEnd"/>
     </w:p>
     <w:p>
-      <w:proofErr w:type="spellStart"/>
-      <w:r>
-        <w:t>HomeView</w:t>
-      </w:r>
-      <w:proofErr w:type="spellEnd"/>
-      <w:r>
-        <w:t xml:space="preserve"> rappresenta la pagina principale dell’applicazione e permette all’utente di interagire con una rappresentazione simulata del Sistema Solare. La schermata mostra il Sole al centro e i pianeti disposti su orbite animate. Ogni pianeta può essere selezionato tramite un </w:t>
-      </w:r>
-      <w:proofErr w:type="spellStart"/>
-      <w:r>
-        <w:t>NavigationLink</w:t>
-      </w:r>
-      <w:proofErr w:type="spellEnd"/>
-      <w:r>
-        <w:t xml:space="preserve">, che conduce alla pagina informativa dedicata. L’interfaccia supporta anche un gesto di zoom: se il valore di ingrandimento scende sotto una soglia predefinita, la rappresentazione del Sistema Solare si trasforma in una vista più ampia della Via Lattea. La schermata include inoltre un accesso diretto alla pagina della Luna e una toolbar che consente la navigazione verso la funzionalità "Information of the day" collegata a un’API NASA. La struttura della </w:t>
-      </w:r>
-      <w:proofErr w:type="spellStart"/>
-      <w:r>
-        <w:t>view</w:t>
-      </w:r>
-      <w:proofErr w:type="spellEnd"/>
-      <w:r>
-        <w:t xml:space="preserve"> combina componenti statici (immagini e layout) con elementi dinamici e interattivi, rendendo la pagina sia esplorativa che informativa.</w:t>
-      </w:r>
-    </w:p>
-    <w:p>
-      <w:pPr>
-        <w:pStyle w:val="Titolo3"/>
-        <w:numPr>
-          <w:ilvl w:val="2"/>
-          <w:numId w:val="40"/>
-        </w:numPr>
-      </w:pPr>
       <w:r>
         <w:rPr>
           <w:noProof/>
@@ -11652,13 +11600,13 @@
         <mc:AlternateContent>
           <mc:Choice Requires="wps">
             <w:drawing>
-              <wp:anchor distT="0" distB="0" distL="114300" distR="114300" simplePos="0" relativeHeight="251691008" behindDoc="0" locked="0" layoutInCell="1" allowOverlap="1" wp14:anchorId="3FDD7072" wp14:editId="2736C5AB">
+              <wp:anchor distT="0" distB="0" distL="114300" distR="114300" simplePos="0" relativeHeight="251691008" behindDoc="0" locked="0" layoutInCell="1" allowOverlap="1" wp14:anchorId="3FDD7072" wp14:editId="516B5523">
                 <wp:simplePos x="0" y="0"/>
                 <wp:positionH relativeFrom="margin">
                   <wp:align>center</wp:align>
                 </wp:positionH>
                 <wp:positionV relativeFrom="paragraph">
-                  <wp:posOffset>2148039</wp:posOffset>
+                  <wp:posOffset>3016747</wp:posOffset>
                 </wp:positionV>
                 <wp:extent cx="1446530" cy="246380"/>
                 <wp:effectExtent l="0" t="0" r="1270" b="1270"/>
@@ -11740,7 +11688,7 @@
           </mc:Choice>
           <mc:Fallback>
             <w:pict>
-              <v:shape w14:anchorId="3FDD7072" id="Casella di testo 6" o:spid="_x0000_s1037" type="#_x0000_t202" style="position:absolute;left:0;text-align:left;margin-left:0;margin-top:169.15pt;width:113.9pt;height:19.4pt;z-index:251691008;visibility:visible;mso-wrap-style:square;mso-width-percent:0;mso-height-percent:0;mso-wrap-distance-left:9pt;mso-wrap-distance-top:0;mso-wrap-distance-right:9pt;mso-wrap-distance-bottom:0;mso-position-horizontal:center;mso-position-horizontal-relative:margin;mso-position-vertical:absolute;mso-position-vertical-relative:text;mso-width-percent:0;mso-height-percent:0;mso-width-relative:margin;mso-height-relative:margin;v-text-anchor:top" o:gfxdata="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" stroked="f">
+              <v:shape w14:anchorId="3FDD7072" id="Casella di testo 6" o:spid="_x0000_s1037" type="#_x0000_t202" style="position:absolute;margin-left:0;margin-top:237.55pt;width:113.9pt;height:19.4pt;z-index:251691008;visibility:visible;mso-wrap-style:square;mso-width-percent:0;mso-height-percent:0;mso-wrap-distance-left:9pt;mso-wrap-distance-top:0;mso-wrap-distance-right:9pt;mso-wrap-distance-bottom:0;mso-position-horizontal:center;mso-position-horizontal-relative:margin;mso-position-vertical:absolute;mso-position-vertical-relative:text;mso-width-percent:0;mso-height-percent:0;mso-width-relative:margin;mso-height-relative:margin;v-text-anchor:top" o:gfxdata="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" stroked="f">
                 <v:textbox inset="0,0,0,0">
                   <w:txbxContent>
                     <w:p>
@@ -11788,13 +11736,13 @@
           <w:noProof/>
         </w:rPr>
         <w:drawing>
-          <wp:anchor distT="0" distB="0" distL="114300" distR="114300" simplePos="0" relativeHeight="251688960" behindDoc="0" locked="0" layoutInCell="1" allowOverlap="1" wp14:anchorId="2BB60A77" wp14:editId="37A49095">
+          <wp:anchor distT="0" distB="0" distL="114300" distR="114300" simplePos="0" relativeHeight="251688960" behindDoc="0" locked="0" layoutInCell="1" allowOverlap="1" wp14:anchorId="2BB60A77" wp14:editId="327AA4CE">
             <wp:simplePos x="0" y="0"/>
             <wp:positionH relativeFrom="margin">
               <wp:align>center</wp:align>
             </wp:positionH>
             <wp:positionV relativeFrom="paragraph">
-              <wp:posOffset>549910</wp:posOffset>
+              <wp:posOffset>1442389</wp:posOffset>
             </wp:positionV>
             <wp:extent cx="4452620" cy="1550035"/>
             <wp:effectExtent l="0" t="0" r="5080" b="0"/>
@@ -11843,8 +11791,29 @@
           </wp:anchor>
         </w:drawing>
       </w:r>
-      <w:r>
-        <w:t>Codice significativo</w:t>
+      <w:proofErr w:type="spellStart"/>
+      <w:r>
+        <w:t>HomeView</w:t>
+      </w:r>
+      <w:proofErr w:type="spellEnd"/>
+      <w:r>
+        <w:t xml:space="preserve"> rappresenta la pagina principale dell’applicazione e permette all’utente di interagire con una rappresentazione simulata del Sistema Solare. La schermata mostra il Sole al centro e i pianeti disposti su orbite animate. Ogni pianeta può essere selezionato tramite un </w:t>
+      </w:r>
+      <w:proofErr w:type="spellStart"/>
+      <w:r>
+        <w:t>NavigationLink</w:t>
+      </w:r>
+      <w:proofErr w:type="spellEnd"/>
+      <w:r>
+        <w:t xml:space="preserve">, che conduce alla pagina informativa dedicata. L’interfaccia supporta anche un gesto di zoom: se il valore di ingrandimento scende sotto una soglia predefinita, la rappresentazione del Sistema Solare si trasforma in una vista più ampia della Via Lattea. La schermata include inoltre un accesso diretto alla pagina della Luna e una toolbar che consente la navigazione verso la funzionalità "Information of the day" collegata a un’API NASA. La struttura della </w:t>
+      </w:r>
+      <w:proofErr w:type="spellStart"/>
+      <w:r>
+        <w:t>view</w:t>
+      </w:r>
+      <w:proofErr w:type="spellEnd"/>
+      <w:r>
+        <w:t xml:space="preserve"> combina componenti statici (immagini e layout) con elementi dinamici e interattivi, rendendo la pagina sia esplorativa che informativa.</w:t>
       </w:r>
     </w:p>
     <w:p>
@@ -12074,11 +12043,7 @@
           </mc:Choice>
           <mc:Fallback>
             <w:pict>
-              <v:shapetype w14:anchorId="2A06E08C" id="_x0000_t202" coordsize="21600,21600" o:spt="202" path="m,l,21600r21600,l21600,xe">
-                <v:stroke joinstyle="miter"/>
-                <v:path gradientshapeok="t" o:connecttype="rect"/>
-              </v:shapetype>
-              <v:shape id="Casella di testo 19" o:spid="_x0000_s1038" type="#_x0000_t202" style="position:absolute;left:0;text-align:left;margin-left:0;margin-top:383.95pt;width:102.65pt;height:21.9pt;z-index:251700224;visibility:visible;mso-wrap-style:square;mso-width-percent:0;mso-height-percent:0;mso-wrap-distance-left:9pt;mso-wrap-distance-top:0;mso-wrap-distance-right:9pt;mso-wrap-distance-bottom:0;mso-position-horizontal:center;mso-position-horizontal-relative:margin;mso-position-vertical:absolute;mso-position-vertical-relative:text;mso-width-percent:0;mso-height-percent:0;mso-width-relative:margin;mso-height-relative:margin;v-text-anchor:top" o:gfxdata="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" stroked="f">
+              <v:shape w14:anchorId="2A06E08C" id="Casella di testo 19" o:spid="_x0000_s1038" type="#_x0000_t202" style="position:absolute;left:0;text-align:left;margin-left:0;margin-top:383.95pt;width:102.65pt;height:21.9pt;z-index:251700224;visibility:visible;mso-wrap-style:square;mso-width-percent:0;mso-height-percent:0;mso-wrap-distance-left:9pt;mso-wrap-distance-top:0;mso-wrap-distance-right:9pt;mso-wrap-distance-bottom:0;mso-position-horizontal:center;mso-position-horizontal-relative:margin;mso-position-vertical:absolute;mso-position-vertical-relative:text;mso-width-percent:0;mso-height-percent:0;mso-width-relative:margin;mso-height-relative:margin;v-text-anchor:top" o:gfxdata="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" stroked="f">
                 <v:textbox inset="0,0,0,0">
                   <w:txbxContent>
                     <w:p>
@@ -12130,16 +12095,127 @@
     </w:p>
     <w:p>
       <w:pPr>
-        <w:pStyle w:val="NormaleWeb"/>
-        <w:ind w:left="435"/>
-      </w:pPr>
-    </w:p>
-    <w:p>
-      <w:pPr>
-        <w:rPr>
-          <w:lang w:val="it-IT"/>
-        </w:rPr>
-      </w:pPr>
+        <w:rPr>
+          <w:rFonts w:cs="Arial"/>
+          <w:lang w:eastAsia="it-CH"/>
+        </w:rPr>
+      </w:pPr>
+      <w:r>
+        <w:rPr>
+          <w:rFonts w:cs="Arial"/>
+          <w:lang w:eastAsia="it-CH"/>
+        </w:rPr>
+        <w:t>Questa pagina rappresenta un modello grafico del Sistema Solare realizzato all’interno dell’app. Al centro è posizionato il Sole, circondato da una serie di orbite che indicano i percorsi dei pianeti. Su ciascuna orbita è collocata un’immagine rappresentativa di un pianeta, disposta in modo da riprodurre la configurazione del Sistema Solare. Lo sfondo è composto da un cielo stellato, che contribuisce a creare un’atmosfera spaziale immersiva.</w:t>
+      </w:r>
+    </w:p>
+    <w:p>
+      <w:pPr>
+        <w:rPr>
+          <w:rFonts w:cs="Arial"/>
+          <w:lang w:eastAsia="it-CH"/>
+        </w:rPr>
+      </w:pPr>
+      <w:r>
+        <w:rPr>
+          <w:rFonts w:cs="Arial"/>
+          <w:lang w:eastAsia="it-CH"/>
+        </w:rPr>
+        <w:t xml:space="preserve">Nella parte superiore sono presenti </w:t>
+      </w:r>
+      <w:r>
+        <w:rPr>
+          <w:rFonts w:cs="Arial"/>
+          <w:lang w:eastAsia="it-CH"/>
+        </w:rPr>
+        <w:t>due</w:t>
+      </w:r>
+      <w:r>
+        <w:rPr>
+          <w:rFonts w:cs="Arial"/>
+          <w:lang w:eastAsia="it-CH"/>
+        </w:rPr>
+        <w:t xml:space="preserve"> elementi dell’interfaccia:</w:t>
+      </w:r>
+    </w:p>
+    <w:p>
+      <w:pPr>
+        <w:numPr>
+          <w:ilvl w:val="0"/>
+          <w:numId w:val="43"/>
+        </w:numPr>
+        <w:rPr>
+          <w:rFonts w:cs="Arial"/>
+          <w:lang w:eastAsia="it-CH"/>
+        </w:rPr>
+      </w:pPr>
+      <w:r>
+        <w:rPr>
+          <w:rFonts w:cs="Arial"/>
+          <w:lang w:eastAsia="it-CH"/>
+        </w:rPr>
+        <w:t>“</w:t>
+      </w:r>
+      <w:r>
+        <w:rPr>
+          <w:rFonts w:cs="Arial"/>
+          <w:lang w:eastAsia="it-CH"/>
+        </w:rPr>
+        <w:t>Back</w:t>
+      </w:r>
+      <w:r>
+        <w:rPr>
+          <w:rFonts w:cs="Arial"/>
+          <w:lang w:eastAsia="it-CH"/>
+        </w:rPr>
+        <w:t>”</w:t>
+      </w:r>
+      <w:r>
+        <w:rPr>
+          <w:rFonts w:cs="Arial"/>
+          <w:lang w:eastAsia="it-CH"/>
+        </w:rPr>
+        <w:t xml:space="preserve"> (a sinistra), che permette di tornare alla schermata precedente.</w:t>
+      </w:r>
+    </w:p>
+    <w:p>
+      <w:pPr>
+        <w:numPr>
+          <w:ilvl w:val="0"/>
+          <w:numId w:val="43"/>
+        </w:numPr>
+        <w:rPr>
+          <w:rFonts w:cs="Arial"/>
+          <w:lang w:eastAsia="it-CH"/>
+        </w:rPr>
+      </w:pPr>
+      <w:r>
+        <w:rPr>
+          <w:rFonts w:cs="Arial"/>
+          <w:lang w:eastAsia="it-CH"/>
+        </w:rPr>
+        <w:t>“</w:t>
+      </w:r>
+      <w:r>
+        <w:rPr>
+          <w:rFonts w:cs="Arial"/>
+          <w:lang w:eastAsia="it-CH"/>
+        </w:rPr>
+        <w:t>Info del giorno</w:t>
+      </w:r>
+      <w:r>
+        <w:rPr>
+          <w:rFonts w:cs="Arial"/>
+          <w:lang w:eastAsia="it-CH"/>
+        </w:rPr>
+        <w:t>”</w:t>
+      </w:r>
+      <w:r>
+        <w:rPr>
+          <w:rFonts w:cs="Arial"/>
+          <w:lang w:eastAsia="it-CH"/>
+        </w:rPr>
+        <w:t xml:space="preserve"> (a destra), pulsante che consente di accedere a una sezione informativa aggiuntiva.</w:t>
+      </w:r>
     </w:p>
     <w:p/>
     <w:p>
@@ -12213,11 +12289,9 @@
     </w:p>
     <w:p>
       <w:pPr>
-        <w:pStyle w:val="Titolo3"/>
-        <w:numPr>
-          <w:ilvl w:val="2"/>
-          <w:numId w:val="42"/>
-        </w:numPr>
+        <w:rPr>
+          <w:lang w:val="it-IT"/>
+        </w:rPr>
       </w:pPr>
       <w:r>
         <w:rPr>
@@ -12227,7 +12301,7 @@
         <mc:AlternateContent>
           <mc:Choice Requires="wps">
             <w:drawing>
-              <wp:anchor distT="0" distB="0" distL="114300" distR="114300" simplePos="0" relativeHeight="251694080" behindDoc="0" locked="0" layoutInCell="1" allowOverlap="1" wp14:anchorId="6FD4E544" wp14:editId="19BD2A2B">
+              <wp:anchor distT="0" distB="0" distL="114300" distR="114300" simplePos="0" relativeHeight="251694080" behindDoc="0" locked="0" layoutInCell="1" allowOverlap="1" wp14:anchorId="6FD4E544" wp14:editId="7842D662">
                 <wp:simplePos x="0" y="0"/>
                 <wp:positionH relativeFrom="margin">
                   <wp:align>center</wp:align>
@@ -12317,7 +12391,7 @@
           </mc:Choice>
           <mc:Fallback>
             <w:pict>
-              <v:shape w14:anchorId="6FD4E544" id="Casella di testo 8" o:spid="_x0000_s1039" type="#_x0000_t202" style="position:absolute;left:0;text-align:left;margin-left:0;margin-top:439.65pt;width:65.7pt;height:19.4pt;z-index:251694080;visibility:visible;mso-wrap-style:square;mso-width-percent:0;mso-height-percent:0;mso-wrap-distance-left:9pt;mso-wrap-distance-top:0;mso-wrap-distance-right:9pt;mso-wrap-distance-bottom:0;mso-position-horizontal:center;mso-position-horizontal-relative:margin;mso-position-vertical:absolute;mso-position-vertical-relative:text;mso-width-percent:0;mso-height-percent:0;mso-width-relative:margin;mso-height-relative:margin;v-text-anchor:top" o:gfxdata="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" stroked="f">
+              <v:shape w14:anchorId="6FD4E544" id="Casella di testo 8" o:spid="_x0000_s1039" type="#_x0000_t202" style="position:absolute;margin-left:0;margin-top:439.65pt;width:65.7pt;height:19.4pt;z-index:251694080;visibility:visible;mso-wrap-style:square;mso-width-percent:0;mso-height-percent:0;mso-wrap-distance-left:9pt;mso-wrap-distance-top:0;mso-wrap-distance-right:9pt;mso-wrap-distance-bottom:0;mso-position-horizontal:center;mso-position-horizontal-relative:margin;mso-position-vertical:absolute;mso-position-vertical-relative:text;mso-width-percent:0;mso-height-percent:0;mso-width-relative:margin;mso-height-relative:margin;v-text-anchor:top" o:gfxdata="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" stroked="f">
                 <v:textbox inset="0,0,0,0">
                   <w:txbxContent>
                     <w:p>
@@ -12367,7 +12441,7 @@
           <w:noProof/>
         </w:rPr>
         <w:drawing>
-          <wp:anchor distT="0" distB="0" distL="114300" distR="114300" simplePos="0" relativeHeight="251692032" behindDoc="0" locked="0" layoutInCell="1" allowOverlap="1" wp14:anchorId="3469E742" wp14:editId="19DD69A9">
+          <wp:anchor distT="0" distB="0" distL="114300" distR="114300" simplePos="0" relativeHeight="251692032" behindDoc="0" locked="0" layoutInCell="1" allowOverlap="1" wp14:anchorId="3469E742" wp14:editId="6F494242">
             <wp:simplePos x="0" y="0"/>
             <wp:positionH relativeFrom="column">
               <wp:posOffset>789995</wp:posOffset>
@@ -12413,19 +12487,15 @@
                 </pic:pic>
               </a:graphicData>
             </a:graphic>
+            <wp14:sizeRelH relativeFrom="margin">
+              <wp14:pctWidth>0</wp14:pctWidth>
+            </wp14:sizeRelH>
+            <wp14:sizeRelV relativeFrom="margin">
+              <wp14:pctHeight>0</wp14:pctHeight>
+            </wp14:sizeRelV>
           </wp:anchor>
         </w:drawing>
       </w:r>
-      <w:r>
-        <w:t>Codice significativo</w:t>
-      </w:r>
-    </w:p>
-    <w:p>
-      <w:pPr>
-        <w:rPr>
-          <w:lang w:val="it-IT"/>
-        </w:rPr>
-      </w:pPr>
     </w:p>
     <w:p>
       <w:r>
@@ -12513,6 +12583,381 @@
       </w:r>
     </w:p>
     <w:p/>
+    <w:p/>
+    <w:p>
+      <w:pPr>
+        <w:pStyle w:val="Titolo2"/>
+        <w:numPr>
+          <w:ilvl w:val="2"/>
+          <w:numId w:val="42"/>
+        </w:numPr>
+      </w:pPr>
+      <w:r>
+        <w:rPr>
+          <w:noProof/>
+        </w:rPr>
+        <w:lastRenderedPageBreak/>
+        <mc:AlternateContent>
+          <mc:Choice Requires="wps">
+            <w:drawing>
+              <wp:anchor distT="0" distB="0" distL="114300" distR="114300" simplePos="0" relativeHeight="251703296" behindDoc="0" locked="0" layoutInCell="1" allowOverlap="1" wp14:anchorId="47ED1734" wp14:editId="5295DAE2">
+                <wp:simplePos x="0" y="0"/>
+                <wp:positionH relativeFrom="margin">
+                  <wp:align>center</wp:align>
+                </wp:positionH>
+                <wp:positionV relativeFrom="paragraph">
+                  <wp:posOffset>5283897</wp:posOffset>
+                </wp:positionV>
+                <wp:extent cx="1352550" cy="241300"/>
+                <wp:effectExtent l="0" t="0" r="0" b="6350"/>
+                <wp:wrapTopAndBottom/>
+                <wp:docPr id="33" name="Casella di testo 33"/>
+                <wp:cNvGraphicFramePr/>
+                <a:graphic xmlns:a="http://schemas.openxmlformats.org/drawingml/2006/main">
+                  <a:graphicData uri="http://schemas.microsoft.com/office/word/2010/wordprocessingShape">
+                    <wps:wsp>
+                      <wps:cNvSpPr txBox="1"/>
+                      <wps:spPr>
+                        <a:xfrm>
+                          <a:off x="0" y="0"/>
+                          <a:ext cx="1352550" cy="241300"/>
+                        </a:xfrm>
+                        <a:prstGeom prst="rect">
+                          <a:avLst/>
+                        </a:prstGeom>
+                        <a:solidFill>
+                          <a:prstClr val="white"/>
+                        </a:solidFill>
+                        <a:ln>
+                          <a:noFill/>
+                        </a:ln>
+                      </wps:spPr>
+                      <wps:txbx>
+                        <w:txbxContent>
+                          <w:p>
+                            <w:pPr>
+                              <w:pStyle w:val="Didascalia"/>
+                              <w:rPr>
+                                <w:b/>
+                                <w:noProof/>
+                                <w:sz w:val="20"/>
+                                <w:lang w:val="it-IT"/>
+                              </w:rPr>
+                            </w:pPr>
+                            <w:r>
+                              <w:t xml:space="preserve">Figura </w:t>
+                            </w:r>
+                            <w:r>
+                              <w:fldChar w:fldCharType="begin"/>
+                            </w:r>
+                            <w:r>
+                              <w:instrText xml:space="preserve"> SEQ Figura \* ARABIC </w:instrText>
+                            </w:r>
+                            <w:r>
+                              <w:fldChar w:fldCharType="separate"/>
+                            </w:r>
+                            <w:r>
+                              <w:rPr>
+                                <w:noProof/>
+                              </w:rPr>
+                              <w:t>16</w:t>
+                            </w:r>
+                            <w:r>
+                              <w:fldChar w:fldCharType="end"/>
+                            </w:r>
+                            <w:r>
+                              <w:t xml:space="preserve"> - Interfaccia APOD</w:t>
+                            </w:r>
+                          </w:p>
+                        </w:txbxContent>
+                      </wps:txbx>
+                      <wps:bodyPr rot="0" spcFirstLastPara="0" vertOverflow="overflow" horzOverflow="overflow" vert="horz" wrap="square" lIns="0" tIns="0" rIns="0" bIns="0" numCol="1" spcCol="0" rtlCol="0" fromWordArt="0" anchor="t" anchorCtr="0" forceAA="0" compatLnSpc="1">
+                        <a:prstTxWarp prst="textNoShape">
+                          <a:avLst/>
+                        </a:prstTxWarp>
+                        <a:noAutofit/>
+                      </wps:bodyPr>
+                    </wps:wsp>
+                  </a:graphicData>
+                </a:graphic>
+                <wp14:sizeRelH relativeFrom="margin">
+                  <wp14:pctWidth>0</wp14:pctWidth>
+                </wp14:sizeRelH>
+                <wp14:sizeRelV relativeFrom="margin">
+                  <wp14:pctHeight>0</wp14:pctHeight>
+                </wp14:sizeRelV>
+              </wp:anchor>
+            </w:drawing>
+          </mc:Choice>
+          <mc:Fallback>
+            <w:pict>
+              <v:shape w14:anchorId="47ED1734" id="Casella di testo 33" o:spid="_x0000_s1040" type="#_x0000_t202" style="position:absolute;left:0;text-align:left;margin-left:0;margin-top:416.05pt;width:106.5pt;height:19pt;z-index:251703296;visibility:visible;mso-wrap-style:square;mso-width-percent:0;mso-height-percent:0;mso-wrap-distance-left:9pt;mso-wrap-distance-top:0;mso-wrap-distance-right:9pt;mso-wrap-distance-bottom:0;mso-position-horizontal:center;mso-position-horizontal-relative:margin;mso-position-vertical:absolute;mso-position-vertical-relative:text;mso-width-percent:0;mso-height-percent:0;mso-width-relative:margin;mso-height-relative:margin;v-text-anchor:top" o:gfxdata="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" stroked="f">
+                <v:textbox inset="0,0,0,0">
+                  <w:txbxContent>
+                    <w:p>
+                      <w:pPr>
+                        <w:pStyle w:val="Didascalia"/>
+                        <w:rPr>
+                          <w:b/>
+                          <w:noProof/>
+                          <w:sz w:val="20"/>
+                          <w:lang w:val="it-IT"/>
+                        </w:rPr>
+                      </w:pPr>
+                      <w:r>
+                        <w:t xml:space="preserve">Figura </w:t>
+                      </w:r>
+                      <w:r>
+                        <w:fldChar w:fldCharType="begin"/>
+                      </w:r>
+                      <w:r>
+                        <w:instrText xml:space="preserve"> SEQ Figura \* ARABIC </w:instrText>
+                      </w:r>
+                      <w:r>
+                        <w:fldChar w:fldCharType="separate"/>
+                      </w:r>
+                      <w:r>
+                        <w:rPr>
+                          <w:noProof/>
+                        </w:rPr>
+                        <w:t>16</w:t>
+                      </w:r>
+                      <w:r>
+                        <w:fldChar w:fldCharType="end"/>
+                      </w:r>
+                      <w:r>
+                        <w:t xml:space="preserve"> - Interfaccia APOD</w:t>
+                      </w:r>
+                    </w:p>
+                  </w:txbxContent>
+                </v:textbox>
+                <w10:wrap type="topAndBottom" anchorx="margin"/>
+              </v:shape>
+            </w:pict>
+          </mc:Fallback>
+        </mc:AlternateContent>
+      </w:r>
+      <w:r>
+        <w:rPr>
+          <w:noProof/>
+        </w:rPr>
+        <w:drawing>
+          <wp:anchor distT="0" distB="0" distL="114300" distR="114300" simplePos="0" relativeHeight="251701248" behindDoc="0" locked="0" layoutInCell="1" allowOverlap="1" wp14:anchorId="49E435E2" wp14:editId="55FC0CF1">
+            <wp:simplePos x="0" y="0"/>
+            <wp:positionH relativeFrom="margin">
+              <wp:align>center</wp:align>
+            </wp:positionH>
+            <wp:positionV relativeFrom="paragraph">
+              <wp:posOffset>310956</wp:posOffset>
+            </wp:positionV>
+            <wp:extent cx="3937210" cy="4924985"/>
+            <wp:effectExtent l="0" t="0" r="6350" b="9525"/>
+            <wp:wrapTopAndBottom/>
+            <wp:docPr id="28" name="Immagine 28"/>
+            <wp:cNvGraphicFramePr>
+              <a:graphicFrameLocks xmlns:a="http://schemas.openxmlformats.org/drawingml/2006/main" noChangeAspect="1"/>
+            </wp:cNvGraphicFramePr>
+            <a:graphic xmlns:a="http://schemas.openxmlformats.org/drawingml/2006/main">
+              <a:graphicData uri="http://schemas.openxmlformats.org/drawingml/2006/picture">
+                <pic:pic xmlns:pic="http://schemas.openxmlformats.org/drawingml/2006/picture">
+                  <pic:nvPicPr>
+                    <pic:cNvPr id="0" name="Picture 1"/>
+                    <pic:cNvPicPr>
+                      <a:picLocks noChangeAspect="1" noChangeArrowheads="1"/>
+                    </pic:cNvPicPr>
+                  </pic:nvPicPr>
+                  <pic:blipFill>
+                    <a:blip r:embed="rId23" cstate="print">
+                      <a:extLst>
+                        <a:ext uri="{28A0092B-C50C-407E-A947-70E740481C1C}">
+                          <a14:useLocalDpi xmlns:a14="http://schemas.microsoft.com/office/drawing/2010/main" val="0"/>
+                        </a:ext>
+                      </a:extLst>
+                    </a:blip>
+                    <a:srcRect/>
+                    <a:stretch>
+                      <a:fillRect/>
+                    </a:stretch>
+                  </pic:blipFill>
+                  <pic:spPr bwMode="auto">
+                    <a:xfrm>
+                      <a:off x="0" y="0"/>
+                      <a:ext cx="3937210" cy="4924985"/>
+                    </a:xfrm>
+                    <a:prstGeom prst="rect">
+                      <a:avLst/>
+                    </a:prstGeom>
+                    <a:noFill/>
+                    <a:ln>
+                      <a:noFill/>
+                    </a:ln>
+                  </pic:spPr>
+                </pic:pic>
+              </a:graphicData>
+            </a:graphic>
+          </wp:anchor>
+        </w:drawing>
+      </w:r>
+      <w:r>
+        <w:t>Interfaccia</w:t>
+      </w:r>
+    </w:p>
+    <w:p>
+      <w:pPr>
+        <w:pStyle w:val="NormaleWeb"/>
+        <w:spacing w:before="0" w:beforeAutospacing="0"/>
+        <w:rPr>
+          <w:rFonts w:ascii="Arial" w:hAnsi="Arial" w:cs="Arial"/>
+          <w:sz w:val="20"/>
+          <w:szCs w:val="20"/>
+        </w:rPr>
+      </w:pPr>
+    </w:p>
+    <w:p>
+      <w:pPr>
+        <w:pStyle w:val="NormaleWeb"/>
+        <w:spacing w:before="0" w:beforeAutospacing="0"/>
+        <w:rPr>
+          <w:rFonts w:ascii="Arial" w:hAnsi="Arial" w:cs="Arial"/>
+          <w:sz w:val="20"/>
+          <w:szCs w:val="20"/>
+        </w:rPr>
+      </w:pPr>
+      <w:r>
+        <w:rPr>
+          <w:rFonts w:ascii="Arial" w:hAnsi="Arial" w:cs="Arial"/>
+          <w:sz w:val="20"/>
+          <w:szCs w:val="20"/>
+        </w:rPr>
+        <w:t>Questa schermata mostra il risultato di una richiesta a una API astronomica</w:t>
+      </w:r>
+      <w:r>
+        <w:rPr>
+          <w:rFonts w:ascii="Arial" w:hAnsi="Arial" w:cs="Arial"/>
+          <w:sz w:val="20"/>
+          <w:szCs w:val="20"/>
+        </w:rPr>
+        <w:t xml:space="preserve"> (</w:t>
+      </w:r>
+      <w:hyperlink r:id="rId24" w:history="1">
+        <w:r>
+          <w:rPr>
+            <w:rStyle w:val="Collegamentoipertestuale"/>
+            <w:rFonts w:ascii="Arial" w:hAnsi="Arial" w:cs="Arial"/>
+            <w:sz w:val="20"/>
+            <w:szCs w:val="20"/>
+          </w:rPr>
+          <w:t>API NASA</w:t>
+        </w:r>
+      </w:hyperlink>
+      <w:r>
+        <w:rPr>
+          <w:rFonts w:ascii="Arial" w:hAnsi="Arial" w:cs="Arial"/>
+          <w:sz w:val="20"/>
+          <w:szCs w:val="20"/>
+        </w:rPr>
+        <w:t>)</w:t>
+      </w:r>
+      <w:r>
+        <w:rPr>
+          <w:rFonts w:ascii="Arial" w:hAnsi="Arial" w:cs="Arial"/>
+          <w:sz w:val="20"/>
+          <w:szCs w:val="20"/>
+        </w:rPr>
+        <w:t xml:space="preserve"> utilizzata dall’app per ottenere ogni giorno un contenuto scientifico aggiornato. In questo caso, l’API ha restituito le informazioni relative alla NGC 6888 – </w:t>
+      </w:r>
+      <w:proofErr w:type="spellStart"/>
+      <w:r>
+        <w:rPr>
+          <w:rFonts w:ascii="Arial" w:hAnsi="Arial" w:cs="Arial"/>
+          <w:sz w:val="20"/>
+          <w:szCs w:val="20"/>
+        </w:rPr>
+        <w:t>Crescent</w:t>
+      </w:r>
+      <w:proofErr w:type="spellEnd"/>
+      <w:r>
+        <w:rPr>
+          <w:rFonts w:ascii="Arial" w:hAnsi="Arial" w:cs="Arial"/>
+          <w:sz w:val="20"/>
+          <w:szCs w:val="20"/>
+        </w:rPr>
+        <w:t xml:space="preserve"> Nebula, un oggetto celeste visivamente molto riconoscibile.</w:t>
+      </w:r>
+    </w:p>
+    <w:p>
+      <w:pPr>
+        <w:pStyle w:val="NormaleWeb"/>
+        <w:spacing w:before="0" w:beforeAutospacing="0"/>
+        <w:rPr>
+          <w:rFonts w:ascii="Arial" w:hAnsi="Arial" w:cs="Arial"/>
+          <w:sz w:val="20"/>
+          <w:szCs w:val="20"/>
+        </w:rPr>
+      </w:pPr>
+      <w:r>
+        <w:rPr>
+          <w:rFonts w:ascii="Arial" w:hAnsi="Arial" w:cs="Arial"/>
+          <w:sz w:val="20"/>
+          <w:szCs w:val="20"/>
+        </w:rPr>
+        <w:t>Nella parte superiore è presente il pulsante Back, che consente di tornare alla pagina principale. Subito sotto compare il titolo dinamico dell’oggetto astronomico, recuperato direttamente dalla risposta dell’API.</w:t>
+      </w:r>
+    </w:p>
+    <w:p>
+      <w:pPr>
+        <w:pStyle w:val="NormaleWeb"/>
+        <w:spacing w:before="0" w:beforeAutospacing="0"/>
+        <w:rPr>
+          <w:rFonts w:ascii="Arial" w:hAnsi="Arial" w:cs="Arial"/>
+          <w:sz w:val="20"/>
+          <w:szCs w:val="20"/>
+        </w:rPr>
+      </w:pPr>
+      <w:r>
+        <w:rPr>
+          <w:rFonts w:ascii="Arial" w:hAnsi="Arial" w:cs="Arial"/>
+          <w:sz w:val="20"/>
+          <w:szCs w:val="20"/>
+        </w:rPr>
+        <w:t>Al centro della schermata viene visualizzata l’immagine ad alta risoluzione fornita dalla stessa API.</w:t>
+      </w:r>
+      <w:r>
+        <w:rPr>
+          <w:rFonts w:ascii="Arial" w:hAnsi="Arial" w:cs="Arial"/>
+          <w:sz w:val="20"/>
+          <w:szCs w:val="20"/>
+        </w:rPr>
+        <w:t xml:space="preserve"> </w:t>
+      </w:r>
+      <w:r>
+        <w:rPr>
+          <w:rFonts w:ascii="Arial" w:hAnsi="Arial" w:cs="Arial"/>
+          <w:sz w:val="20"/>
+          <w:szCs w:val="20"/>
+        </w:rPr>
+        <w:t>L'immagine viene caricata e adattata automaticamente al layout dell’app.</w:t>
+      </w:r>
+    </w:p>
+    <w:p>
+      <w:pPr>
+        <w:pStyle w:val="NormaleWeb"/>
+        <w:spacing w:before="0" w:beforeAutospacing="0"/>
+        <w:rPr>
+          <w:rFonts w:ascii="Arial" w:hAnsi="Arial" w:cs="Arial"/>
+          <w:sz w:val="20"/>
+          <w:szCs w:val="20"/>
+        </w:rPr>
+      </w:pPr>
+      <w:r>
+        <w:rPr>
+          <w:rFonts w:ascii="Arial" w:hAnsi="Arial" w:cs="Arial"/>
+          <w:sz w:val="20"/>
+          <w:szCs w:val="20"/>
+        </w:rPr>
+        <w:t>Nella parte inferiore è presente una descrizione testuale, anch’essa generata a partire dai dati dell’API. Il testo include informazioni scientifiche come dimensioni, distanza e caratteristiche fisiche.</w:t>
+      </w:r>
+    </w:p>
     <w:p>
       <w:pPr>
         <w:pStyle w:val="Titolo2"/>
@@ -12523,7 +12968,6 @@
       </w:pPr>
       <w:proofErr w:type="spellStart"/>
       <w:r>
-        <w:lastRenderedPageBreak/>
         <w:t>MyApp.swift</w:t>
       </w:r>
       <w:proofErr w:type="spellEnd"/>
@@ -12564,7 +13008,11 @@
       </w:r>
       <w:proofErr w:type="gramEnd"/>
       <w:r>
-        <w:t>). Da questa struttura inizia l’esecuzione dell’intera interfaccia e la navigazione verso le altre viste. Il file funge quindi da configurazione base dell’app e garantisce l’avvio corretto dell’esperienza utente.</w:t>
+        <w:t xml:space="preserve">). Da questa struttura inizia l’esecuzione dell’intera </w:t>
+      </w:r>
+      <w:r>
+        <w:lastRenderedPageBreak/>
+        <w:t>interfaccia e la navigazione verso le altre viste. Il file funge quindi da configurazione base dell’app e garantisce l’avvio corretto dell’esperienza utente.</w:t>
       </w:r>
     </w:p>
     <w:p>
@@ -12577,11 +13025,206 @@
       </w:pPr>
       <w:proofErr w:type="spellStart"/>
       <w:r>
-        <w:t>Package.swift</w:t>
+        <w:t>Planet.swift</w:t>
       </w:r>
       <w:proofErr w:type="spellEnd"/>
     </w:p>
     <w:p>
+      <w:r>
+        <w:rPr>
+          <w:noProof/>
+        </w:rPr>
+        <mc:AlternateContent>
+          <mc:Choice Requires="wps">
+            <w:drawing>
+              <wp:anchor distT="0" distB="0" distL="114300" distR="114300" simplePos="0" relativeHeight="251706368" behindDoc="0" locked="0" layoutInCell="1" allowOverlap="1" wp14:anchorId="60A2C17F" wp14:editId="02CE9464">
+                <wp:simplePos x="0" y="0"/>
+                <wp:positionH relativeFrom="margin">
+                  <wp:align>center</wp:align>
+                </wp:positionH>
+                <wp:positionV relativeFrom="paragraph">
+                  <wp:posOffset>2636074</wp:posOffset>
+                </wp:positionV>
+                <wp:extent cx="1450340" cy="264160"/>
+                <wp:effectExtent l="0" t="0" r="0" b="2540"/>
+                <wp:wrapTopAndBottom/>
+                <wp:docPr id="35" name="Casella di testo 35"/>
+                <wp:cNvGraphicFramePr/>
+                <a:graphic xmlns:a="http://schemas.openxmlformats.org/drawingml/2006/main">
+                  <a:graphicData uri="http://schemas.microsoft.com/office/word/2010/wordprocessingShape">
+                    <wps:wsp>
+                      <wps:cNvSpPr txBox="1"/>
+                      <wps:spPr>
+                        <a:xfrm>
+                          <a:off x="0" y="0"/>
+                          <a:ext cx="1450340" cy="264160"/>
+                        </a:xfrm>
+                        <a:prstGeom prst="rect">
+                          <a:avLst/>
+                        </a:prstGeom>
+                        <a:solidFill>
+                          <a:prstClr val="white"/>
+                        </a:solidFill>
+                        <a:ln>
+                          <a:noFill/>
+                        </a:ln>
+                      </wps:spPr>
+                      <wps:txbx>
+                        <w:txbxContent>
+                          <w:p>
+                            <w:pPr>
+                              <w:pStyle w:val="Didascalia"/>
+                              <w:rPr>
+                                <w:sz w:val="20"/>
+                              </w:rPr>
+                            </w:pPr>
+                            <w:r>
+                              <w:t xml:space="preserve">Figura </w:t>
+                            </w:r>
+                            <w:r>
+                              <w:fldChar w:fldCharType="begin"/>
+                            </w:r>
+                            <w:r>
+                              <w:instrText xml:space="preserve"> SEQ Figura \* ARABIC </w:instrText>
+                            </w:r>
+                            <w:r>
+                              <w:fldChar w:fldCharType="separate"/>
+                            </w:r>
+                            <w:r>
+                              <w:rPr>
+                                <w:noProof/>
+                              </w:rPr>
+                              <w:t>17</w:t>
+                            </w:r>
+                            <w:r>
+                              <w:fldChar w:fldCharType="end"/>
+                            </w:r>
+                            <w:r>
+                              <w:t xml:space="preserve"> - Codice significativo</w:t>
+                            </w:r>
+                          </w:p>
+                        </w:txbxContent>
+                      </wps:txbx>
+                      <wps:bodyPr rot="0" spcFirstLastPara="0" vertOverflow="overflow" horzOverflow="overflow" vert="horz" wrap="square" lIns="0" tIns="0" rIns="0" bIns="0" numCol="1" spcCol="0" rtlCol="0" fromWordArt="0" anchor="t" anchorCtr="0" forceAA="0" compatLnSpc="1">
+                        <a:prstTxWarp prst="textNoShape">
+                          <a:avLst/>
+                        </a:prstTxWarp>
+                        <a:noAutofit/>
+                      </wps:bodyPr>
+                    </wps:wsp>
+                  </a:graphicData>
+                </a:graphic>
+                <wp14:sizeRelH relativeFrom="margin">
+                  <wp14:pctWidth>0</wp14:pctWidth>
+                </wp14:sizeRelH>
+                <wp14:sizeRelV relativeFrom="margin">
+                  <wp14:pctHeight>0</wp14:pctHeight>
+                </wp14:sizeRelV>
+              </wp:anchor>
+            </w:drawing>
+          </mc:Choice>
+          <mc:Fallback>
+            <w:pict>
+              <v:shape w14:anchorId="60A2C17F" id="Casella di testo 35" o:spid="_x0000_s1041" type="#_x0000_t202" style="position:absolute;margin-left:0;margin-top:207.55pt;width:114.2pt;height:20.8pt;z-index:251706368;visibility:visible;mso-wrap-style:square;mso-width-percent:0;mso-height-percent:0;mso-wrap-distance-left:9pt;mso-wrap-distance-top:0;mso-wrap-distance-right:9pt;mso-wrap-distance-bottom:0;mso-position-horizontal:center;mso-position-horizontal-relative:margin;mso-position-vertical:absolute;mso-position-vertical-relative:text;mso-width-percent:0;mso-height-percent:0;mso-width-relative:margin;mso-height-relative:margin;v-text-anchor:top" o:gfxdata="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" stroked="f">
+                <v:textbox inset="0,0,0,0">
+                  <w:txbxContent>
+                    <w:p>
+                      <w:pPr>
+                        <w:pStyle w:val="Didascalia"/>
+                        <w:rPr>
+                          <w:sz w:val="20"/>
+                        </w:rPr>
+                      </w:pPr>
+                      <w:r>
+                        <w:t xml:space="preserve">Figura </w:t>
+                      </w:r>
+                      <w:r>
+                        <w:fldChar w:fldCharType="begin"/>
+                      </w:r>
+                      <w:r>
+                        <w:instrText xml:space="preserve"> SEQ Figura \* ARABIC </w:instrText>
+                      </w:r>
+                      <w:r>
+                        <w:fldChar w:fldCharType="separate"/>
+                      </w:r>
+                      <w:r>
+                        <w:rPr>
+                          <w:noProof/>
+                        </w:rPr>
+                        <w:t>17</w:t>
+                      </w:r>
+                      <w:r>
+                        <w:fldChar w:fldCharType="end"/>
+                      </w:r>
+                      <w:r>
+                        <w:t xml:space="preserve"> - Codice significativo</w:t>
+                      </w:r>
+                    </w:p>
+                  </w:txbxContent>
+                </v:textbox>
+                <w10:wrap type="topAndBottom" anchorx="margin"/>
+              </v:shape>
+            </w:pict>
+          </mc:Fallback>
+        </mc:AlternateContent>
+      </w:r>
+      <w:r>
+        <w:drawing>
+          <wp:anchor distT="0" distB="0" distL="114300" distR="114300" simplePos="0" relativeHeight="251704320" behindDoc="0" locked="0" layoutInCell="1" allowOverlap="1" wp14:anchorId="1D007226" wp14:editId="6BE6A292">
+            <wp:simplePos x="0" y="0"/>
+            <wp:positionH relativeFrom="margin">
+              <wp:align>center</wp:align>
+            </wp:positionH>
+            <wp:positionV relativeFrom="paragraph">
+              <wp:posOffset>837954</wp:posOffset>
+            </wp:positionV>
+            <wp:extent cx="1654810" cy="1767840"/>
+            <wp:effectExtent l="0" t="0" r="2540" b="3810"/>
+            <wp:wrapTopAndBottom/>
+            <wp:docPr id="34" name="Immagine 34"/>
+            <wp:cNvGraphicFramePr>
+              <a:graphicFrameLocks xmlns:a="http://schemas.openxmlformats.org/drawingml/2006/main" noChangeAspect="1"/>
+            </wp:cNvGraphicFramePr>
+            <a:graphic xmlns:a="http://schemas.openxmlformats.org/drawingml/2006/main">
+              <a:graphicData uri="http://schemas.openxmlformats.org/drawingml/2006/picture">
+                <pic:pic xmlns:pic="http://schemas.openxmlformats.org/drawingml/2006/picture">
+                  <pic:nvPicPr>
+                    <pic:cNvPr id="1" name=""/>
+                    <pic:cNvPicPr/>
+                  </pic:nvPicPr>
+                  <pic:blipFill>
+                    <a:blip r:embed="rId25">
+                      <a:extLst>
+                        <a:ext uri="{28A0092B-C50C-407E-A947-70E740481C1C}">
+                          <a14:useLocalDpi xmlns:a14="http://schemas.microsoft.com/office/drawing/2010/main" val="0"/>
+                        </a:ext>
+                      </a:extLst>
+                    </a:blip>
+                    <a:stretch>
+                      <a:fillRect/>
+                    </a:stretch>
+                  </pic:blipFill>
+                  <pic:spPr>
+                    <a:xfrm>
+                      <a:off x="0" y="0"/>
+                      <a:ext cx="1654810" cy="1767840"/>
+                    </a:xfrm>
+                    <a:prstGeom prst="rect">
+                      <a:avLst/>
+                    </a:prstGeom>
+                  </pic:spPr>
+                </pic:pic>
+              </a:graphicData>
+            </a:graphic>
+            <wp14:sizeRelH relativeFrom="margin">
+              <wp14:pctWidth>0</wp14:pctWidth>
+            </wp14:sizeRelH>
+            <wp14:sizeRelV relativeFrom="margin">
+              <wp14:pctHeight>0</wp14:pctHeight>
+            </wp14:sizeRelV>
+          </wp:anchor>
+        </w:drawing>
+      </w:r>
       <w:r>
         <w:t xml:space="preserve">Il file </w:t>
       </w:r>
@@ -12590,12 +13233,183 @@
           <w:b/>
           <w:bCs/>
         </w:rPr>
-        <w:t>Package</w:t>
-      </w:r>
-      <w:r>
-        <w:t xml:space="preserve"> contiene la configurazione automatica del progetto Nebula tramite Swift Package Manager. In esso sono definiti il nome del progetto, le piattaforme supportate (iOS 18.1 e successivi), i parametri grafici dell’app come icona e colore d’accento, l’orientamento supportato dei dispositivi e il target principale del codice sorgente. Questo file permette al sistema di compilazione di strutturare correttamente l’applicazione, includendo risorse, versioni, compatibilità con i dispositivi Apple e impostazioni avanzate per il compilatore Swift. Essendo generato automaticamente dall’ambiente di sviluppo, non richiede modifiche manuali.</w:t>
-      </w:r>
-    </w:p>
+        <w:t>Planet</w:t>
+      </w:r>
+      <w:r>
+        <w:t xml:space="preserve"> definisce le strutture dati utilizzate per rappresentare i pianeti e i contenuti multimediali associati. Le strutture Planet e Video adottano il protocollo </w:t>
+      </w:r>
+      <w:proofErr w:type="spellStart"/>
+      <w:r>
+        <w:t>Codable</w:t>
+      </w:r>
+      <w:proofErr w:type="spellEnd"/>
+      <w:r>
+        <w:t xml:space="preserve">, permettendo la lettura e la decodifica dei dati da un file JSON. Ogni pianeta possiede un nome, una lista di dettagli informativi e, se disponibile, un video esplicativo proveniente da YouTube tramite il modello Video. Questo approccio consente una gestione dinamica e strutturata delle informazioni, rendendo il sistema facilmente espandibile e </w:t>
+      </w:r>
+      <w:proofErr w:type="spellStart"/>
+      <w:r>
+        <w:t>manutenibile</w:t>
+      </w:r>
+      <w:proofErr w:type="spellEnd"/>
+      <w:r>
+        <w:t>.</w:t>
+      </w:r>
+    </w:p>
+    <w:p>
+      <w:r>
+        <w:t xml:space="preserve">Nel progetto </w:t>
+      </w:r>
+      <w:r>
+        <w:t>sono stati</w:t>
+      </w:r>
+      <w:r>
+        <w:t xml:space="preserve"> definit</w:t>
+      </w:r>
+      <w:r>
+        <w:t>i</w:t>
+      </w:r>
+      <w:r>
+        <w:t xml:space="preserve"> due tipi di dati che servono per organizzare meglio le informazioni sui pianeti e sui loro contenuti multimediali</w:t>
+      </w:r>
+      <w:r>
+        <w:t>:</w:t>
+      </w:r>
+    </w:p>
+    <w:p>
+      <w:pPr>
+        <w:pStyle w:val="Paragrafoelenco"/>
+        <w:numPr>
+          <w:ilvl w:val="0"/>
+          <w:numId w:val="47"/>
+        </w:numPr>
+      </w:pPr>
+      <w:r>
+        <w:t>Video</w:t>
+      </w:r>
+      <w:r>
+        <w:t xml:space="preserve">: </w:t>
+      </w:r>
+      <w:r>
+        <w:t>rappresenta un singolo video collegato a un pianeta.</w:t>
+      </w:r>
+      <w:r>
+        <w:t xml:space="preserve"> </w:t>
+      </w:r>
+      <w:r>
+        <w:t>Contiene due informazioni:</w:t>
+      </w:r>
+    </w:p>
+    <w:p>
+      <w:pPr>
+        <w:numPr>
+          <w:ilvl w:val="0"/>
+          <w:numId w:val="44"/>
+        </w:numPr>
+        <w:tabs>
+          <w:tab w:val="num" w:pos="720"/>
+        </w:tabs>
+      </w:pPr>
+      <w:r>
+        <w:t>l’indirizzo del video (</w:t>
+      </w:r>
+      <w:proofErr w:type="spellStart"/>
+      <w:r>
+        <w:t>url</w:t>
+      </w:r>
+      <w:proofErr w:type="spellEnd"/>
+      <w:r>
+        <w:t>)</w:t>
+      </w:r>
+    </w:p>
+    <w:p>
+      <w:pPr>
+        <w:numPr>
+          <w:ilvl w:val="0"/>
+          <w:numId w:val="44"/>
+        </w:numPr>
+        <w:tabs>
+          <w:tab w:val="num" w:pos="720"/>
+        </w:tabs>
+      </w:pPr>
+      <w:r>
+        <w:t xml:space="preserve">il titolo del video, che è opzionale </w:t>
+      </w:r>
+    </w:p>
+    <w:p>
+      <w:r>
+        <w:t>Serve quindi per associare a un pianeta un contenuto video da mostrare all’utente.</w:t>
+      </w:r>
+    </w:p>
+    <w:p>
+      <w:pPr>
+        <w:pStyle w:val="Paragrafoelenco"/>
+        <w:numPr>
+          <w:ilvl w:val="0"/>
+          <w:numId w:val="47"/>
+        </w:numPr>
+      </w:pPr>
+      <w:r>
+        <w:t>Planet</w:t>
+      </w:r>
+      <w:r>
+        <w:t>:</w:t>
+      </w:r>
+      <w:r>
+        <w:t xml:space="preserve"> rappresenta un pianeta</w:t>
+      </w:r>
+      <w:r>
+        <w:t xml:space="preserve"> singolo. </w:t>
+      </w:r>
+      <w:r>
+        <w:t>Contiene:</w:t>
+      </w:r>
+    </w:p>
+    <w:p>
+      <w:pPr>
+        <w:numPr>
+          <w:ilvl w:val="0"/>
+          <w:numId w:val="45"/>
+        </w:numPr>
+      </w:pPr>
+      <w:r>
+        <w:t>il nome del pianeta</w:t>
+      </w:r>
+    </w:p>
+    <w:p>
+      <w:pPr>
+        <w:numPr>
+          <w:ilvl w:val="0"/>
+          <w:numId w:val="45"/>
+        </w:numPr>
+      </w:pPr>
+      <w:r>
+        <w:t>una lista di dettagli o descrizioni</w:t>
+      </w:r>
+    </w:p>
+    <w:p>
+      <w:pPr>
+        <w:numPr>
+          <w:ilvl w:val="0"/>
+          <w:numId w:val="45"/>
+        </w:numPr>
+      </w:pPr>
+      <w:r>
+        <w:t xml:space="preserve">un eventuale video, che usa il tipo Video descritto </w:t>
+      </w:r>
+      <w:r>
+        <w:t>precedentemente</w:t>
+      </w:r>
+    </w:p>
+    <w:p/>
+    <w:p>
+      <w:r>
+        <w:t xml:space="preserve">Questo permette di gestire </w:t>
+      </w:r>
+      <w:r>
+        <w:t>tutte le informazioni presenti in ognuna delle pagine dedicate ai pianeti, avendo la stessa struttura.</w:t>
+      </w:r>
+    </w:p>
+    <w:p/>
     <w:p>
       <w:pPr>
         <w:pStyle w:val="Titolo2"/>
@@ -12606,39 +13420,46 @@
       </w:pPr>
       <w:proofErr w:type="spellStart"/>
       <w:r>
-        <w:t>Planet.swift</w:t>
+        <w:t>PlanetData.swift</w:t>
       </w:r>
       <w:proofErr w:type="spellEnd"/>
     </w:p>
     <w:p>
+      <w:pPr>
+        <w:rPr>
+          <w:lang w:val="it-IT"/>
+        </w:rPr>
+      </w:pPr>
       <w:r>
         <w:t xml:space="preserve">Il file </w:t>
       </w:r>
+      <w:proofErr w:type="spellStart"/>
       <w:r>
         <w:rPr>
           <w:b/>
           <w:bCs/>
         </w:rPr>
-        <w:t>Planet</w:t>
-      </w:r>
-      <w:r>
-        <w:t xml:space="preserve"> definisce le strutture dati utilizzate per rappresentare i pianeti e i contenuti multimediali associati. Le strutture Planet e Video adottano il protocollo </w:t>
+        <w:t>PlanetData</w:t>
+      </w:r>
+      <w:proofErr w:type="spellEnd"/>
+      <w:r>
+        <w:t xml:space="preserve"> implementa una classe responsabile del caricamento dei dati relativi ai pianeti da un file JSON incluso nel progetto. Il metodo statico </w:t>
+      </w:r>
+      <w:proofErr w:type="gramStart"/>
+      <w:r>
+        <w:t>load(</w:t>
+      </w:r>
+      <w:proofErr w:type="gramEnd"/>
+      <w:r>
+        <w:t xml:space="preserve">) individua il file nel bundle dell'applicazione, ne legge il contenuto e lo decodifica in una lista di oggetti Planet tramite </w:t>
       </w:r>
       <w:proofErr w:type="spellStart"/>
       <w:r>
-        <w:t>Codable</w:t>
+        <w:t>JSONDecoder</w:t>
       </w:r>
       <w:proofErr w:type="spellEnd"/>
       <w:r>
-        <w:t xml:space="preserve">, permettendo la lettura e la decodifica dei dati da un file JSON. Ogni pianeta possiede un nome, una lista di dettagli informativi e, se disponibile, un video esplicativo proveniente da YouTube tramite il modello Video. Questo approccio consente una gestione dinamica e strutturata delle informazioni, rendendo il sistema facilmente espandibile e </w:t>
-      </w:r>
-      <w:proofErr w:type="spellStart"/>
-      <w:r>
-        <w:t>manutenibile</w:t>
-      </w:r>
-      <w:proofErr w:type="spellEnd"/>
-      <w:r>
-        <w:t>.</w:t>
+        <w:t>. In caso di errore (file mancante o struttura JSON non valida), il metodo restituisce un array vuoto e stampa un messaggio diagnostico. Questo meccanismo consente di separare i dati dalla logica applicativa, garantendo scalabilità, modularità e semplicità nella gestione e nell’aggiornamento dei contenuti.</w:t>
       </w:r>
     </w:p>
     <w:p>
@@ -12651,16 +13472,11 @@
       </w:pPr>
       <w:proofErr w:type="spellStart"/>
       <w:r>
-        <w:t>PlanetData.swift</w:t>
+        <w:t>PlanetDetailView.swift</w:t>
       </w:r>
       <w:proofErr w:type="spellEnd"/>
     </w:p>
     <w:p>
-      <w:pPr>
-        <w:rPr>
-          <w:lang w:val="it-IT"/>
-        </w:rPr>
-      </w:pPr>
       <w:r>
         <w:t xml:space="preserve">Il file </w:t>
       </w:r>
@@ -12670,53 +13486,6 @@
           <w:b/>
           <w:bCs/>
         </w:rPr>
-        <w:t>PlanetData</w:t>
-      </w:r>
-      <w:proofErr w:type="spellEnd"/>
-      <w:r>
-        <w:t xml:space="preserve"> implementa una classe responsabile del caricamento dei dati relativi ai pianeti da un file JSON incluso nel progetto. Il metodo statico </w:t>
-      </w:r>
-      <w:proofErr w:type="gramStart"/>
-      <w:r>
-        <w:t>load(</w:t>
-      </w:r>
-      <w:proofErr w:type="gramEnd"/>
-      <w:r>
-        <w:t xml:space="preserve">) individua il file nel bundle dell'applicazione, ne legge il contenuto e lo decodifica in una lista di oggetti Planet tramite </w:t>
-      </w:r>
-      <w:proofErr w:type="spellStart"/>
-      <w:r>
-        <w:t>JSONDecoder</w:t>
-      </w:r>
-      <w:proofErr w:type="spellEnd"/>
-      <w:r>
-        <w:t>. In caso di errore (file mancante o struttura JSON non valida), il metodo restituisce un array vuoto e stampa un messaggio diagnostico. Questo meccanismo consente di separare i dati dalla logica applicativa, garantendo scalabilità, modularità e semplicità nella gestione e nell’aggiornamento dei contenuti.</w:t>
-      </w:r>
-    </w:p>
-    <w:p>
-      <w:pPr>
-        <w:pStyle w:val="Titolo2"/>
-        <w:numPr>
-          <w:ilvl w:val="1"/>
-          <w:numId w:val="42"/>
-        </w:numPr>
-      </w:pPr>
-      <w:proofErr w:type="spellStart"/>
-      <w:r>
-        <w:t>PlanetDetailView.swift</w:t>
-      </w:r>
-      <w:proofErr w:type="spellEnd"/>
-    </w:p>
-    <w:p>
-      <w:r>
-        <w:t xml:space="preserve">Il file </w:t>
-      </w:r>
-      <w:proofErr w:type="spellStart"/>
-      <w:r>
-        <w:rPr>
-          <w:b/>
-          <w:bCs/>
-        </w:rPr>
         <w:t>PlanetDetailView</w:t>
       </w:r>
       <w:proofErr w:type="spellEnd"/>
@@ -12745,7 +13514,11 @@
       </w:r>
       <w:proofErr w:type="spellEnd"/>
       <w:r>
-        <w:t xml:space="preserve"> per permettere la consultazione completa dei contenuti anche su schermi di dimensioni ridotte. L’interfaccia mantiene coerenza estetica con il resto dell’applicazione utilizzando sfondo tematico e palette cromatica appropriata.</w:t>
+        <w:t xml:space="preserve"> per permettere la consultazione completa dei </w:t>
+      </w:r>
+      <w:r>
+        <w:lastRenderedPageBreak/>
+        <w:t>contenuti anche su schermi di dimensioni ridotte. L’interfaccia mantiene coerenza estetica con il resto dell’applicazione utilizzando sfondo tematico e palette cromatica appropriata.</w:t>
       </w:r>
       <w:r>
         <w:br/>
@@ -13878,6 +14651,7 @@
       </w:pPr>
       <w:bookmarkStart w:id="32" w:name="_Toc94790462"/>
       <w:r>
+        <w:lastRenderedPageBreak/>
         <w:t>Risultati test</w:t>
       </w:r>
       <w:bookmarkEnd w:id="31"/>
@@ -14018,7 +14792,6 @@
         <w:rPr>
           <w:lang w:val="it-IT"/>
         </w:rPr>
-        <w:lastRenderedPageBreak/>
         <w:t>Conclusioni</w:t>
       </w:r>
       <w:bookmarkEnd w:id="37"/>
@@ -15070,15 +15843,16 @@
       </w:pPr>
     </w:p>
     <w:sectPr>
-      <w:headerReference w:type="default" r:id="rId23"/>
-      <w:footerReference w:type="default" r:id="rId24"/>
-      <w:headerReference w:type="first" r:id="rId25"/>
-      <w:footerReference w:type="first" r:id="rId26"/>
-      <w:pgSz w:w="11906" w:h="16838"/>
+      <w:headerReference w:type="default" r:id="rId26"/>
+      <w:footerReference w:type="default" r:id="rId27"/>
+      <w:headerReference w:type="first" r:id="rId28"/>
+      <w:footerReference w:type="first" r:id="rId29"/>
+      <w:pgSz w:w="11906" w:h="16838" w:code="9"/>
       <w:pgMar w:top="1985" w:right="1134" w:bottom="1418" w:left="1134" w:header="567" w:footer="567" w:gutter="0"/>
       <w:pgNumType w:start="1"/>
       <w:cols w:space="720"/>
       <w:titlePg/>
+      <w:docGrid w:linePitch="272"/>
     </w:sectPr>
   </w:body>
 </w:document>
@@ -16028,6 +16802,155 @@
 <file path=word/numbering.xml><?xml version="1.0" encoding="utf-8"?>
 <w:numbering xmlns:wpc="http://schemas.microsoft.com/office/word/2010/wordprocessingCanvas" xmlns:cx="http://schemas.microsoft.com/office/drawing/2014/chartex" xmlns:cx1="http://schemas.microsoft.com/office/drawing/2015/9/8/chartex" xmlns:cx2="http://schemas.microsoft.com/office/drawing/2015/10/21/chartex" xmlns:cx3="http://schemas.microsoft.com/office/drawing/2016/5/9/chartex" xmlns:cx4="http://schemas.microsoft.com/office/drawing/2016/5/10/chartex" xmlns:cx5="http://schemas.microsoft.com/office/drawing/2016/5/11/chartex" xmlns:cx6="http://schemas.microsoft.com/office/drawing/2016/5/12/chartex" xmlns:cx7="http://schemas.microsoft.com/office/drawing/2016/5/13/chartex" xmlns:cx8="http://schemas.microsoft.com/office/drawing/2016/5/14/chartex" xmlns:mc="http://schemas.openxmlformats.org/markup-compatibility/2006" xmlns:aink="http://schemas.microsoft.com/office/drawing/2016/ink" xmlns:am3d="http://schemas.microsoft.com/office/drawing/2017/model3d" xmlns:o="urn:schemas-microsoft-com:office:office" xmlns:oel="http://schemas.microsoft.com/office/2019/extlst" xmlns:r="http://schemas.openxmlformats.org/officeDocument/2006/relationships" xmlns:m="http://schemas.openxmlformats.org/officeDocument/2006/math" xmlns:v="urn:schemas-microsoft-com:vml" xmlns:wp14="http://schemas.microsoft.com/office/word/2010/wordprocessingDrawing" xmlns:wp="http://schemas.openxmlformats.org/drawingml/2006/wordprocessingDrawing" xmlns:w10="urn:schemas-microsoft-com:office:word" xmlns:w="http://schemas.openxmlformats.org/wordprocessingml/2006/main" xmlns:w14="http://schemas.microsoft.com/office/word/2010/wordml" xmlns:w15="http://schemas.microsoft.com/office/word/2012/wordml" xmlns:w16cex="http://schemas.microsoft.com/office/word/2018/wordml/cex" xmlns:w16cid="http://schemas.microsoft.com/office/word/2016/wordml/cid" xmlns:w16="http://schemas.microsoft.com/office/word/2018/wordml" xmlns:w16sdtdh="http://schemas.microsoft.com/office/word/2020/wordml/sdtdatahash" xmlns:w16se="http://schemas.microsoft.com/office/word/2015/wordml/symex" xmlns:wpg="http://schemas.microsoft.com/office/word/2010/wordprocessingGroup" xmlns:wpi="http://schemas.microsoft.com/office/word/2010/wordprocessingInk" xmlns:wne="http://schemas.microsoft.com/office/word/2006/wordml" xmlns:wps="http://schemas.microsoft.com/office/word/2010/wordprocessingShape" mc:Ignorable="w14 w15 w16se w16cid w16 w16cex w16sdtdh wp14">
   <w:abstractNum w:abstractNumId="0" w15:restartNumberingAfterBreak="0">
+    <w:nsid w:val="034E642B"/>
+    <w:multiLevelType w:val="multilevel"/>
+    <w:tmpl w:val="08C6ECB6"/>
+    <w:lvl w:ilvl="0">
+      <w:start w:val="1"/>
+      <w:numFmt w:val="bullet"/>
+      <w:lvlText w:val=""/>
+      <w:lvlJc w:val="left"/>
+      <w:pPr>
+        <w:tabs>
+          <w:tab w:val="num" w:pos="1068"/>
+        </w:tabs>
+        <w:ind w:left="1068" w:hanging="360"/>
+      </w:pPr>
+      <w:rPr>
+        <w:rFonts w:ascii="Symbol" w:hAnsi="Symbol" w:hint="default"/>
+        <w:sz w:val="20"/>
+      </w:rPr>
+    </w:lvl>
+    <w:lvl w:ilvl="1" w:tentative="1">
+      <w:start w:val="1"/>
+      <w:numFmt w:val="bullet"/>
+      <w:lvlText w:val="o"/>
+      <w:lvlJc w:val="left"/>
+      <w:pPr>
+        <w:tabs>
+          <w:tab w:val="num" w:pos="1788"/>
+        </w:tabs>
+        <w:ind w:left="1788" w:hanging="360"/>
+      </w:pPr>
+      <w:rPr>
+        <w:rFonts w:ascii="Courier New" w:hAnsi="Courier New" w:hint="default"/>
+        <w:sz w:val="20"/>
+      </w:rPr>
+    </w:lvl>
+    <w:lvl w:ilvl="2" w:tentative="1">
+      <w:start w:val="1"/>
+      <w:numFmt w:val="bullet"/>
+      <w:lvlText w:val=""/>
+      <w:lvlJc w:val="left"/>
+      <w:pPr>
+        <w:tabs>
+          <w:tab w:val="num" w:pos="2508"/>
+        </w:tabs>
+        <w:ind w:left="2508" w:hanging="360"/>
+      </w:pPr>
+      <w:rPr>
+        <w:rFonts w:ascii="Wingdings" w:hAnsi="Wingdings" w:hint="default"/>
+        <w:sz w:val="20"/>
+      </w:rPr>
+    </w:lvl>
+    <w:lvl w:ilvl="3" w:tentative="1">
+      <w:start w:val="1"/>
+      <w:numFmt w:val="bullet"/>
+      <w:lvlText w:val=""/>
+      <w:lvlJc w:val="left"/>
+      <w:pPr>
+        <w:tabs>
+          <w:tab w:val="num" w:pos="3228"/>
+        </w:tabs>
+        <w:ind w:left="3228" w:hanging="360"/>
+      </w:pPr>
+      <w:rPr>
+        <w:rFonts w:ascii="Wingdings" w:hAnsi="Wingdings" w:hint="default"/>
+        <w:sz w:val="20"/>
+      </w:rPr>
+    </w:lvl>
+    <w:lvl w:ilvl="4" w:tentative="1">
+      <w:start w:val="1"/>
+      <w:numFmt w:val="bullet"/>
+      <w:lvlText w:val=""/>
+      <w:lvlJc w:val="left"/>
+      <w:pPr>
+        <w:tabs>
+          <w:tab w:val="num" w:pos="3948"/>
+        </w:tabs>
+        <w:ind w:left="3948" w:hanging="360"/>
+      </w:pPr>
+      <w:rPr>
+        <w:rFonts w:ascii="Wingdings" w:hAnsi="Wingdings" w:hint="default"/>
+        <w:sz w:val="20"/>
+      </w:rPr>
+    </w:lvl>
+    <w:lvl w:ilvl="5" w:tentative="1">
+      <w:start w:val="1"/>
+      <w:numFmt w:val="bullet"/>
+      <w:lvlText w:val=""/>
+      <w:lvlJc w:val="left"/>
+      <w:pPr>
+        <w:tabs>
+          <w:tab w:val="num" w:pos="4668"/>
+        </w:tabs>
+        <w:ind w:left="4668" w:hanging="360"/>
+      </w:pPr>
+      <w:rPr>
+        <w:rFonts w:ascii="Wingdings" w:hAnsi="Wingdings" w:hint="default"/>
+        <w:sz w:val="20"/>
+      </w:rPr>
+    </w:lvl>
+    <w:lvl w:ilvl="6" w:tentative="1">
+      <w:start w:val="1"/>
+      <w:numFmt w:val="bullet"/>
+      <w:lvlText w:val=""/>
+      <w:lvlJc w:val="left"/>
+      <w:pPr>
+        <w:tabs>
+          <w:tab w:val="num" w:pos="5388"/>
+        </w:tabs>
+        <w:ind w:left="5388" w:hanging="360"/>
+      </w:pPr>
+      <w:rPr>
+        <w:rFonts w:ascii="Wingdings" w:hAnsi="Wingdings" w:hint="default"/>
+        <w:sz w:val="20"/>
+      </w:rPr>
+    </w:lvl>
+    <w:lvl w:ilvl="7" w:tentative="1">
+      <w:start w:val="1"/>
+      <w:numFmt w:val="bullet"/>
+      <w:lvlText w:val=""/>
+      <w:lvlJc w:val="left"/>
+      <w:pPr>
+        <w:tabs>
+          <w:tab w:val="num" w:pos="6108"/>
+        </w:tabs>
+        <w:ind w:left="6108" w:hanging="360"/>
+      </w:pPr>
+      <w:rPr>
+        <w:rFonts w:ascii="Wingdings" w:hAnsi="Wingdings" w:hint="default"/>
+        <w:sz w:val="20"/>
+      </w:rPr>
+    </w:lvl>
+    <w:lvl w:ilvl="8" w:tentative="1">
+      <w:start w:val="1"/>
+      <w:numFmt w:val="bullet"/>
+      <w:lvlText w:val=""/>
+      <w:lvlJc w:val="left"/>
+      <w:pPr>
+        <w:tabs>
+          <w:tab w:val="num" w:pos="6828"/>
+        </w:tabs>
+        <w:ind w:left="6828" w:hanging="360"/>
+      </w:pPr>
+      <w:rPr>
+        <w:rFonts w:ascii="Wingdings" w:hAnsi="Wingdings" w:hint="default"/>
+        <w:sz w:val="20"/>
+      </w:rPr>
+    </w:lvl>
+  </w:abstractNum>
+  <w:abstractNum w:abstractNumId="1" w15:restartNumberingAfterBreak="0">
     <w:nsid w:val="0801489A"/>
     <w:multiLevelType w:val="hybridMultilevel"/>
     <w:tmpl w:val="F3A21FFC"/>
@@ -16140,7 +17063,7 @@
       </w:pPr>
     </w:lvl>
   </w:abstractNum>
-  <w:abstractNum w:abstractNumId="1" w15:restartNumberingAfterBreak="0">
+  <w:abstractNum w:abstractNumId="2" w15:restartNumberingAfterBreak="0">
     <w:nsid w:val="0BD80EB2"/>
     <w:multiLevelType w:val="hybridMultilevel"/>
     <w:tmpl w:val="D3143AC2"/>
@@ -16280,7 +17203,7 @@
       </w:rPr>
     </w:lvl>
   </w:abstractNum>
-  <w:abstractNum w:abstractNumId="2" w15:restartNumberingAfterBreak="0">
+  <w:abstractNum w:abstractNumId="3" w15:restartNumberingAfterBreak="0">
     <w:nsid w:val="0D547769"/>
     <w:multiLevelType w:val="hybridMultilevel"/>
     <w:tmpl w:val="7F2074D2"/>
@@ -16420,7 +17343,7 @@
       </w:rPr>
     </w:lvl>
   </w:abstractNum>
-  <w:abstractNum w:abstractNumId="3" w15:restartNumberingAfterBreak="0">
+  <w:abstractNum w:abstractNumId="4" w15:restartNumberingAfterBreak="0">
     <w:nsid w:val="10CB776C"/>
     <w:multiLevelType w:val="hybridMultilevel"/>
     <w:tmpl w:val="678CE950"/>
@@ -16560,7 +17483,7 @@
       </w:rPr>
     </w:lvl>
   </w:abstractNum>
-  <w:abstractNum w:abstractNumId="4" w15:restartNumberingAfterBreak="0">
+  <w:abstractNum w:abstractNumId="5" w15:restartNumberingAfterBreak="0">
     <w:nsid w:val="12C843D7"/>
     <w:multiLevelType w:val="hybridMultilevel"/>
     <w:tmpl w:val="C1845D68"/>
@@ -16700,7 +17623,7 @@
       </w:rPr>
     </w:lvl>
   </w:abstractNum>
-  <w:abstractNum w:abstractNumId="5" w15:restartNumberingAfterBreak="0">
+  <w:abstractNum w:abstractNumId="6" w15:restartNumberingAfterBreak="0">
     <w:nsid w:val="14EA06CA"/>
     <w:multiLevelType w:val="multilevel"/>
     <w:tmpl w:val="35A8F98A"/>
@@ -16849,7 +17772,7 @@
       </w:rPr>
     </w:lvl>
   </w:abstractNum>
-  <w:abstractNum w:abstractNumId="6" w15:restartNumberingAfterBreak="0">
+  <w:abstractNum w:abstractNumId="7" w15:restartNumberingAfterBreak="0">
     <w:nsid w:val="16173516"/>
     <w:multiLevelType w:val="hybridMultilevel"/>
     <w:tmpl w:val="95E6023C"/>
@@ -16968,7 +17891,7 @@
       </w:pPr>
     </w:lvl>
   </w:abstractNum>
-  <w:abstractNum w:abstractNumId="7" w15:restartNumberingAfterBreak="0">
+  <w:abstractNum w:abstractNumId="8" w15:restartNumberingAfterBreak="0">
     <w:nsid w:val="177064D3"/>
     <w:multiLevelType w:val="hybridMultilevel"/>
     <w:tmpl w:val="6E22B194"/>
@@ -17081,7 +18004,7 @@
       </w:rPr>
     </w:lvl>
   </w:abstractNum>
-  <w:abstractNum w:abstractNumId="8" w15:restartNumberingAfterBreak="0">
+  <w:abstractNum w:abstractNumId="9" w15:restartNumberingAfterBreak="0">
     <w:nsid w:val="17BE06FA"/>
     <w:multiLevelType w:val="multilevel"/>
     <w:tmpl w:val="A0EE43C2"/>
@@ -17230,7 +18153,120 @@
       </w:rPr>
     </w:lvl>
   </w:abstractNum>
-  <w:abstractNum w:abstractNumId="9" w15:restartNumberingAfterBreak="0">
+  <w:abstractNum w:abstractNumId="10" w15:restartNumberingAfterBreak="0">
+    <w:nsid w:val="1AE571FC"/>
+    <w:multiLevelType w:val="hybridMultilevel"/>
+    <w:tmpl w:val="6DA0F9A2"/>
+    <w:lvl w:ilvl="0" w:tplc="08100001">
+      <w:start w:val="1"/>
+      <w:numFmt w:val="bullet"/>
+      <w:lvlText w:val=""/>
+      <w:lvlJc w:val="left"/>
+      <w:pPr>
+        <w:ind w:left="720" w:hanging="360"/>
+      </w:pPr>
+      <w:rPr>
+        <w:rFonts w:ascii="Symbol" w:hAnsi="Symbol" w:hint="default"/>
+      </w:rPr>
+    </w:lvl>
+    <w:lvl w:ilvl="1" w:tplc="08100003" w:tentative="1">
+      <w:start w:val="1"/>
+      <w:numFmt w:val="bullet"/>
+      <w:lvlText w:val="o"/>
+      <w:lvlJc w:val="left"/>
+      <w:pPr>
+        <w:ind w:left="1440" w:hanging="360"/>
+      </w:pPr>
+      <w:rPr>
+        <w:rFonts w:ascii="Courier New" w:hAnsi="Courier New" w:cs="Courier New" w:hint="default"/>
+      </w:rPr>
+    </w:lvl>
+    <w:lvl w:ilvl="2" w:tplc="08100005" w:tentative="1">
+      <w:start w:val="1"/>
+      <w:numFmt w:val="bullet"/>
+      <w:lvlText w:val=""/>
+      <w:lvlJc w:val="left"/>
+      <w:pPr>
+        <w:ind w:left="2160" w:hanging="360"/>
+      </w:pPr>
+      <w:rPr>
+        <w:rFonts w:ascii="Wingdings" w:hAnsi="Wingdings" w:hint="default"/>
+      </w:rPr>
+    </w:lvl>
+    <w:lvl w:ilvl="3" w:tplc="08100001" w:tentative="1">
+      <w:start w:val="1"/>
+      <w:numFmt w:val="bullet"/>
+      <w:lvlText w:val=""/>
+      <w:lvlJc w:val="left"/>
+      <w:pPr>
+        <w:ind w:left="2880" w:hanging="360"/>
+      </w:pPr>
+      <w:rPr>
+        <w:rFonts w:ascii="Symbol" w:hAnsi="Symbol" w:hint="default"/>
+      </w:rPr>
+    </w:lvl>
+    <w:lvl w:ilvl="4" w:tplc="08100003" w:tentative="1">
+      <w:start w:val="1"/>
+      <w:numFmt w:val="bullet"/>
+      <w:lvlText w:val="o"/>
+      <w:lvlJc w:val="left"/>
+      <w:pPr>
+        <w:ind w:left="3600" w:hanging="360"/>
+      </w:pPr>
+      <w:rPr>
+        <w:rFonts w:ascii="Courier New" w:hAnsi="Courier New" w:cs="Courier New" w:hint="default"/>
+      </w:rPr>
+    </w:lvl>
+    <w:lvl w:ilvl="5" w:tplc="08100005" w:tentative="1">
+      <w:start w:val="1"/>
+      <w:numFmt w:val="bullet"/>
+      <w:lvlText w:val=""/>
+      <w:lvlJc w:val="left"/>
+      <w:pPr>
+        <w:ind w:left="4320" w:hanging="360"/>
+      </w:pPr>
+      <w:rPr>
+        <w:rFonts w:ascii="Wingdings" w:hAnsi="Wingdings" w:hint="default"/>
+      </w:rPr>
+    </w:lvl>
+    <w:lvl w:ilvl="6" w:tplc="08100001" w:tentative="1">
+      <w:start w:val="1"/>
+      <w:numFmt w:val="bullet"/>
+      <w:lvlText w:val=""/>
+      <w:lvlJc w:val="left"/>
+      <w:pPr>
+        <w:ind w:left="5040" w:hanging="360"/>
+      </w:pPr>
+      <w:rPr>
+        <w:rFonts w:ascii="Symbol" w:hAnsi="Symbol" w:hint="default"/>
+      </w:rPr>
+    </w:lvl>
+    <w:lvl w:ilvl="7" w:tplc="08100003" w:tentative="1">
+      <w:start w:val="1"/>
+      <w:numFmt w:val="bullet"/>
+      <w:lvlText w:val="o"/>
+      <w:lvlJc w:val="left"/>
+      <w:pPr>
+        <w:ind w:left="5760" w:hanging="360"/>
+      </w:pPr>
+      <w:rPr>
+        <w:rFonts w:ascii="Courier New" w:hAnsi="Courier New" w:cs="Courier New" w:hint="default"/>
+      </w:rPr>
+    </w:lvl>
+    <w:lvl w:ilvl="8" w:tplc="08100005" w:tentative="1">
+      <w:start w:val="1"/>
+      <w:numFmt w:val="bullet"/>
+      <w:lvlText w:val=""/>
+      <w:lvlJc w:val="left"/>
+      <w:pPr>
+        <w:ind w:left="6480" w:hanging="360"/>
+      </w:pPr>
+      <w:rPr>
+        <w:rFonts w:ascii="Wingdings" w:hAnsi="Wingdings" w:hint="default"/>
+      </w:rPr>
+    </w:lvl>
+  </w:abstractNum>
+  <w:abstractNum w:abstractNumId="11" w15:restartNumberingAfterBreak="0">
     <w:nsid w:val="22DC02CA"/>
     <w:multiLevelType w:val="hybridMultilevel"/>
     <w:tmpl w:val="3E6C221C"/>
@@ -17370,7 +18406,7 @@
       </w:rPr>
     </w:lvl>
   </w:abstractNum>
-  <w:abstractNum w:abstractNumId="10" w15:restartNumberingAfterBreak="0">
+  <w:abstractNum w:abstractNumId="12" w15:restartNumberingAfterBreak="0">
     <w:nsid w:val="24A46D31"/>
     <w:multiLevelType w:val="hybridMultilevel"/>
     <w:tmpl w:val="A56221F0"/>
@@ -17483,7 +18519,7 @@
       </w:pPr>
     </w:lvl>
   </w:abstractNum>
-  <w:abstractNum w:abstractNumId="11" w15:restartNumberingAfterBreak="0">
+  <w:abstractNum w:abstractNumId="13" w15:restartNumberingAfterBreak="0">
     <w:nsid w:val="28307643"/>
     <w:multiLevelType w:val="hybridMultilevel"/>
     <w:tmpl w:val="582E6EF6"/>
@@ -17596,7 +18632,7 @@
       </w:rPr>
     </w:lvl>
   </w:abstractNum>
-  <w:abstractNum w:abstractNumId="12" w15:restartNumberingAfterBreak="0">
+  <w:abstractNum w:abstractNumId="14" w15:restartNumberingAfterBreak="0">
     <w:nsid w:val="2A3C7E68"/>
     <w:multiLevelType w:val="multilevel"/>
     <w:tmpl w:val="5FD282AA"/>
@@ -17709,7 +18745,7 @@
       </w:rPr>
     </w:lvl>
   </w:abstractNum>
-  <w:abstractNum w:abstractNumId="13" w15:restartNumberingAfterBreak="0">
+  <w:abstractNum w:abstractNumId="15" w15:restartNumberingAfterBreak="0">
     <w:nsid w:val="329F3EE5"/>
     <w:multiLevelType w:val="hybridMultilevel"/>
     <w:tmpl w:val="3DA89F94"/>
@@ -17822,7 +18858,7 @@
       </w:rPr>
     </w:lvl>
   </w:abstractNum>
-  <w:abstractNum w:abstractNumId="14" w15:restartNumberingAfterBreak="0">
+  <w:abstractNum w:abstractNumId="16" w15:restartNumberingAfterBreak="0">
     <w:nsid w:val="3495663A"/>
     <w:multiLevelType w:val="multilevel"/>
     <w:tmpl w:val="345655CE"/>
@@ -17935,7 +18971,120 @@
       </w:rPr>
     </w:lvl>
   </w:abstractNum>
-  <w:abstractNum w:abstractNumId="15" w15:restartNumberingAfterBreak="0">
+  <w:abstractNum w:abstractNumId="17" w15:restartNumberingAfterBreak="0">
+    <w:nsid w:val="381D7164"/>
+    <w:multiLevelType w:val="hybridMultilevel"/>
+    <w:tmpl w:val="8CE0DEC2"/>
+    <w:lvl w:ilvl="0" w:tplc="08100001">
+      <w:start w:val="1"/>
+      <w:numFmt w:val="bullet"/>
+      <w:lvlText w:val=""/>
+      <w:lvlJc w:val="left"/>
+      <w:pPr>
+        <w:ind w:left="1440" w:hanging="360"/>
+      </w:pPr>
+      <w:rPr>
+        <w:rFonts w:ascii="Symbol" w:hAnsi="Symbol" w:hint="default"/>
+      </w:rPr>
+    </w:lvl>
+    <w:lvl w:ilvl="1" w:tplc="08100003" w:tentative="1">
+      <w:start w:val="1"/>
+      <w:numFmt w:val="bullet"/>
+      <w:lvlText w:val="o"/>
+      <w:lvlJc w:val="left"/>
+      <w:pPr>
+        <w:ind w:left="2160" w:hanging="360"/>
+      </w:pPr>
+      <w:rPr>
+        <w:rFonts w:ascii="Courier New" w:hAnsi="Courier New" w:cs="Courier New" w:hint="default"/>
+      </w:rPr>
+    </w:lvl>
+    <w:lvl w:ilvl="2" w:tplc="08100005" w:tentative="1">
+      <w:start w:val="1"/>
+      <w:numFmt w:val="bullet"/>
+      <w:lvlText w:val=""/>
+      <w:lvlJc w:val="left"/>
+      <w:pPr>
+        <w:ind w:left="2880" w:hanging="360"/>
+      </w:pPr>
+      <w:rPr>
+        <w:rFonts w:ascii="Wingdings" w:hAnsi="Wingdings" w:hint="default"/>
+      </w:rPr>
+    </w:lvl>
+    <w:lvl w:ilvl="3" w:tplc="08100001" w:tentative="1">
+      <w:start w:val="1"/>
+      <w:numFmt w:val="bullet"/>
+      <w:lvlText w:val=""/>
+      <w:lvlJc w:val="left"/>
+      <w:pPr>
+        <w:ind w:left="3600" w:hanging="360"/>
+      </w:pPr>
+      <w:rPr>
+        <w:rFonts w:ascii="Symbol" w:hAnsi="Symbol" w:hint="default"/>
+      </w:rPr>
+    </w:lvl>
+    <w:lvl w:ilvl="4" w:tplc="08100003" w:tentative="1">
+      <w:start w:val="1"/>
+      <w:numFmt w:val="bullet"/>
+      <w:lvlText w:val="o"/>
+      <w:lvlJc w:val="left"/>
+      <w:pPr>
+        <w:ind w:left="4320" w:hanging="360"/>
+      </w:pPr>
+      <w:rPr>
+        <w:rFonts w:ascii="Courier New" w:hAnsi="Courier New" w:cs="Courier New" w:hint="default"/>
+      </w:rPr>
+    </w:lvl>
+    <w:lvl w:ilvl="5" w:tplc="08100005" w:tentative="1">
+      <w:start w:val="1"/>
+      <w:numFmt w:val="bullet"/>
+      <w:lvlText w:val=""/>
+      <w:lvlJc w:val="left"/>
+      <w:pPr>
+        <w:ind w:left="5040" w:hanging="360"/>
+      </w:pPr>
+      <w:rPr>
+        <w:rFonts w:ascii="Wingdings" w:hAnsi="Wingdings" w:hint="default"/>
+      </w:rPr>
+    </w:lvl>
+    <w:lvl w:ilvl="6" w:tplc="08100001" w:tentative="1">
+      <w:start w:val="1"/>
+      <w:numFmt w:val="bullet"/>
+      <w:lvlText w:val=""/>
+      <w:lvlJc w:val="left"/>
+      <w:pPr>
+        <w:ind w:left="5760" w:hanging="360"/>
+      </w:pPr>
+      <w:rPr>
+        <w:rFonts w:ascii="Symbol" w:hAnsi="Symbol" w:hint="default"/>
+      </w:rPr>
+    </w:lvl>
+    <w:lvl w:ilvl="7" w:tplc="08100003" w:tentative="1">
+      <w:start w:val="1"/>
+      <w:numFmt w:val="bullet"/>
+      <w:lvlText w:val="o"/>
+      <w:lvlJc w:val="left"/>
+      <w:pPr>
+        <w:ind w:left="6480" w:hanging="360"/>
+      </w:pPr>
+      <w:rPr>
+        <w:rFonts w:ascii="Courier New" w:hAnsi="Courier New" w:cs="Courier New" w:hint="default"/>
+      </w:rPr>
+    </w:lvl>
+    <w:lvl w:ilvl="8" w:tplc="08100005" w:tentative="1">
+      <w:start w:val="1"/>
+      <w:numFmt w:val="bullet"/>
+      <w:lvlText w:val=""/>
+      <w:lvlJc w:val="left"/>
+      <w:pPr>
+        <w:ind w:left="7200" w:hanging="360"/>
+      </w:pPr>
+      <w:rPr>
+        <w:rFonts w:ascii="Wingdings" w:hAnsi="Wingdings" w:hint="default"/>
+      </w:rPr>
+    </w:lvl>
+  </w:abstractNum>
+  <w:abstractNum w:abstractNumId="18" w15:restartNumberingAfterBreak="0">
     <w:nsid w:val="39C27C0B"/>
     <w:multiLevelType w:val="multilevel"/>
     <w:tmpl w:val="013EE49A"/>
@@ -18084,7 +19233,7 @@
       </w:rPr>
     </w:lvl>
   </w:abstractNum>
-  <w:abstractNum w:abstractNumId="16" w15:restartNumberingAfterBreak="0">
+  <w:abstractNum w:abstractNumId="19" w15:restartNumberingAfterBreak="0">
     <w:nsid w:val="4C504BEF"/>
     <w:multiLevelType w:val="multilevel"/>
     <w:tmpl w:val="BB10D4E2"/>
@@ -18233,7 +19382,7 @@
       </w:rPr>
     </w:lvl>
   </w:abstractNum>
-  <w:abstractNum w:abstractNumId="17" w15:restartNumberingAfterBreak="0">
+  <w:abstractNum w:abstractNumId="20" w15:restartNumberingAfterBreak="0">
     <w:nsid w:val="4DAA458B"/>
     <w:multiLevelType w:val="multilevel"/>
     <w:tmpl w:val="645EE3A2"/>
@@ -18346,7 +19495,305 @@
       </w:rPr>
     </w:lvl>
   </w:abstractNum>
-  <w:abstractNum w:abstractNumId="18" w15:restartNumberingAfterBreak="0">
+  <w:abstractNum w:abstractNumId="21" w15:restartNumberingAfterBreak="0">
+    <w:nsid w:val="4EF544AA"/>
+    <w:multiLevelType w:val="multilevel"/>
+    <w:tmpl w:val="F4F2B2BC"/>
+    <w:lvl w:ilvl="0">
+      <w:start w:val="1"/>
+      <w:numFmt w:val="bullet"/>
+      <w:lvlText w:val=""/>
+      <w:lvlJc w:val="left"/>
+      <w:pPr>
+        <w:tabs>
+          <w:tab w:val="num" w:pos="720"/>
+        </w:tabs>
+        <w:ind w:left="720" w:hanging="360"/>
+      </w:pPr>
+      <w:rPr>
+        <w:rFonts w:ascii="Symbol" w:hAnsi="Symbol" w:hint="default"/>
+        <w:sz w:val="20"/>
+      </w:rPr>
+    </w:lvl>
+    <w:lvl w:ilvl="1" w:tentative="1">
+      <w:start w:val="1"/>
+      <w:numFmt w:val="bullet"/>
+      <w:lvlText w:val="o"/>
+      <w:lvlJc w:val="left"/>
+      <w:pPr>
+        <w:tabs>
+          <w:tab w:val="num" w:pos="1440"/>
+        </w:tabs>
+        <w:ind w:left="1440" w:hanging="360"/>
+      </w:pPr>
+      <w:rPr>
+        <w:rFonts w:ascii="Courier New" w:hAnsi="Courier New" w:hint="default"/>
+        <w:sz w:val="20"/>
+      </w:rPr>
+    </w:lvl>
+    <w:lvl w:ilvl="2" w:tentative="1">
+      <w:start w:val="1"/>
+      <w:numFmt w:val="bullet"/>
+      <w:lvlText w:val=""/>
+      <w:lvlJc w:val="left"/>
+      <w:pPr>
+        <w:tabs>
+          <w:tab w:val="num" w:pos="2160"/>
+        </w:tabs>
+        <w:ind w:left="2160" w:hanging="360"/>
+      </w:pPr>
+      <w:rPr>
+        <w:rFonts w:ascii="Wingdings" w:hAnsi="Wingdings" w:hint="default"/>
+        <w:sz w:val="20"/>
+      </w:rPr>
+    </w:lvl>
+    <w:lvl w:ilvl="3" w:tentative="1">
+      <w:start w:val="1"/>
+      <w:numFmt w:val="bullet"/>
+      <w:lvlText w:val=""/>
+      <w:lvlJc w:val="left"/>
+      <w:pPr>
+        <w:tabs>
+          <w:tab w:val="num" w:pos="2880"/>
+        </w:tabs>
+        <w:ind w:left="2880" w:hanging="360"/>
+      </w:pPr>
+      <w:rPr>
+        <w:rFonts w:ascii="Wingdings" w:hAnsi="Wingdings" w:hint="default"/>
+        <w:sz w:val="20"/>
+      </w:rPr>
+    </w:lvl>
+    <w:lvl w:ilvl="4" w:tentative="1">
+      <w:start w:val="1"/>
+      <w:numFmt w:val="bullet"/>
+      <w:lvlText w:val=""/>
+      <w:lvlJc w:val="left"/>
+      <w:pPr>
+        <w:tabs>
+          <w:tab w:val="num" w:pos="3600"/>
+        </w:tabs>
+        <w:ind w:left="3600" w:hanging="360"/>
+      </w:pPr>
+      <w:rPr>
+        <w:rFonts w:ascii="Wingdings" w:hAnsi="Wingdings" w:hint="default"/>
+        <w:sz w:val="20"/>
+      </w:rPr>
+    </w:lvl>
+    <w:lvl w:ilvl="5" w:tentative="1">
+      <w:start w:val="1"/>
+      <w:numFmt w:val="bullet"/>
+      <w:lvlText w:val=""/>
+      <w:lvlJc w:val="left"/>
+      <w:pPr>
+        <w:tabs>
+          <w:tab w:val="num" w:pos="4320"/>
+        </w:tabs>
+        <w:ind w:left="4320" w:hanging="360"/>
+      </w:pPr>
+      <w:rPr>
+        <w:rFonts w:ascii="Wingdings" w:hAnsi="Wingdings" w:hint="default"/>
+        <w:sz w:val="20"/>
+      </w:rPr>
+    </w:lvl>
+    <w:lvl w:ilvl="6" w:tentative="1">
+      <w:start w:val="1"/>
+      <w:numFmt w:val="bullet"/>
+      <w:lvlText w:val=""/>
+      <w:lvlJc w:val="left"/>
+      <w:pPr>
+        <w:tabs>
+          <w:tab w:val="num" w:pos="5040"/>
+        </w:tabs>
+        <w:ind w:left="5040" w:hanging="360"/>
+      </w:pPr>
+      <w:rPr>
+        <w:rFonts w:ascii="Wingdings" w:hAnsi="Wingdings" w:hint="default"/>
+        <w:sz w:val="20"/>
+      </w:rPr>
+    </w:lvl>
+    <w:lvl w:ilvl="7" w:tentative="1">
+      <w:start w:val="1"/>
+      <w:numFmt w:val="bullet"/>
+      <w:lvlText w:val=""/>
+      <w:lvlJc w:val="left"/>
+      <w:pPr>
+        <w:tabs>
+          <w:tab w:val="num" w:pos="5760"/>
+        </w:tabs>
+        <w:ind w:left="5760" w:hanging="360"/>
+      </w:pPr>
+      <w:rPr>
+        <w:rFonts w:ascii="Wingdings" w:hAnsi="Wingdings" w:hint="default"/>
+        <w:sz w:val="20"/>
+      </w:rPr>
+    </w:lvl>
+    <w:lvl w:ilvl="8" w:tentative="1">
+      <w:start w:val="1"/>
+      <w:numFmt w:val="bullet"/>
+      <w:lvlText w:val=""/>
+      <w:lvlJc w:val="left"/>
+      <w:pPr>
+        <w:tabs>
+          <w:tab w:val="num" w:pos="6480"/>
+        </w:tabs>
+        <w:ind w:left="6480" w:hanging="360"/>
+      </w:pPr>
+      <w:rPr>
+        <w:rFonts w:ascii="Wingdings" w:hAnsi="Wingdings" w:hint="default"/>
+        <w:sz w:val="20"/>
+      </w:rPr>
+    </w:lvl>
+  </w:abstractNum>
+  <w:abstractNum w:abstractNumId="22" w15:restartNumberingAfterBreak="0">
+    <w:nsid w:val="50BA45DF"/>
+    <w:multiLevelType w:val="multilevel"/>
+    <w:tmpl w:val="739CC962"/>
+    <w:lvl w:ilvl="0">
+      <w:start w:val="1"/>
+      <w:numFmt w:val="bullet"/>
+      <w:lvlText w:val=""/>
+      <w:lvlJc w:val="left"/>
+      <w:pPr>
+        <w:tabs>
+          <w:tab w:val="num" w:pos="1068"/>
+        </w:tabs>
+        <w:ind w:left="1068" w:hanging="360"/>
+      </w:pPr>
+      <w:rPr>
+        <w:rFonts w:ascii="Symbol" w:hAnsi="Symbol" w:hint="default"/>
+        <w:sz w:val="20"/>
+      </w:rPr>
+    </w:lvl>
+    <w:lvl w:ilvl="1" w:tentative="1">
+      <w:start w:val="1"/>
+      <w:numFmt w:val="bullet"/>
+      <w:lvlText w:val="o"/>
+      <w:lvlJc w:val="left"/>
+      <w:pPr>
+        <w:tabs>
+          <w:tab w:val="num" w:pos="1788"/>
+        </w:tabs>
+        <w:ind w:left="1788" w:hanging="360"/>
+      </w:pPr>
+      <w:rPr>
+        <w:rFonts w:ascii="Courier New" w:hAnsi="Courier New" w:hint="default"/>
+        <w:sz w:val="20"/>
+      </w:rPr>
+    </w:lvl>
+    <w:lvl w:ilvl="2" w:tentative="1">
+      <w:start w:val="1"/>
+      <w:numFmt w:val="bullet"/>
+      <w:lvlText w:val=""/>
+      <w:lvlJc w:val="left"/>
+      <w:pPr>
+        <w:tabs>
+          <w:tab w:val="num" w:pos="2508"/>
+        </w:tabs>
+        <w:ind w:left="2508" w:hanging="360"/>
+      </w:pPr>
+      <w:rPr>
+        <w:rFonts w:ascii="Wingdings" w:hAnsi="Wingdings" w:hint="default"/>
+        <w:sz w:val="20"/>
+      </w:rPr>
+    </w:lvl>
+    <w:lvl w:ilvl="3" w:tentative="1">
+      <w:start w:val="1"/>
+      <w:numFmt w:val="bullet"/>
+      <w:lvlText w:val=""/>
+      <w:lvlJc w:val="left"/>
+      <w:pPr>
+        <w:tabs>
+          <w:tab w:val="num" w:pos="3228"/>
+        </w:tabs>
+        <w:ind w:left="3228" w:hanging="360"/>
+      </w:pPr>
+      <w:rPr>
+        <w:rFonts w:ascii="Wingdings" w:hAnsi="Wingdings" w:hint="default"/>
+        <w:sz w:val="20"/>
+      </w:rPr>
+    </w:lvl>
+    <w:lvl w:ilvl="4" w:tentative="1">
+      <w:start w:val="1"/>
+      <w:numFmt w:val="bullet"/>
+      <w:lvlText w:val=""/>
+      <w:lvlJc w:val="left"/>
+      <w:pPr>
+        <w:tabs>
+          <w:tab w:val="num" w:pos="3948"/>
+        </w:tabs>
+        <w:ind w:left="3948" w:hanging="360"/>
+      </w:pPr>
+      <w:rPr>
+        <w:rFonts w:ascii="Wingdings" w:hAnsi="Wingdings" w:hint="default"/>
+        <w:sz w:val="20"/>
+      </w:rPr>
+    </w:lvl>
+    <w:lvl w:ilvl="5" w:tentative="1">
+      <w:start w:val="1"/>
+      <w:numFmt w:val="bullet"/>
+      <w:lvlText w:val=""/>
+      <w:lvlJc w:val="left"/>
+      <w:pPr>
+        <w:tabs>
+          <w:tab w:val="num" w:pos="4668"/>
+        </w:tabs>
+        <w:ind w:left="4668" w:hanging="360"/>
+      </w:pPr>
+      <w:rPr>
+        <w:rFonts w:ascii="Wingdings" w:hAnsi="Wingdings" w:hint="default"/>
+        <w:sz w:val="20"/>
+      </w:rPr>
+    </w:lvl>
+    <w:lvl w:ilvl="6" w:tentative="1">
+      <w:start w:val="1"/>
+      <w:numFmt w:val="bullet"/>
+      <w:lvlText w:val=""/>
+      <w:lvlJc w:val="left"/>
+      <w:pPr>
+        <w:tabs>
+          <w:tab w:val="num" w:pos="5388"/>
+        </w:tabs>
+        <w:ind w:left="5388" w:hanging="360"/>
+      </w:pPr>
+      <w:rPr>
+        <w:rFonts w:ascii="Wingdings" w:hAnsi="Wingdings" w:hint="default"/>
+        <w:sz w:val="20"/>
+      </w:rPr>
+    </w:lvl>
+    <w:lvl w:ilvl="7" w:tentative="1">
+      <w:start w:val="1"/>
+      <w:numFmt w:val="bullet"/>
+      <w:lvlText w:val=""/>
+      <w:lvlJc w:val="left"/>
+      <w:pPr>
+        <w:tabs>
+          <w:tab w:val="num" w:pos="6108"/>
+        </w:tabs>
+        <w:ind w:left="6108" w:hanging="360"/>
+      </w:pPr>
+      <w:rPr>
+        <w:rFonts w:ascii="Wingdings" w:hAnsi="Wingdings" w:hint="default"/>
+        <w:sz w:val="20"/>
+      </w:rPr>
+    </w:lvl>
+    <w:lvl w:ilvl="8" w:tentative="1">
+      <w:start w:val="1"/>
+      <w:numFmt w:val="bullet"/>
+      <w:lvlText w:val=""/>
+      <w:lvlJc w:val="left"/>
+      <w:pPr>
+        <w:tabs>
+          <w:tab w:val="num" w:pos="6828"/>
+        </w:tabs>
+        <w:ind w:left="6828" w:hanging="360"/>
+      </w:pPr>
+      <w:rPr>
+        <w:rFonts w:ascii="Wingdings" w:hAnsi="Wingdings" w:hint="default"/>
+        <w:sz w:val="20"/>
+      </w:rPr>
+    </w:lvl>
+  </w:abstractNum>
+  <w:abstractNum w:abstractNumId="23" w15:restartNumberingAfterBreak="0">
     <w:nsid w:val="57C86EE7"/>
     <w:multiLevelType w:val="multilevel"/>
     <w:tmpl w:val="07AE1822"/>
@@ -18495,7 +19942,7 @@
       </w:rPr>
     </w:lvl>
   </w:abstractNum>
-  <w:abstractNum w:abstractNumId="19" w15:restartNumberingAfterBreak="0">
+  <w:abstractNum w:abstractNumId="24" w15:restartNumberingAfterBreak="0">
     <w:nsid w:val="5C365668"/>
     <w:multiLevelType w:val="multilevel"/>
     <w:tmpl w:val="3362AC8E"/>
@@ -18608,7 +20055,7 @@
       </w:rPr>
     </w:lvl>
   </w:abstractNum>
-  <w:abstractNum w:abstractNumId="20" w15:restartNumberingAfterBreak="0">
+  <w:abstractNum w:abstractNumId="25" w15:restartNumberingAfterBreak="0">
     <w:nsid w:val="5F4A5F69"/>
     <w:multiLevelType w:val="multilevel"/>
     <w:tmpl w:val="3272BCCA"/>
@@ -18757,7 +20204,7 @@
       </w:rPr>
     </w:lvl>
   </w:abstractNum>
-  <w:abstractNum w:abstractNumId="21" w15:restartNumberingAfterBreak="0">
+  <w:abstractNum w:abstractNumId="26" w15:restartNumberingAfterBreak="0">
     <w:nsid w:val="652809B9"/>
     <w:multiLevelType w:val="hybridMultilevel"/>
     <w:tmpl w:val="C10EC632"/>
@@ -18870,7 +20317,7 @@
       </w:rPr>
     </w:lvl>
   </w:abstractNum>
-  <w:abstractNum w:abstractNumId="22" w15:restartNumberingAfterBreak="0">
+  <w:abstractNum w:abstractNumId="27" w15:restartNumberingAfterBreak="0">
     <w:nsid w:val="66867FD0"/>
     <w:multiLevelType w:val="multilevel"/>
     <w:tmpl w:val="AF70F744"/>
@@ -19010,7 +20457,7 @@
       </w:rPr>
     </w:lvl>
   </w:abstractNum>
-  <w:abstractNum w:abstractNumId="23" w15:restartNumberingAfterBreak="0">
+  <w:abstractNum w:abstractNumId="28" w15:restartNumberingAfterBreak="0">
     <w:nsid w:val="66871ECE"/>
     <w:multiLevelType w:val="hybridMultilevel"/>
     <w:tmpl w:val="7F74FC56"/>
@@ -19126,7 +20573,7 @@
       </w:pPr>
     </w:lvl>
   </w:abstractNum>
-  <w:abstractNum w:abstractNumId="24" w15:restartNumberingAfterBreak="0">
+  <w:abstractNum w:abstractNumId="29" w15:restartNumberingAfterBreak="0">
     <w:nsid w:val="6ABE5228"/>
     <w:multiLevelType w:val="hybridMultilevel"/>
     <w:tmpl w:val="089EE6D8"/>
@@ -19242,7 +20689,7 @@
       </w:pPr>
     </w:lvl>
   </w:abstractNum>
-  <w:abstractNum w:abstractNumId="25" w15:restartNumberingAfterBreak="0">
+  <w:abstractNum w:abstractNumId="30" w15:restartNumberingAfterBreak="0">
     <w:nsid w:val="6C1D7334"/>
     <w:multiLevelType w:val="hybridMultilevel"/>
     <w:tmpl w:val="7F20929C"/>
@@ -19358,7 +20805,7 @@
       </w:pPr>
     </w:lvl>
   </w:abstractNum>
-  <w:abstractNum w:abstractNumId="26" w15:restartNumberingAfterBreak="0">
+  <w:abstractNum w:abstractNumId="31" w15:restartNumberingAfterBreak="0">
     <w:nsid w:val="6CB351D4"/>
     <w:multiLevelType w:val="multilevel"/>
     <w:tmpl w:val="0D7A7DA4"/>
@@ -19471,7 +20918,7 @@
       </w:rPr>
     </w:lvl>
   </w:abstractNum>
-  <w:abstractNum w:abstractNumId="27" w15:restartNumberingAfterBreak="0">
+  <w:abstractNum w:abstractNumId="32" w15:restartNumberingAfterBreak="0">
     <w:nsid w:val="72904C79"/>
     <w:multiLevelType w:val="hybridMultilevel"/>
     <w:tmpl w:val="EB328896"/>
@@ -19611,7 +21058,7 @@
       </w:rPr>
     </w:lvl>
   </w:abstractNum>
-  <w:abstractNum w:abstractNumId="28" w15:restartNumberingAfterBreak="0">
+  <w:abstractNum w:abstractNumId="33" w15:restartNumberingAfterBreak="0">
     <w:nsid w:val="757601EE"/>
     <w:multiLevelType w:val="multilevel"/>
     <w:tmpl w:val="614ACFD4"/>
@@ -19760,7 +21207,7 @@
       </w:rPr>
     </w:lvl>
   </w:abstractNum>
-  <w:abstractNum w:abstractNumId="29" w15:restartNumberingAfterBreak="0">
+  <w:abstractNum w:abstractNumId="34" w15:restartNumberingAfterBreak="0">
     <w:nsid w:val="76F02295"/>
     <w:multiLevelType w:val="hybridMultilevel"/>
     <w:tmpl w:val="AB5A3EFA"/>
@@ -19846,7 +21293,7 @@
       </w:pPr>
     </w:lvl>
   </w:abstractNum>
-  <w:abstractNum w:abstractNumId="30" w15:restartNumberingAfterBreak="0">
+  <w:abstractNum w:abstractNumId="35" w15:restartNumberingAfterBreak="0">
     <w:nsid w:val="794050CD"/>
     <w:multiLevelType w:val="multilevel"/>
     <w:tmpl w:val="13FE5FDA"/>
@@ -19995,7 +21442,7 @@
       </w:rPr>
     </w:lvl>
   </w:abstractNum>
-  <w:abstractNum w:abstractNumId="31" w15:restartNumberingAfterBreak="0">
+  <w:abstractNum w:abstractNumId="36" w15:restartNumberingAfterBreak="0">
     <w:nsid w:val="799058E2"/>
     <w:multiLevelType w:val="multilevel"/>
     <w:tmpl w:val="2F5405E0"/>
@@ -20144,7 +21591,7 @@
       </w:rPr>
     </w:lvl>
   </w:abstractNum>
-  <w:abstractNum w:abstractNumId="32" w15:restartNumberingAfterBreak="0">
+  <w:abstractNum w:abstractNumId="37" w15:restartNumberingAfterBreak="0">
     <w:nsid w:val="7ACC392C"/>
     <w:multiLevelType w:val="hybridMultilevel"/>
     <w:tmpl w:val="F282F7F0"/>
@@ -20284,7 +21731,7 @@
       </w:rPr>
     </w:lvl>
   </w:abstractNum>
-  <w:abstractNum w:abstractNumId="33" w15:restartNumberingAfterBreak="0">
+  <w:abstractNum w:abstractNumId="38" w15:restartNumberingAfterBreak="0">
     <w:nsid w:val="7CD54937"/>
     <w:multiLevelType w:val="hybridMultilevel"/>
     <w:tmpl w:val="1AB0305A"/>
@@ -20425,130 +21872,145 @@
     </w:lvl>
   </w:abstractNum>
   <w:num w:numId="1" w16cid:durableId="16778104">
+    <w:abstractNumId w:val="23"/>
+  </w:num>
+  <w:num w:numId="2" w16cid:durableId="206921133">
+    <w:abstractNumId w:val="4"/>
+  </w:num>
+  <w:num w:numId="3" w16cid:durableId="1639801069">
+    <w:abstractNumId w:val="11"/>
+  </w:num>
+  <w:num w:numId="4" w16cid:durableId="1842503327">
+    <w:abstractNumId w:val="2"/>
+  </w:num>
+  <w:num w:numId="5" w16cid:durableId="1090007786">
+    <w:abstractNumId w:val="5"/>
+  </w:num>
+  <w:num w:numId="6" w16cid:durableId="1766030122">
+    <w:abstractNumId w:val="28"/>
+  </w:num>
+  <w:num w:numId="7" w16cid:durableId="744688335">
+    <w:abstractNumId w:val="12"/>
+  </w:num>
+  <w:num w:numId="8" w16cid:durableId="1654211890">
+    <w:abstractNumId w:val="29"/>
+  </w:num>
+  <w:num w:numId="9" w16cid:durableId="306396487">
+    <w:abstractNumId w:val="1"/>
+  </w:num>
+  <w:num w:numId="10" w16cid:durableId="1392844209">
+    <w:abstractNumId w:val="32"/>
+  </w:num>
+  <w:num w:numId="11" w16cid:durableId="1133519310">
+    <w:abstractNumId w:val="37"/>
+  </w:num>
+  <w:num w:numId="12" w16cid:durableId="1010252792">
+    <w:abstractNumId w:val="7"/>
+  </w:num>
+  <w:num w:numId="13" w16cid:durableId="345517439">
+    <w:abstractNumId w:val="3"/>
+  </w:num>
+  <w:num w:numId="14" w16cid:durableId="1925186491">
+    <w:abstractNumId w:val="38"/>
+  </w:num>
+  <w:num w:numId="15" w16cid:durableId="590503191">
+    <w:abstractNumId w:val="8"/>
+  </w:num>
+  <w:num w:numId="16" w16cid:durableId="567686737">
+    <w:abstractNumId w:val="23"/>
+  </w:num>
+  <w:num w:numId="17" w16cid:durableId="1236550754">
+    <w:abstractNumId w:val="30"/>
+  </w:num>
+  <w:num w:numId="18" w16cid:durableId="113791156">
+    <w:abstractNumId w:val="23"/>
+  </w:num>
+  <w:num w:numId="19" w16cid:durableId="211120316">
+    <w:abstractNumId w:val="23"/>
+  </w:num>
+  <w:num w:numId="20" w16cid:durableId="887882534">
+    <w:abstractNumId w:val="23"/>
+  </w:num>
+  <w:num w:numId="21" w16cid:durableId="1729645536">
+    <w:abstractNumId w:val="23"/>
+  </w:num>
+  <w:num w:numId="22" w16cid:durableId="89548686">
+    <w:abstractNumId w:val="23"/>
+  </w:num>
+  <w:num w:numId="23" w16cid:durableId="2088379685">
+    <w:abstractNumId w:val="26"/>
+  </w:num>
+  <w:num w:numId="24" w16cid:durableId="601763524">
+    <w:abstractNumId w:val="23"/>
+  </w:num>
+  <w:num w:numId="25" w16cid:durableId="1656182149">
+    <w:abstractNumId w:val="23"/>
+  </w:num>
+  <w:num w:numId="26" w16cid:durableId="1059596264">
+    <w:abstractNumId w:val="13"/>
+  </w:num>
+  <w:num w:numId="27" w16cid:durableId="1656373481">
+    <w:abstractNumId w:val="34"/>
+  </w:num>
+  <w:num w:numId="28" w16cid:durableId="1706562637">
+    <w:abstractNumId w:val="36"/>
+  </w:num>
+  <w:num w:numId="29" w16cid:durableId="1281692781">
+    <w:abstractNumId w:val="33"/>
+  </w:num>
+  <w:num w:numId="30" w16cid:durableId="1243366966">
+    <w:abstractNumId w:val="19"/>
+  </w:num>
+  <w:num w:numId="31" w16cid:durableId="1478374561">
+    <w:abstractNumId w:val="15"/>
+  </w:num>
+  <w:num w:numId="32" w16cid:durableId="1944455075">
+    <w:abstractNumId w:val="6"/>
+  </w:num>
+  <w:num w:numId="33" w16cid:durableId="1388064311">
     <w:abstractNumId w:val="18"/>
   </w:num>
-  <w:num w:numId="2" w16cid:durableId="206921133">
-    <w:abstractNumId w:val="3"/>
+  <w:num w:numId="34" w16cid:durableId="1098407802">
+    <w:abstractNumId w:val="35"/>
   </w:num>
-  <w:num w:numId="3" w16cid:durableId="1639801069">
+  <w:num w:numId="35" w16cid:durableId="1707411902">
     <w:abstractNumId w:val="9"/>
   </w:num>
-  <w:num w:numId="4" w16cid:durableId="1842503327">
-    <w:abstractNumId w:val="1"/>
+  <w:num w:numId="36" w16cid:durableId="56900152">
+    <w:abstractNumId w:val="25"/>
   </w:num>
-  <w:num w:numId="5" w16cid:durableId="1090007786">
-    <w:abstractNumId w:val="4"/>
+  <w:num w:numId="37" w16cid:durableId="777215320">
+    <w:abstractNumId w:val="27"/>
   </w:num>
-  <w:num w:numId="6" w16cid:durableId="1766030122">
-    <w:abstractNumId w:val="23"/>
+  <w:num w:numId="38" w16cid:durableId="403726164">
+    <w:abstractNumId w:val="14"/>
   </w:num>
-  <w:num w:numId="7" w16cid:durableId="744688335">
-    <w:abstractNumId w:val="10"/>
+  <w:num w:numId="39" w16cid:durableId="1028989542">
+    <w:abstractNumId w:val="31"/>
   </w:num>
-  <w:num w:numId="8" w16cid:durableId="1654211890">
+  <w:num w:numId="40" w16cid:durableId="863906994">
+    <w:abstractNumId w:val="20"/>
+  </w:num>
+  <w:num w:numId="41" w16cid:durableId="368385133">
+    <w:abstractNumId w:val="16"/>
+  </w:num>
+  <w:num w:numId="42" w16cid:durableId="626543020">
     <w:abstractNumId w:val="24"/>
   </w:num>
-  <w:num w:numId="9" w16cid:durableId="306396487">
+  <w:num w:numId="43" w16cid:durableId="964965647">
+    <w:abstractNumId w:val="21"/>
+  </w:num>
+  <w:num w:numId="44" w16cid:durableId="1290362631">
     <w:abstractNumId w:val="0"/>
   </w:num>
-  <w:num w:numId="10" w16cid:durableId="1392844209">
-    <w:abstractNumId w:val="27"/>
-  </w:num>
-  <w:num w:numId="11" w16cid:durableId="1133519310">
-    <w:abstractNumId w:val="32"/>
-  </w:num>
-  <w:num w:numId="12" w16cid:durableId="1010252792">
-    <w:abstractNumId w:val="6"/>
-  </w:num>
-  <w:num w:numId="13" w16cid:durableId="345517439">
-    <w:abstractNumId w:val="2"/>
-  </w:num>
-  <w:num w:numId="14" w16cid:durableId="1925186491">
-    <w:abstractNumId w:val="33"/>
-  </w:num>
-  <w:num w:numId="15" w16cid:durableId="590503191">
-    <w:abstractNumId w:val="7"/>
-  </w:num>
-  <w:num w:numId="16" w16cid:durableId="567686737">
-    <w:abstractNumId w:val="18"/>
-  </w:num>
-  <w:num w:numId="17" w16cid:durableId="1236550754">
-    <w:abstractNumId w:val="25"/>
-  </w:num>
-  <w:num w:numId="18" w16cid:durableId="113791156">
-    <w:abstractNumId w:val="18"/>
-  </w:num>
-  <w:num w:numId="19" w16cid:durableId="211120316">
-    <w:abstractNumId w:val="18"/>
-  </w:num>
-  <w:num w:numId="20" w16cid:durableId="887882534">
-    <w:abstractNumId w:val="18"/>
-  </w:num>
-  <w:num w:numId="21" w16cid:durableId="1729645536">
-    <w:abstractNumId w:val="18"/>
-  </w:num>
-  <w:num w:numId="22" w16cid:durableId="89548686">
-    <w:abstractNumId w:val="18"/>
-  </w:num>
-  <w:num w:numId="23" w16cid:durableId="2088379685">
-    <w:abstractNumId w:val="21"/>
-  </w:num>
-  <w:num w:numId="24" w16cid:durableId="601763524">
-    <w:abstractNumId w:val="18"/>
-  </w:num>
-  <w:num w:numId="25" w16cid:durableId="1656182149">
-    <w:abstractNumId w:val="18"/>
-  </w:num>
-  <w:num w:numId="26" w16cid:durableId="1059596264">
-    <w:abstractNumId w:val="11"/>
-  </w:num>
-  <w:num w:numId="27" w16cid:durableId="1656373481">
-    <w:abstractNumId w:val="29"/>
-  </w:num>
-  <w:num w:numId="28" w16cid:durableId="1706562637">
-    <w:abstractNumId w:val="31"/>
-  </w:num>
-  <w:num w:numId="29" w16cid:durableId="1281692781">
-    <w:abstractNumId w:val="28"/>
-  </w:num>
-  <w:num w:numId="30" w16cid:durableId="1243366966">
-    <w:abstractNumId w:val="16"/>
-  </w:num>
-  <w:num w:numId="31" w16cid:durableId="1478374561">
-    <w:abstractNumId w:val="13"/>
-  </w:num>
-  <w:num w:numId="32" w16cid:durableId="1944455075">
-    <w:abstractNumId w:val="5"/>
-  </w:num>
-  <w:num w:numId="33" w16cid:durableId="1388064311">
-    <w:abstractNumId w:val="15"/>
-  </w:num>
-  <w:num w:numId="34" w16cid:durableId="1098407802">
-    <w:abstractNumId w:val="30"/>
-  </w:num>
-  <w:num w:numId="35" w16cid:durableId="1707411902">
-    <w:abstractNumId w:val="8"/>
-  </w:num>
-  <w:num w:numId="36" w16cid:durableId="56900152">
-    <w:abstractNumId w:val="20"/>
-  </w:num>
-  <w:num w:numId="37" w16cid:durableId="777215320">
+  <w:num w:numId="45" w16cid:durableId="506559483">
     <w:abstractNumId w:val="22"/>
   </w:num>
-  <w:num w:numId="38" w16cid:durableId="403726164">
-    <w:abstractNumId w:val="12"/>
-  </w:num>
-  <w:num w:numId="39" w16cid:durableId="1028989542">
-    <w:abstractNumId w:val="26"/>
-  </w:num>
-  <w:num w:numId="40" w16cid:durableId="863906994">
+  <w:num w:numId="46" w16cid:durableId="1806315610">
     <w:abstractNumId w:val="17"/>
   </w:num>
-  <w:num w:numId="41" w16cid:durableId="368385133">
-    <w:abstractNumId w:val="14"/>
-  </w:num>
-  <w:num w:numId="42" w16cid:durableId="626543020">
-    <w:abstractNumId w:val="19"/>
+  <w:num w:numId="47" w16cid:durableId="947659007">
+    <w:abstractNumId w:val="10"/>
   </w:num>
   <w:numIdMacAtCleanup w:val="14"/>
 </w:numbering>
@@ -21147,7 +22609,6 @@
   <w:style w:type="character" w:default="1" w:styleId="Carpredefinitoparagrafo">
     <w:name w:val="Default Paragraph Font"/>
     <w:uiPriority w:val="1"/>
-    <w:semiHidden/>
     <w:unhideWhenUsed/>
   </w:style>
   <w:style w:type="table" w:default="1" w:styleId="Tabellanormale">
@@ -21496,7 +22957,6 @@
     <w:name w:val="Normal (Web)"/>
     <w:basedOn w:val="Normale"/>
     <w:uiPriority w:val="99"/>
-    <w:semiHidden/>
     <w:unhideWhenUsed/>
     <w:rsid w:val="00FD0EE2"/>
     <w:pPr>
@@ -21561,6 +23021,18 @@
     <w:rsid w:val="001279BC"/>
     <w:rPr>
       <w:vertAlign w:val="superscript"/>
+    </w:rPr>
+  </w:style>
+  <w:style w:type="character" w:styleId="Menzionenonrisolta">
+    <w:name w:val="Unresolved Mention"/>
+    <w:basedOn w:val="Carpredefinitoparagrafo"/>
+    <w:uiPriority w:val="99"/>
+    <w:semiHidden/>
+    <w:unhideWhenUsed/>
+    <w:rsid w:val="002F3597"/>
+    <w:rPr>
+      <w:color w:val="605E5C"/>
+      <w:shd w:val="clear" w:color="auto" w:fill="E1DFDD"/>
     </w:rPr>
   </w:style>
 </w:styles>

</xml_diff>